<commit_message>
docs: bo ma sinh vien trong ngoac o dong nhom sinh vien
Dong do dang la "Nguyen The Sang (N23DVCN050), ..." cho ca ba nguoi. Ma so
da co o bang ngay ben duoi va o trang bia, nhac lai lan thu ba trong ngoac chi
lam dong dai ra chu khong them thong tin.

Van giu du BA ten chu khong rut ve mot: dong ngay ben duoi ghi "Hinh thuc
thuc hien: Nhom 3 thanh vien", de mot ten thi hai dong canh nhau noi hai
chuyen khac nhau.

Co-Authored-By: Claude Opus 5 <noreply@anthropic.com>
</commit_message>
<xml_diff>
--- a/De_cuong_Nhom1_LearningPortal.docx
+++ b/De_cuong_Nhom1_LearningPortal.docx
@@ -1,6 +1,6 @@
 
 <file path=word/document.xml><?xml version="1.0" encoding="utf-8"?>
-<w:document xmlns:wpc="http://schemas.microsoft.com/office/word/2010/wordprocessingCanvas" xmlns:cx="http://schemas.microsoft.com/office/drawing/2014/chartex" xmlns:cx1="http://schemas.microsoft.com/office/drawing/2015/9/8/chartex" xmlns:cx2="http://schemas.microsoft.com/office/drawing/2015/10/21/chartex" xmlns:cx3="http://schemas.microsoft.com/office/drawing/2016/5/9/chartex" xmlns:cx4="http://schemas.microsoft.com/office/drawing/2016/5/10/chartex" xmlns:cx5="http://schemas.microsoft.com/office/drawing/2016/5/11/chartex" xmlns:cx6="http://schemas.microsoft.com/office/drawing/2016/5/12/chartex" xmlns:cx7="http://schemas.microsoft.com/office/drawing/2016/5/13/chartex" xmlns:cx8="http://schemas.microsoft.com/office/drawing/2016/5/14/chartex" xmlns:mc="http://schemas.openxmlformats.org/markup-compatibility/2006" xmlns:aink="http://schemas.microsoft.com/office/drawing/2016/ink" xmlns:am3d="http://schemas.microsoft.com/office/drawing/2017/model3d" xmlns:o="urn:schemas-microsoft-com:office:office" xmlns:oel="http://schemas.microsoft.com/office/2019/extlst" xmlns:r="http://schemas.openxmlformats.org/officeDocument/2006/relationships" xmlns:m="http://schemas.openxmlformats.org/officeDocument/2006/math" xmlns:v="urn:schemas-microsoft-com:vml" xmlns:wp14="http://schemas.microsoft.com/office/word/2010/wordprocessingDrawing" xmlns:wp="http://schemas.openxmlformats.org/drawingml/2006/wordprocessingDrawing" xmlns:w10="urn:schemas-microsoft-com:office:word" xmlns:w="http://schemas.openxmlformats.org/wordprocessingml/2006/main" xmlns:w14="http://schemas.microsoft.com/office/word/2010/wordml" xmlns:w15="http://schemas.microsoft.com/office/word/2012/wordml" xmlns:w16cex="http://schemas.microsoft.com/office/word/2018/wordml/cex" xmlns:w16cid="http://schemas.microsoft.com/office/word/2016/wordml/cid" xmlns:w16="http://schemas.microsoft.com/office/word/2018/wordml" xmlns:w16du="http://schemas.microsoft.com/office/word/2023/wordml/word16du" xmlns:w16sdtdh="http://schemas.microsoft.com/office/word/2020/wordml/sdtdatahash" xmlns:w16sdtfl="http://schemas.microsoft.com/office/word/2024/wordml/sdtformatlock" xmlns:w16se="http://schemas.microsoft.com/office/word/2015/wordml/symex" xmlns:wpg="http://schemas.microsoft.com/office/word/2010/wordprocessingGroup" xmlns:wpi="http://schemas.microsoft.com/office/word/2010/wordprocessingInk" xmlns:wne="http://schemas.microsoft.com/office/word/2006/wordml" xmlns:wps="http://schemas.microsoft.com/office/word/2010/wordprocessingShape" mc:Ignorable="w14 w15 w16se w16cid w16 w16cex w16sdtdh w16sdtfl w16du wp14">
+<w:document xmlns:a="http://schemas.openxmlformats.org/drawingml/2006/main" xmlns:a14="http://schemas.microsoft.com/office/drawing/2010/main" xmlns:mc="http://schemas.openxmlformats.org/markup-compatibility/2006" xmlns:pic="http://schemas.openxmlformats.org/drawingml/2006/picture" xmlns:r="http://schemas.openxmlformats.org/officeDocument/2006/relationships" xmlns:w="http://schemas.openxmlformats.org/wordprocessingml/2006/main" xmlns:w14="http://schemas.microsoft.com/office/word/2010/wordml" xmlns:wp="http://schemas.openxmlformats.org/drawingml/2006/wordprocessingDrawing" xmlns:wp14="http://schemas.microsoft.com/office/word/2010/wordprocessingDrawing" xmlns:wpc="http://schemas.microsoft.com/office/word/2010/wordprocessingCanvas" xmlns:cx="http://schemas.microsoft.com/office/drawing/2014/chartex" xmlns:cx1="http://schemas.microsoft.com/office/drawing/2015/9/8/chartex" xmlns:cx2="http://schemas.microsoft.com/office/drawing/2015/10/21/chartex" xmlns:cx3="http://schemas.microsoft.com/office/drawing/2016/5/9/chartex" xmlns:cx4="http://schemas.microsoft.com/office/drawing/2016/5/10/chartex" xmlns:cx5="http://schemas.microsoft.com/office/drawing/2016/5/11/chartex" xmlns:cx6="http://schemas.microsoft.com/office/drawing/2016/5/12/chartex" xmlns:cx7="http://schemas.microsoft.com/office/drawing/2016/5/13/chartex" xmlns:cx8="http://schemas.microsoft.com/office/drawing/2016/5/14/chartex" xmlns:aink="http://schemas.microsoft.com/office/drawing/2016/ink" xmlns:am3d="http://schemas.microsoft.com/office/drawing/2017/model3d" xmlns:o="urn:schemas-microsoft-com:office:office" xmlns:oel="http://schemas.microsoft.com/office/2019/extlst" xmlns:m="http://schemas.openxmlformats.org/officeDocument/2006/math" xmlns:v="urn:schemas-microsoft-com:vml" xmlns:w10="urn:schemas-microsoft-com:office:word" xmlns:w15="http://schemas.microsoft.com/office/word/2012/wordml" xmlns:w16cex="http://schemas.microsoft.com/office/word/2018/wordml/cex" xmlns:w16cid="http://schemas.microsoft.com/office/word/2016/wordml/cid" xmlns:w16="http://schemas.microsoft.com/office/word/2018/wordml" xmlns:w16du="http://schemas.microsoft.com/office/word/2023/wordml/word16du" xmlns:w16sdtdh="http://schemas.microsoft.com/office/word/2020/wordml/sdtdatahash" xmlns:w16sdtfl="http://schemas.microsoft.com/office/word/2024/wordml/sdtformatlock" xmlns:w16se="http://schemas.microsoft.com/office/word/2015/wordml/symex" xmlns:wpg="http://schemas.microsoft.com/office/word/2010/wordprocessingGroup" xmlns:wpi="http://schemas.microsoft.com/office/word/2010/wordprocessingInk" xmlns:wne="http://schemas.microsoft.com/office/word/2006/wordml" xmlns:wps="http://schemas.microsoft.com/office/word/2010/wordprocessingShape" mc:Ignorable="w14 w15 w16se w16cid w16 w16cex w16sdtdh w16sdtfl w16du wp14">
   <w:body>
     <w:p>
       <w:pPr>
@@ -67,21 +67,7 @@
         </w:rPr>
         <w:tab/>
         <w:t>HỌC VIỆN CÔNG NGHỆ BƯU CHÍNH VIỄN THÔNG</w:t>
-      </w:r>
-      <w:r>
-        <w:rPr>
-          <w:rFonts w:eastAsia="TimesNewRomanPSMT"/>
-          <w:b/>
-          <w:szCs w:val="27"/>
-        </w:rPr>
         <w:tab/>
-      </w:r>
-      <w:r>
-        <w:rPr>
-          <w:rFonts w:eastAsia="TimesNewRomanPSMT"/>
-          <w:b/>
-          <w:szCs w:val="27"/>
-        </w:rPr>
         <w:tab/>
       </w:r>
     </w:p>
@@ -160,11 +146,11 @@
             <wp:wrapTopAndBottom/>
             <wp:docPr id="941187610" name="Picture 941187610" descr="A picture containing text  Description automatically generated"/>
             <wp:cNvGraphicFramePr>
-              <a:graphicFrameLocks xmlns:a="http://schemas.openxmlformats.org/drawingml/2006/main" noChangeAspect="1"/>
+              <a:graphicFrameLocks noChangeAspect="1"/>
             </wp:cNvGraphicFramePr>
-            <a:graphic xmlns:a="http://schemas.openxmlformats.org/drawingml/2006/main">
+            <a:graphic>
               <a:graphicData uri="http://schemas.openxmlformats.org/drawingml/2006/picture">
-                <pic:pic xmlns:pic="http://schemas.openxmlformats.org/drawingml/2006/picture">
+                <pic:pic>
                   <pic:nvPicPr>
                     <pic:cNvPr id="2" name="Picture 2" descr="A picture containing text  Description automatically generated"/>
                     <pic:cNvPicPr/>
@@ -173,7 +159,7 @@
                     <a:blip r:embed="rId8">
                       <a:extLst>
                         <a:ext uri="{28A0092B-C50C-407E-A947-70E740481C1C}">
-                          <a14:useLocalDpi xmlns:a14="http://schemas.microsoft.com/office/drawing/2010/main" val="0"/>
+                          <a14:useLocalDpi val="0"/>
                         </a:ext>
                       </a:extLst>
                     </a:blip>
@@ -203,14 +189,8 @@
       </w:pPr>
       <w:r>
         <w:tab/>
-      </w:r>
-      <w:r>
         <w:tab/>
-      </w:r>
-      <w:r>
         <w:tab/>
-      </w:r>
-      <w:r>
         <w:tab/>
       </w:r>
     </w:p>
@@ -266,7 +246,7 @@
           <w:sz w:val="40"/>
           <w:szCs w:val="40"/>
         </w:rPr>
-        <w:t>Tên học phần: THỰC TẬP CƠ SỞ</w:t>
+        <w:t xml:space="preserve">Tên học phần: THỰC TẬP CƠ SỞ</w:t>
       </w:r>
     </w:p>
     <w:p>
@@ -346,7 +326,7 @@
           <w:sz w:val="30"/>
           <w:szCs w:val="30"/>
         </w:rPr>
-        <w:t>GVHD: Nguyễn Minh Tâm</w:t>
+        <w:t xml:space="preserve">GVHD: Nguyễn Minh Tâm</w:t>
       </w:r>
     </w:p>
     <w:p>
@@ -372,54 +352,19 @@
           <w:szCs w:val="31"/>
         </w:rPr>
         <w:tab/>
-      </w:r>
-      <w:r>
-        <w:rPr>
-          <w:bCs/>
-          <w:sz w:val="31"/>
-          <w:szCs w:val="31"/>
-        </w:rPr>
+        <w:tab/>
+        <w:tab/>
+        <w:tab/>
+        <w:tab/>
         <w:tab/>
       </w:r>
       <w:r>
         <w:rPr>
-          <w:bCs/>
-          <w:sz w:val="31"/>
-          <w:szCs w:val="31"/>
-        </w:rPr>
-        <w:tab/>
-      </w:r>
-      <w:r>
-        <w:rPr>
-          <w:bCs/>
-          <w:sz w:val="31"/>
-          <w:szCs w:val="31"/>
-        </w:rPr>
-        <w:tab/>
-      </w:r>
-      <w:r>
-        <w:rPr>
-          <w:bCs/>
-          <w:sz w:val="31"/>
-          <w:szCs w:val="31"/>
-        </w:rPr>
-        <w:tab/>
-      </w:r>
-      <w:r>
-        <w:rPr>
-          <w:bCs/>
-          <w:sz w:val="31"/>
-          <w:szCs w:val="31"/>
-        </w:rPr>
-        <w:tab/>
-      </w:r>
-      <w:r>
-        <w:rPr>
           <w:b/>
           <w:sz w:val="31"/>
           <w:szCs w:val="31"/>
         </w:rPr>
-        <w:t>Nhóm 1:</w:t>
+        <w:t xml:space="preserve">Nhóm 1:</w:t>
       </w:r>
     </w:p>
     <w:p>
@@ -457,19 +402,7 @@
           <w:szCs w:val="30"/>
         </w:rPr>
         <w:t>Nguyễn Thế Sang</w:t>
-      </w:r>
-      <w:r>
-        <w:rPr>
-          <w:sz w:val="30"/>
-          <w:szCs w:val="30"/>
-        </w:rPr>
         <w:tab/>
-      </w:r>
-      <w:r>
-        <w:rPr>
-          <w:sz w:val="30"/>
-          <w:szCs w:val="30"/>
-        </w:rPr>
         <w:tab/>
         <w:t xml:space="preserve">N23DVCN050  – </w:t>
       </w:r>
@@ -543,7 +476,7 @@
           <w:sz w:val="31"/>
           <w:szCs w:val="31"/>
         </w:rPr>
-        <w:t>Thái Thanh Vũ</w:t>
+        <w:t xml:space="preserve">Thái Thanh Vũ</w:t>
       </w:r>
       <w:r>
         <w:rPr>
@@ -551,12 +484,6 @@
           <w:szCs w:val="30"/>
         </w:rPr>
         <w:tab/>
-      </w:r>
-      <w:r>
-        <w:rPr>
-          <w:sz w:val="30"/>
-          <w:szCs w:val="30"/>
-        </w:rPr>
         <w:tab/>
       </w:r>
       <w:r>
@@ -681,7 +608,7 @@
           <w:sz w:val="28"/>
           <w:szCs w:val="28"/>
         </w:rPr>
-        <w:t>ngày 17 tháng 9 năm 2026</w:t>
+        <w:t xml:space="preserve">ngày 17 tháng 9 năm 2026</w:t>
       </w:r>
     </w:p>
     <w:p>
@@ -693,6 +620,7 @@
           <w:sz w:val="26"/>
           <w:szCs w:val="26"/>
         </w:rPr>
+        <w:outlineLvl w:val="9"/>
       </w:pPr>
       <w:r>
         <w:rPr>
@@ -702,66 +630,14 @@
         </w:rPr>
         <w:lastRenderedPageBreak/>
         <w:tab/>
-      </w:r>
-      <w:r>
-        <w:rPr>
-          <w:rFonts w:ascii="Times New Roman" w:hAnsi="Times New Roman" w:cs="Times New Roman"/>
-          <w:sz w:val="26"/>
-          <w:szCs w:val="26"/>
-        </w:rPr>
         <w:tab/>
-      </w:r>
-      <w:r>
-        <w:rPr>
-          <w:rFonts w:ascii="Times New Roman" w:hAnsi="Times New Roman" w:cs="Times New Roman"/>
-          <w:sz w:val="26"/>
-          <w:szCs w:val="26"/>
-        </w:rPr>
         <w:tab/>
-      </w:r>
-      <w:r>
-        <w:rPr>
-          <w:rFonts w:ascii="Times New Roman" w:hAnsi="Times New Roman" w:cs="Times New Roman"/>
-          <w:sz w:val="26"/>
-          <w:szCs w:val="26"/>
-        </w:rPr>
         <w:tab/>
-      </w:r>
-      <w:r>
-        <w:rPr>
-          <w:rFonts w:ascii="Times New Roman" w:hAnsi="Times New Roman" w:cs="Times New Roman"/>
-          <w:sz w:val="26"/>
-          <w:szCs w:val="26"/>
-        </w:rPr>
         <w:tab/>
-      </w:r>
-      <w:bookmarkStart w:id="0" w:name="_Toc240204940"/>
-      <w:r>
-        <w:rPr>
-          <w:rFonts w:ascii="Times New Roman" w:hAnsi="Times New Roman" w:cs="Times New Roman"/>
-          <w:sz w:val="26"/>
-          <w:szCs w:val="26"/>
-        </w:rPr>
         <w:t>Mục lục</w:t>
       </w:r>
-      <w:bookmarkEnd w:id="0"/>
     </w:p>
     <w:p>
-      <w:pPr>
-        <w:pStyle w:val="TOC1"/>
-        <w:tabs>
-          <w:tab w:val="right" w:leader="dot" w:pos="9232"/>
-        </w:tabs>
-        <w:rPr>
-          <w:rFonts w:asciiTheme="minorHAnsi" w:hAnsiTheme="minorHAnsi"/>
-          <w:noProof/>
-          <w:kern w:val="2"/>
-          <w:sz w:val="24"/>
-          <w:szCs w:val="24"/>
-          <w:lang w:val="vi-VN" w:eastAsia="vi-VN"/>
-          <w14:ligatures w14:val="standardContextual"/>
-        </w:rPr>
-      </w:pPr>
       <w:r>
         <w:fldChar w:fldCharType="begin"/>
       </w:r>
@@ -771,2166 +647,9 @@
       <w:r>
         <w:fldChar w:fldCharType="separate"/>
       </w:r>
-      <w:hyperlink w:anchor="_Toc240204940" w:history="1">
-        <w:r>
-          <w:rPr>
-            <w:rStyle w:val="Hyperlink"/>
-            <w:rFonts w:cs="Times New Roman"/>
-            <w:noProof/>
-          </w:rPr>
-          <w:t>Mục lục</w:t>
-        </w:r>
-        <w:r>
-          <w:rPr>
-            <w:noProof/>
-            <w:webHidden/>
-          </w:rPr>
-          <w:tab/>
-        </w:r>
-        <w:r>
-          <w:rPr>
-            <w:noProof/>
-            <w:webHidden/>
-          </w:rPr>
-          <w:fldChar w:fldCharType="begin"/>
-        </w:r>
-        <w:r>
-          <w:rPr>
-            <w:noProof/>
-            <w:webHidden/>
-          </w:rPr>
-          <w:instrText xml:space="preserve"> PAGEREF _Toc240204940 \h </w:instrText>
-        </w:r>
-        <w:r>
-          <w:rPr>
-            <w:noProof/>
-            <w:webHidden/>
-          </w:rPr>
-        </w:r>
-        <w:r>
-          <w:rPr>
-            <w:noProof/>
-            <w:webHidden/>
-          </w:rPr>
-          <w:fldChar w:fldCharType="separate"/>
-        </w:r>
-        <w:r>
-          <w:rPr>
-            <w:noProof/>
-            <w:webHidden/>
-          </w:rPr>
-          <w:t>2</w:t>
-        </w:r>
-        <w:r>
-          <w:rPr>
-            <w:noProof/>
-            <w:webHidden/>
-          </w:rPr>
-          <w:fldChar w:fldCharType="end"/>
-        </w:r>
-      </w:hyperlink>
-    </w:p>
-    <w:p>
-      <w:pPr>
-        <w:pStyle w:val="TOC1"/>
-        <w:tabs>
-          <w:tab w:val="right" w:leader="dot" w:pos="9232"/>
-        </w:tabs>
-        <w:rPr>
-          <w:rFonts w:asciiTheme="minorHAnsi" w:hAnsiTheme="minorHAnsi"/>
-          <w:noProof/>
-          <w:kern w:val="2"/>
-          <w:sz w:val="24"/>
-          <w:szCs w:val="24"/>
-          <w:lang w:val="vi-VN" w:eastAsia="vi-VN"/>
-          <w14:ligatures w14:val="standardContextual"/>
-        </w:rPr>
-      </w:pPr>
-      <w:hyperlink w:anchor="_Toc240204941" w:history="1">
-        <w:r>
-          <w:rPr>
-            <w:rStyle w:val="Hyperlink"/>
-            <w:rFonts w:cs="Times New Roman"/>
-            <w:noProof/>
-          </w:rPr>
-          <w:t>1 THÔNG TIN CHUNG</w:t>
-        </w:r>
-        <w:r>
-          <w:rPr>
-            <w:noProof/>
-            <w:webHidden/>
-          </w:rPr>
-          <w:tab/>
-        </w:r>
-        <w:r>
-          <w:rPr>
-            <w:noProof/>
-            <w:webHidden/>
-          </w:rPr>
-          <w:fldChar w:fldCharType="begin"/>
-        </w:r>
-        <w:r>
-          <w:rPr>
-            <w:noProof/>
-            <w:webHidden/>
-          </w:rPr>
-          <w:instrText xml:space="preserve"> PAGEREF _Toc240204941 \h </w:instrText>
-        </w:r>
-        <w:r>
-          <w:rPr>
-            <w:noProof/>
-            <w:webHidden/>
-          </w:rPr>
-        </w:r>
-        <w:r>
-          <w:rPr>
-            <w:noProof/>
-            <w:webHidden/>
-          </w:rPr>
-          <w:fldChar w:fldCharType="separate"/>
-        </w:r>
-        <w:r>
-          <w:rPr>
-            <w:noProof/>
-            <w:webHidden/>
-          </w:rPr>
-          <w:t>3</w:t>
-        </w:r>
-        <w:r>
-          <w:rPr>
-            <w:noProof/>
-            <w:webHidden/>
-          </w:rPr>
-          <w:fldChar w:fldCharType="end"/>
-        </w:r>
-      </w:hyperlink>
-    </w:p>
-    <w:p>
-      <w:pPr>
-        <w:pStyle w:val="TOC1"/>
-        <w:tabs>
-          <w:tab w:val="right" w:leader="dot" w:pos="9232"/>
-        </w:tabs>
-        <w:rPr>
-          <w:rFonts w:asciiTheme="minorHAnsi" w:hAnsiTheme="minorHAnsi"/>
-          <w:noProof/>
-          <w:kern w:val="2"/>
-          <w:sz w:val="24"/>
-          <w:szCs w:val="24"/>
-          <w:lang w:val="vi-VN" w:eastAsia="vi-VN"/>
-          <w14:ligatures w14:val="standardContextual"/>
-        </w:rPr>
-      </w:pPr>
-      <w:hyperlink w:anchor="_Toc240204942" w:history="1">
-        <w:r>
-          <w:rPr>
-            <w:rStyle w:val="Hyperlink"/>
-            <w:rFonts w:cs="Times New Roman"/>
-            <w:noProof/>
-          </w:rPr>
-          <w:t>2 LÝ DO CHỌN ĐỀ TÀI</w:t>
-        </w:r>
-        <w:r>
-          <w:rPr>
-            <w:noProof/>
-            <w:webHidden/>
-          </w:rPr>
-          <w:tab/>
-        </w:r>
-        <w:r>
-          <w:rPr>
-            <w:noProof/>
-            <w:webHidden/>
-          </w:rPr>
-          <w:fldChar w:fldCharType="begin"/>
-        </w:r>
-        <w:r>
-          <w:rPr>
-            <w:noProof/>
-            <w:webHidden/>
-          </w:rPr>
-          <w:instrText xml:space="preserve"> PAGEREF _Toc240204942 \h </w:instrText>
-        </w:r>
-        <w:r>
-          <w:rPr>
-            <w:noProof/>
-            <w:webHidden/>
-          </w:rPr>
-        </w:r>
-        <w:r>
-          <w:rPr>
-            <w:noProof/>
-            <w:webHidden/>
-          </w:rPr>
-          <w:fldChar w:fldCharType="separate"/>
-        </w:r>
-        <w:r>
-          <w:rPr>
-            <w:noProof/>
-            <w:webHidden/>
-          </w:rPr>
-          <w:t>4</w:t>
-        </w:r>
-        <w:r>
-          <w:rPr>
-            <w:noProof/>
-            <w:webHidden/>
-          </w:rPr>
-          <w:fldChar w:fldCharType="end"/>
-        </w:r>
-      </w:hyperlink>
-    </w:p>
-    <w:p>
-      <w:pPr>
-        <w:pStyle w:val="TOC1"/>
-        <w:tabs>
-          <w:tab w:val="right" w:leader="dot" w:pos="9232"/>
-        </w:tabs>
-        <w:rPr>
-          <w:rFonts w:asciiTheme="minorHAnsi" w:hAnsiTheme="minorHAnsi"/>
-          <w:noProof/>
-          <w:kern w:val="2"/>
-          <w:sz w:val="24"/>
-          <w:szCs w:val="24"/>
-          <w:lang w:val="vi-VN" w:eastAsia="vi-VN"/>
-          <w14:ligatures w14:val="standardContextual"/>
-        </w:rPr>
-      </w:pPr>
-      <w:hyperlink w:anchor="_Toc240204943" w:history="1">
-        <w:r>
-          <w:rPr>
-            <w:rStyle w:val="Hyperlink"/>
-            <w:rFonts w:cs="Times New Roman"/>
-            <w:noProof/>
-          </w:rPr>
-          <w:t>3 MỤC TIÊU CỦA ĐỀ TÀI</w:t>
-        </w:r>
-        <w:r>
-          <w:rPr>
-            <w:noProof/>
-            <w:webHidden/>
-          </w:rPr>
-          <w:tab/>
-        </w:r>
-        <w:r>
-          <w:rPr>
-            <w:noProof/>
-            <w:webHidden/>
-          </w:rPr>
-          <w:fldChar w:fldCharType="begin"/>
-        </w:r>
-        <w:r>
-          <w:rPr>
-            <w:noProof/>
-            <w:webHidden/>
-          </w:rPr>
-          <w:instrText xml:space="preserve"> PAGEREF _Toc240204943 \h </w:instrText>
-        </w:r>
-        <w:r>
-          <w:rPr>
-            <w:noProof/>
-            <w:webHidden/>
-          </w:rPr>
-        </w:r>
-        <w:r>
-          <w:rPr>
-            <w:noProof/>
-            <w:webHidden/>
-          </w:rPr>
-          <w:fldChar w:fldCharType="separate"/>
-        </w:r>
-        <w:r>
-          <w:rPr>
-            <w:noProof/>
-            <w:webHidden/>
-          </w:rPr>
-          <w:t>5</w:t>
-        </w:r>
-        <w:r>
-          <w:rPr>
-            <w:noProof/>
-            <w:webHidden/>
-          </w:rPr>
-          <w:fldChar w:fldCharType="end"/>
-        </w:r>
-      </w:hyperlink>
-    </w:p>
-    <w:p>
-      <w:pPr>
-        <w:pStyle w:val="TOC2"/>
-        <w:tabs>
-          <w:tab w:val="right" w:leader="dot" w:pos="9232"/>
-        </w:tabs>
-        <w:rPr>
-          <w:rFonts w:asciiTheme="minorHAnsi" w:hAnsiTheme="minorHAnsi"/>
-          <w:noProof/>
-          <w:kern w:val="2"/>
-          <w:sz w:val="24"/>
-          <w:szCs w:val="24"/>
-          <w:lang w:val="vi-VN" w:eastAsia="vi-VN"/>
-          <w14:ligatures w14:val="standardContextual"/>
-        </w:rPr>
-      </w:pPr>
-      <w:hyperlink w:anchor="_Toc240204944" w:history="1">
-        <w:r>
-          <w:rPr>
-            <w:rStyle w:val="Hyperlink"/>
-            <w:rFonts w:cs="Times New Roman"/>
-            <w:noProof/>
-          </w:rPr>
-          <w:t>3.1 Mục tiêu tổng quát</w:t>
-        </w:r>
-        <w:r>
-          <w:rPr>
-            <w:noProof/>
-            <w:webHidden/>
-          </w:rPr>
-          <w:tab/>
-        </w:r>
-        <w:r>
-          <w:rPr>
-            <w:noProof/>
-            <w:webHidden/>
-          </w:rPr>
-          <w:fldChar w:fldCharType="begin"/>
-        </w:r>
-        <w:r>
-          <w:rPr>
-            <w:noProof/>
-            <w:webHidden/>
-          </w:rPr>
-          <w:instrText xml:space="preserve"> PAGEREF _Toc240204944 \h </w:instrText>
-        </w:r>
-        <w:r>
-          <w:rPr>
-            <w:noProof/>
-            <w:webHidden/>
-          </w:rPr>
-        </w:r>
-        <w:r>
-          <w:rPr>
-            <w:noProof/>
-            <w:webHidden/>
-          </w:rPr>
-          <w:fldChar w:fldCharType="separate"/>
-        </w:r>
-        <w:r>
-          <w:rPr>
-            <w:noProof/>
-            <w:webHidden/>
-          </w:rPr>
-          <w:t>5</w:t>
-        </w:r>
-        <w:r>
-          <w:rPr>
-            <w:noProof/>
-            <w:webHidden/>
-          </w:rPr>
-          <w:fldChar w:fldCharType="end"/>
-        </w:r>
-      </w:hyperlink>
-    </w:p>
-    <w:p>
-      <w:pPr>
-        <w:pStyle w:val="TOC2"/>
-        <w:tabs>
-          <w:tab w:val="right" w:leader="dot" w:pos="9232"/>
-        </w:tabs>
-        <w:rPr>
-          <w:rFonts w:asciiTheme="minorHAnsi" w:hAnsiTheme="minorHAnsi"/>
-          <w:noProof/>
-          <w:kern w:val="2"/>
-          <w:sz w:val="24"/>
-          <w:szCs w:val="24"/>
-          <w:lang w:val="vi-VN" w:eastAsia="vi-VN"/>
-          <w14:ligatures w14:val="standardContextual"/>
-        </w:rPr>
-      </w:pPr>
-      <w:hyperlink w:anchor="_Toc240204945" w:history="1">
-        <w:r>
-          <w:rPr>
-            <w:rStyle w:val="Hyperlink"/>
-            <w:rFonts w:cs="Times New Roman"/>
-            <w:noProof/>
-          </w:rPr>
-          <w:t>3.2 Mục tiêu cụ thể</w:t>
-        </w:r>
-        <w:r>
-          <w:rPr>
-            <w:noProof/>
-            <w:webHidden/>
-          </w:rPr>
-          <w:tab/>
-        </w:r>
-        <w:r>
-          <w:rPr>
-            <w:noProof/>
-            <w:webHidden/>
-          </w:rPr>
-          <w:fldChar w:fldCharType="begin"/>
-        </w:r>
-        <w:r>
-          <w:rPr>
-            <w:noProof/>
-            <w:webHidden/>
-          </w:rPr>
-          <w:instrText xml:space="preserve"> PAGEREF _Toc240204945 \h </w:instrText>
-        </w:r>
-        <w:r>
-          <w:rPr>
-            <w:noProof/>
-            <w:webHidden/>
-          </w:rPr>
-        </w:r>
-        <w:r>
-          <w:rPr>
-            <w:noProof/>
-            <w:webHidden/>
-          </w:rPr>
-          <w:fldChar w:fldCharType="separate"/>
-        </w:r>
-        <w:r>
-          <w:rPr>
-            <w:noProof/>
-            <w:webHidden/>
-          </w:rPr>
-          <w:t>5</w:t>
-        </w:r>
-        <w:r>
-          <w:rPr>
-            <w:noProof/>
-            <w:webHidden/>
-          </w:rPr>
-          <w:fldChar w:fldCharType="end"/>
-        </w:r>
-      </w:hyperlink>
-    </w:p>
-    <w:p>
-      <w:pPr>
-        <w:pStyle w:val="TOC1"/>
-        <w:tabs>
-          <w:tab w:val="right" w:leader="dot" w:pos="9232"/>
-        </w:tabs>
-        <w:rPr>
-          <w:rFonts w:asciiTheme="minorHAnsi" w:hAnsiTheme="minorHAnsi"/>
-          <w:noProof/>
-          <w:kern w:val="2"/>
-          <w:sz w:val="24"/>
-          <w:szCs w:val="24"/>
-          <w:lang w:val="vi-VN" w:eastAsia="vi-VN"/>
-          <w14:ligatures w14:val="standardContextual"/>
-        </w:rPr>
-      </w:pPr>
-      <w:hyperlink w:anchor="_Toc240204946" w:history="1">
-        <w:r>
-          <w:rPr>
-            <w:rStyle w:val="Hyperlink"/>
-            <w:rFonts w:cs="Times New Roman"/>
-            <w:noProof/>
-          </w:rPr>
-          <w:t>4 ĐỐI TƯỢNG VÀ PHẠM VI THỰC HIỆN</w:t>
-        </w:r>
-        <w:r>
-          <w:rPr>
-            <w:noProof/>
-            <w:webHidden/>
-          </w:rPr>
-          <w:tab/>
-        </w:r>
-        <w:r>
-          <w:rPr>
-            <w:noProof/>
-            <w:webHidden/>
-          </w:rPr>
-          <w:fldChar w:fldCharType="begin"/>
-        </w:r>
-        <w:r>
-          <w:rPr>
-            <w:noProof/>
-            <w:webHidden/>
-          </w:rPr>
-          <w:instrText xml:space="preserve"> PAGEREF _Toc240204946 \h </w:instrText>
-        </w:r>
-        <w:r>
-          <w:rPr>
-            <w:noProof/>
-            <w:webHidden/>
-          </w:rPr>
-        </w:r>
-        <w:r>
-          <w:rPr>
-            <w:noProof/>
-            <w:webHidden/>
-          </w:rPr>
-          <w:fldChar w:fldCharType="separate"/>
-        </w:r>
-        <w:r>
-          <w:rPr>
-            <w:noProof/>
-            <w:webHidden/>
-          </w:rPr>
-          <w:t>6</w:t>
-        </w:r>
-        <w:r>
-          <w:rPr>
-            <w:noProof/>
-            <w:webHidden/>
-          </w:rPr>
-          <w:fldChar w:fldCharType="end"/>
-        </w:r>
-      </w:hyperlink>
-    </w:p>
-    <w:p>
-      <w:pPr>
-        <w:pStyle w:val="TOC2"/>
-        <w:tabs>
-          <w:tab w:val="right" w:leader="dot" w:pos="9232"/>
-        </w:tabs>
-        <w:rPr>
-          <w:rFonts w:asciiTheme="minorHAnsi" w:hAnsiTheme="minorHAnsi"/>
-          <w:noProof/>
-          <w:kern w:val="2"/>
-          <w:sz w:val="24"/>
-          <w:szCs w:val="24"/>
-          <w:lang w:val="vi-VN" w:eastAsia="vi-VN"/>
-          <w14:ligatures w14:val="standardContextual"/>
-        </w:rPr>
-      </w:pPr>
-      <w:hyperlink w:anchor="_Toc240204947" w:history="1">
-        <w:r>
-          <w:rPr>
-            <w:rStyle w:val="Hyperlink"/>
-            <w:rFonts w:cs="Times New Roman"/>
-            <w:noProof/>
-          </w:rPr>
-          <w:t>4.1 Đối tượng nghiên cứu</w:t>
-        </w:r>
-        <w:r>
-          <w:rPr>
-            <w:noProof/>
-            <w:webHidden/>
-          </w:rPr>
-          <w:tab/>
-        </w:r>
-        <w:r>
-          <w:rPr>
-            <w:noProof/>
-            <w:webHidden/>
-          </w:rPr>
-          <w:fldChar w:fldCharType="begin"/>
-        </w:r>
-        <w:r>
-          <w:rPr>
-            <w:noProof/>
-            <w:webHidden/>
-          </w:rPr>
-          <w:instrText xml:space="preserve"> PAGEREF _Toc240204947 \h </w:instrText>
-        </w:r>
-        <w:r>
-          <w:rPr>
-            <w:noProof/>
-            <w:webHidden/>
-          </w:rPr>
-        </w:r>
-        <w:r>
-          <w:rPr>
-            <w:noProof/>
-            <w:webHidden/>
-          </w:rPr>
-          <w:fldChar w:fldCharType="separate"/>
-        </w:r>
-        <w:r>
-          <w:rPr>
-            <w:noProof/>
-            <w:webHidden/>
-          </w:rPr>
-          <w:t>6</w:t>
-        </w:r>
-        <w:r>
-          <w:rPr>
-            <w:noProof/>
-            <w:webHidden/>
-          </w:rPr>
-          <w:fldChar w:fldCharType="end"/>
-        </w:r>
-      </w:hyperlink>
-    </w:p>
-    <w:p>
-      <w:pPr>
-        <w:pStyle w:val="TOC2"/>
-        <w:tabs>
-          <w:tab w:val="right" w:leader="dot" w:pos="9232"/>
-        </w:tabs>
-        <w:rPr>
-          <w:rFonts w:asciiTheme="minorHAnsi" w:hAnsiTheme="minorHAnsi"/>
-          <w:noProof/>
-          <w:kern w:val="2"/>
-          <w:sz w:val="24"/>
-          <w:szCs w:val="24"/>
-          <w:lang w:val="vi-VN" w:eastAsia="vi-VN"/>
-          <w14:ligatures w14:val="standardContextual"/>
-        </w:rPr>
-      </w:pPr>
-      <w:hyperlink w:anchor="_Toc240204948" w:history="1">
-        <w:r>
-          <w:rPr>
-            <w:rStyle w:val="Hyperlink"/>
-            <w:rFonts w:cs="Times New Roman"/>
-            <w:noProof/>
-          </w:rPr>
-          <w:t>4.2 Phạm vi chức năng</w:t>
-        </w:r>
-        <w:r>
-          <w:rPr>
-            <w:noProof/>
-            <w:webHidden/>
-          </w:rPr>
-          <w:tab/>
-        </w:r>
-        <w:r>
-          <w:rPr>
-            <w:noProof/>
-            <w:webHidden/>
-          </w:rPr>
-          <w:fldChar w:fldCharType="begin"/>
-        </w:r>
-        <w:r>
-          <w:rPr>
-            <w:noProof/>
-            <w:webHidden/>
-          </w:rPr>
-          <w:instrText xml:space="preserve"> PAGEREF _Toc240204948 \h </w:instrText>
-        </w:r>
-        <w:r>
-          <w:rPr>
-            <w:noProof/>
-            <w:webHidden/>
-          </w:rPr>
-        </w:r>
-        <w:r>
-          <w:rPr>
-            <w:noProof/>
-            <w:webHidden/>
-          </w:rPr>
-          <w:fldChar w:fldCharType="separate"/>
-        </w:r>
-        <w:r>
-          <w:rPr>
-            <w:noProof/>
-            <w:webHidden/>
-          </w:rPr>
-          <w:t>6</w:t>
-        </w:r>
-        <w:r>
-          <w:rPr>
-            <w:noProof/>
-            <w:webHidden/>
-          </w:rPr>
-          <w:fldChar w:fldCharType="end"/>
-        </w:r>
-      </w:hyperlink>
-    </w:p>
-    <w:p>
-      <w:pPr>
-        <w:pStyle w:val="TOC2"/>
-        <w:tabs>
-          <w:tab w:val="right" w:leader="dot" w:pos="9232"/>
-        </w:tabs>
-        <w:rPr>
-          <w:rFonts w:asciiTheme="minorHAnsi" w:hAnsiTheme="minorHAnsi"/>
-          <w:noProof/>
-          <w:kern w:val="2"/>
-          <w:sz w:val="24"/>
-          <w:szCs w:val="24"/>
-          <w:lang w:val="vi-VN" w:eastAsia="vi-VN"/>
-          <w14:ligatures w14:val="standardContextual"/>
-        </w:rPr>
-      </w:pPr>
-      <w:hyperlink w:anchor="_Toc240204949" w:history="1">
-        <w:r>
-          <w:rPr>
-            <w:rStyle w:val="Hyperlink"/>
-            <w:rFonts w:cs="Times New Roman"/>
-            <w:noProof/>
-          </w:rPr>
-          <w:t>4.3 Giới hạn đề tài</w:t>
-        </w:r>
-        <w:r>
-          <w:rPr>
-            <w:noProof/>
-            <w:webHidden/>
-          </w:rPr>
-          <w:tab/>
-        </w:r>
-        <w:r>
-          <w:rPr>
-            <w:noProof/>
-            <w:webHidden/>
-          </w:rPr>
-          <w:fldChar w:fldCharType="begin"/>
-        </w:r>
-        <w:r>
-          <w:rPr>
-            <w:noProof/>
-            <w:webHidden/>
-          </w:rPr>
-          <w:instrText xml:space="preserve"> PAGEREF _Toc240204949 \h </w:instrText>
-        </w:r>
-        <w:r>
-          <w:rPr>
-            <w:noProof/>
-            <w:webHidden/>
-          </w:rPr>
-        </w:r>
-        <w:r>
-          <w:rPr>
-            <w:noProof/>
-            <w:webHidden/>
-          </w:rPr>
-          <w:fldChar w:fldCharType="separate"/>
-        </w:r>
-        <w:r>
-          <w:rPr>
-            <w:noProof/>
-            <w:webHidden/>
-          </w:rPr>
-          <w:t>7</w:t>
-        </w:r>
-        <w:r>
-          <w:rPr>
-            <w:noProof/>
-            <w:webHidden/>
-          </w:rPr>
-          <w:fldChar w:fldCharType="end"/>
-        </w:r>
-      </w:hyperlink>
-    </w:p>
-    <w:p>
-      <w:pPr>
-        <w:pStyle w:val="TOC1"/>
-        <w:tabs>
-          <w:tab w:val="right" w:leader="dot" w:pos="9232"/>
-        </w:tabs>
-        <w:rPr>
-          <w:rFonts w:asciiTheme="minorHAnsi" w:hAnsiTheme="minorHAnsi"/>
-          <w:noProof/>
-          <w:kern w:val="2"/>
-          <w:sz w:val="24"/>
-          <w:szCs w:val="24"/>
-          <w:lang w:val="vi-VN" w:eastAsia="vi-VN"/>
-          <w14:ligatures w14:val="standardContextual"/>
-        </w:rPr>
-      </w:pPr>
-      <w:hyperlink w:anchor="_Toc240204950" w:history="1">
-        <w:r>
-          <w:rPr>
-            <w:rStyle w:val="Hyperlink"/>
-            <w:rFonts w:cs="Times New Roman"/>
-            <w:noProof/>
-          </w:rPr>
-          <w:t>5 KHẢO SÁT VÀ PHÂN TÍCH YÊU CẦU</w:t>
-        </w:r>
-        <w:r>
-          <w:rPr>
-            <w:noProof/>
-            <w:webHidden/>
-          </w:rPr>
-          <w:tab/>
-        </w:r>
-        <w:r>
-          <w:rPr>
-            <w:noProof/>
-            <w:webHidden/>
-          </w:rPr>
-          <w:fldChar w:fldCharType="begin"/>
-        </w:r>
-        <w:r>
-          <w:rPr>
-            <w:noProof/>
-            <w:webHidden/>
-          </w:rPr>
-          <w:instrText xml:space="preserve"> PAGEREF _Toc240204950 \h </w:instrText>
-        </w:r>
-        <w:r>
-          <w:rPr>
-            <w:noProof/>
-            <w:webHidden/>
-          </w:rPr>
-        </w:r>
-        <w:r>
-          <w:rPr>
-            <w:noProof/>
-            <w:webHidden/>
-          </w:rPr>
-          <w:fldChar w:fldCharType="separate"/>
-        </w:r>
-        <w:r>
-          <w:rPr>
-            <w:noProof/>
-            <w:webHidden/>
-          </w:rPr>
-          <w:t>8</w:t>
-        </w:r>
-        <w:r>
-          <w:rPr>
-            <w:noProof/>
-            <w:webHidden/>
-          </w:rPr>
-          <w:fldChar w:fldCharType="end"/>
-        </w:r>
-      </w:hyperlink>
-    </w:p>
-    <w:p>
-      <w:pPr>
-        <w:pStyle w:val="TOC2"/>
-        <w:tabs>
-          <w:tab w:val="right" w:leader="dot" w:pos="9232"/>
-        </w:tabs>
-        <w:rPr>
-          <w:rFonts w:asciiTheme="minorHAnsi" w:hAnsiTheme="minorHAnsi"/>
-          <w:noProof/>
-          <w:kern w:val="2"/>
-          <w:sz w:val="24"/>
-          <w:szCs w:val="24"/>
-          <w:lang w:val="vi-VN" w:eastAsia="vi-VN"/>
-          <w14:ligatures w14:val="standardContextual"/>
-        </w:rPr>
-      </w:pPr>
-      <w:hyperlink w:anchor="_Toc240204951" w:history="1">
-        <w:r>
-          <w:rPr>
-            <w:rStyle w:val="Hyperlink"/>
-            <w:rFonts w:cs="Times New Roman"/>
-            <w:noProof/>
-          </w:rPr>
-          <w:t>5.1 Khảo sát hiện trạng</w:t>
-        </w:r>
-        <w:r>
-          <w:rPr>
-            <w:noProof/>
-            <w:webHidden/>
-          </w:rPr>
-          <w:tab/>
-        </w:r>
-        <w:r>
-          <w:rPr>
-            <w:noProof/>
-            <w:webHidden/>
-          </w:rPr>
-          <w:fldChar w:fldCharType="begin"/>
-        </w:r>
-        <w:r>
-          <w:rPr>
-            <w:noProof/>
-            <w:webHidden/>
-          </w:rPr>
-          <w:instrText xml:space="preserve"> PAGEREF _Toc240204951 \h </w:instrText>
-        </w:r>
-        <w:r>
-          <w:rPr>
-            <w:noProof/>
-            <w:webHidden/>
-          </w:rPr>
-        </w:r>
-        <w:r>
-          <w:rPr>
-            <w:noProof/>
-            <w:webHidden/>
-          </w:rPr>
-          <w:fldChar w:fldCharType="separate"/>
-        </w:r>
-        <w:r>
-          <w:rPr>
-            <w:noProof/>
-            <w:webHidden/>
-          </w:rPr>
-          <w:t>8</w:t>
-        </w:r>
-        <w:r>
-          <w:rPr>
-            <w:noProof/>
-            <w:webHidden/>
-          </w:rPr>
-          <w:fldChar w:fldCharType="end"/>
-        </w:r>
-      </w:hyperlink>
-    </w:p>
-    <w:p>
-      <w:pPr>
-        <w:pStyle w:val="TOC2"/>
-        <w:tabs>
-          <w:tab w:val="right" w:leader="dot" w:pos="9232"/>
-        </w:tabs>
-        <w:rPr>
-          <w:rFonts w:asciiTheme="minorHAnsi" w:hAnsiTheme="minorHAnsi"/>
-          <w:noProof/>
-          <w:kern w:val="2"/>
-          <w:sz w:val="24"/>
-          <w:szCs w:val="24"/>
-          <w:lang w:val="vi-VN" w:eastAsia="vi-VN"/>
-          <w14:ligatures w14:val="standardContextual"/>
-        </w:rPr>
-      </w:pPr>
-      <w:hyperlink w:anchor="_Toc240204952" w:history="1">
-        <w:r>
-          <w:rPr>
-            <w:rStyle w:val="Hyperlink"/>
-            <w:rFonts w:cs="Times New Roman"/>
-            <w:noProof/>
-          </w:rPr>
-          <w:t>5.2 Tác nhân của hệ thống</w:t>
-        </w:r>
-        <w:r>
-          <w:rPr>
-            <w:noProof/>
-            <w:webHidden/>
-          </w:rPr>
-          <w:tab/>
-        </w:r>
-        <w:r>
-          <w:rPr>
-            <w:noProof/>
-            <w:webHidden/>
-          </w:rPr>
-          <w:fldChar w:fldCharType="begin"/>
-        </w:r>
-        <w:r>
-          <w:rPr>
-            <w:noProof/>
-            <w:webHidden/>
-          </w:rPr>
-          <w:instrText xml:space="preserve"> PAGEREF _Toc240204952 \h </w:instrText>
-        </w:r>
-        <w:r>
-          <w:rPr>
-            <w:noProof/>
-            <w:webHidden/>
-          </w:rPr>
-        </w:r>
-        <w:r>
-          <w:rPr>
-            <w:noProof/>
-            <w:webHidden/>
-          </w:rPr>
-          <w:fldChar w:fldCharType="separate"/>
-        </w:r>
-        <w:r>
-          <w:rPr>
-            <w:noProof/>
-            <w:webHidden/>
-          </w:rPr>
-          <w:t>8</w:t>
-        </w:r>
-        <w:r>
-          <w:rPr>
-            <w:noProof/>
-            <w:webHidden/>
-          </w:rPr>
-          <w:fldChar w:fldCharType="end"/>
-        </w:r>
-      </w:hyperlink>
-    </w:p>
-    <w:p>
-      <w:pPr>
-        <w:pStyle w:val="TOC2"/>
-        <w:tabs>
-          <w:tab w:val="right" w:leader="dot" w:pos="9232"/>
-        </w:tabs>
-        <w:rPr>
-          <w:rFonts w:asciiTheme="minorHAnsi" w:hAnsiTheme="minorHAnsi"/>
-          <w:noProof/>
-          <w:kern w:val="2"/>
-          <w:sz w:val="24"/>
-          <w:szCs w:val="24"/>
-          <w:lang w:val="vi-VN" w:eastAsia="vi-VN"/>
-          <w14:ligatures w14:val="standardContextual"/>
-        </w:rPr>
-      </w:pPr>
-      <w:hyperlink w:anchor="_Toc240204953" w:history="1">
-        <w:r>
-          <w:rPr>
-            <w:rStyle w:val="Hyperlink"/>
-            <w:rFonts w:cs="Times New Roman"/>
-            <w:noProof/>
-          </w:rPr>
-          <w:t>5.3 Yêu cầu chức năng</w:t>
-        </w:r>
-        <w:r>
-          <w:rPr>
-            <w:noProof/>
-            <w:webHidden/>
-          </w:rPr>
-          <w:tab/>
-        </w:r>
-        <w:r>
-          <w:rPr>
-            <w:noProof/>
-            <w:webHidden/>
-          </w:rPr>
-          <w:fldChar w:fldCharType="begin"/>
-        </w:r>
-        <w:r>
-          <w:rPr>
-            <w:noProof/>
-            <w:webHidden/>
-          </w:rPr>
-          <w:instrText xml:space="preserve"> PAGEREF _Toc240204953 \h </w:instrText>
-        </w:r>
-        <w:r>
-          <w:rPr>
-            <w:noProof/>
-            <w:webHidden/>
-          </w:rPr>
-        </w:r>
-        <w:r>
-          <w:rPr>
-            <w:noProof/>
-            <w:webHidden/>
-          </w:rPr>
-          <w:fldChar w:fldCharType="separate"/>
-        </w:r>
-        <w:r>
-          <w:rPr>
-            <w:noProof/>
-            <w:webHidden/>
-          </w:rPr>
-          <w:t>9</w:t>
-        </w:r>
-        <w:r>
-          <w:rPr>
-            <w:noProof/>
-            <w:webHidden/>
-          </w:rPr>
-          <w:fldChar w:fldCharType="end"/>
-        </w:r>
-      </w:hyperlink>
-    </w:p>
-    <w:p>
-      <w:pPr>
-        <w:pStyle w:val="TOC2"/>
-        <w:tabs>
-          <w:tab w:val="right" w:leader="dot" w:pos="9232"/>
-        </w:tabs>
-        <w:rPr>
-          <w:rFonts w:asciiTheme="minorHAnsi" w:hAnsiTheme="minorHAnsi"/>
-          <w:noProof/>
-          <w:kern w:val="2"/>
-          <w:sz w:val="24"/>
-          <w:szCs w:val="24"/>
-          <w:lang w:val="vi-VN" w:eastAsia="vi-VN"/>
-          <w14:ligatures w14:val="standardContextual"/>
-        </w:rPr>
-      </w:pPr>
-      <w:hyperlink w:anchor="_Toc240204954" w:history="1">
-        <w:r>
-          <w:rPr>
-            <w:rStyle w:val="Hyperlink"/>
-            <w:rFonts w:cs="Times New Roman"/>
-            <w:noProof/>
-          </w:rPr>
-          <w:t>5.4 Yêu cầu phi chức năng</w:t>
-        </w:r>
-        <w:r>
-          <w:rPr>
-            <w:noProof/>
-            <w:webHidden/>
-          </w:rPr>
-          <w:tab/>
-        </w:r>
-        <w:r>
-          <w:rPr>
-            <w:noProof/>
-            <w:webHidden/>
-          </w:rPr>
-          <w:fldChar w:fldCharType="begin"/>
-        </w:r>
-        <w:r>
-          <w:rPr>
-            <w:noProof/>
-            <w:webHidden/>
-          </w:rPr>
-          <w:instrText xml:space="preserve"> PAGEREF _Toc240204954 \h </w:instrText>
-        </w:r>
-        <w:r>
-          <w:rPr>
-            <w:noProof/>
-            <w:webHidden/>
-          </w:rPr>
-        </w:r>
-        <w:r>
-          <w:rPr>
-            <w:noProof/>
-            <w:webHidden/>
-          </w:rPr>
-          <w:fldChar w:fldCharType="separate"/>
-        </w:r>
-        <w:r>
-          <w:rPr>
-            <w:noProof/>
-            <w:webHidden/>
-          </w:rPr>
-          <w:t>10</w:t>
-        </w:r>
-        <w:r>
-          <w:rPr>
-            <w:noProof/>
-            <w:webHidden/>
-          </w:rPr>
-          <w:fldChar w:fldCharType="end"/>
-        </w:r>
-      </w:hyperlink>
-    </w:p>
-    <w:p>
-      <w:pPr>
-        <w:pStyle w:val="TOC1"/>
-        <w:tabs>
-          <w:tab w:val="right" w:leader="dot" w:pos="9232"/>
-        </w:tabs>
-        <w:rPr>
-          <w:rFonts w:asciiTheme="minorHAnsi" w:hAnsiTheme="minorHAnsi"/>
-          <w:noProof/>
-          <w:kern w:val="2"/>
-          <w:sz w:val="24"/>
-          <w:szCs w:val="24"/>
-          <w:lang w:val="vi-VN" w:eastAsia="vi-VN"/>
-          <w14:ligatures w14:val="standardContextual"/>
-        </w:rPr>
-      </w:pPr>
-      <w:hyperlink w:anchor="_Toc240204955" w:history="1">
-        <w:r>
-          <w:rPr>
-            <w:rStyle w:val="Hyperlink"/>
-            <w:rFonts w:cs="Times New Roman"/>
-            <w:noProof/>
-          </w:rPr>
-          <w:t>6 PHÂN TÍCH VÀ THIẾT KẾ HỆ THỐNG</w:t>
-        </w:r>
-        <w:r>
-          <w:rPr>
-            <w:noProof/>
-            <w:webHidden/>
-          </w:rPr>
-          <w:tab/>
-        </w:r>
-        <w:r>
-          <w:rPr>
-            <w:noProof/>
-            <w:webHidden/>
-          </w:rPr>
-          <w:fldChar w:fldCharType="begin"/>
-        </w:r>
-        <w:r>
-          <w:rPr>
-            <w:noProof/>
-            <w:webHidden/>
-          </w:rPr>
-          <w:instrText xml:space="preserve"> PAGEREF _Toc240204955 \h </w:instrText>
-        </w:r>
-        <w:r>
-          <w:rPr>
-            <w:noProof/>
-            <w:webHidden/>
-          </w:rPr>
-        </w:r>
-        <w:r>
-          <w:rPr>
-            <w:noProof/>
-            <w:webHidden/>
-          </w:rPr>
-          <w:fldChar w:fldCharType="separate"/>
-        </w:r>
-        <w:r>
-          <w:rPr>
-            <w:noProof/>
-            <w:webHidden/>
-          </w:rPr>
-          <w:t>11</w:t>
-        </w:r>
-        <w:r>
-          <w:rPr>
-            <w:noProof/>
-            <w:webHidden/>
-          </w:rPr>
-          <w:fldChar w:fldCharType="end"/>
-        </w:r>
-      </w:hyperlink>
-    </w:p>
-    <w:p>
-      <w:pPr>
-        <w:pStyle w:val="TOC1"/>
-        <w:tabs>
-          <w:tab w:val="right" w:leader="dot" w:pos="9232"/>
-        </w:tabs>
-        <w:rPr>
-          <w:rFonts w:asciiTheme="minorHAnsi" w:hAnsiTheme="minorHAnsi"/>
-          <w:noProof/>
-          <w:kern w:val="2"/>
-          <w:sz w:val="24"/>
-          <w:szCs w:val="24"/>
-          <w:lang w:val="vi-VN" w:eastAsia="vi-VN"/>
-          <w14:ligatures w14:val="standardContextual"/>
-        </w:rPr>
-      </w:pPr>
-      <w:hyperlink w:anchor="_Toc240204956" w:history="1">
-        <w:r>
-          <w:rPr>
-            <w:rStyle w:val="Hyperlink"/>
-            <w:rFonts w:cs="Times New Roman"/>
-            <w:noProof/>
-          </w:rPr>
-          <w:t>7 CÔNG NGHỆ DỰ KIẾN SỬ DỤNG</w:t>
-        </w:r>
-        <w:r>
-          <w:rPr>
-            <w:noProof/>
-            <w:webHidden/>
-          </w:rPr>
-          <w:tab/>
-        </w:r>
-        <w:r>
-          <w:rPr>
-            <w:noProof/>
-            <w:webHidden/>
-          </w:rPr>
-          <w:fldChar w:fldCharType="begin"/>
-        </w:r>
-        <w:r>
-          <w:rPr>
-            <w:noProof/>
-            <w:webHidden/>
-          </w:rPr>
-          <w:instrText xml:space="preserve"> PAGEREF _Toc240204956 \h </w:instrText>
-        </w:r>
-        <w:r>
-          <w:rPr>
-            <w:noProof/>
-            <w:webHidden/>
-          </w:rPr>
-        </w:r>
-        <w:r>
-          <w:rPr>
-            <w:noProof/>
-            <w:webHidden/>
-          </w:rPr>
-          <w:fldChar w:fldCharType="separate"/>
-        </w:r>
-        <w:r>
-          <w:rPr>
-            <w:noProof/>
-            <w:webHidden/>
-          </w:rPr>
-          <w:t>12</w:t>
-        </w:r>
-        <w:r>
-          <w:rPr>
-            <w:noProof/>
-            <w:webHidden/>
-          </w:rPr>
-          <w:fldChar w:fldCharType="end"/>
-        </w:r>
-      </w:hyperlink>
-    </w:p>
-    <w:p>
-      <w:pPr>
-        <w:pStyle w:val="TOC1"/>
-        <w:tabs>
-          <w:tab w:val="right" w:leader="dot" w:pos="9232"/>
-        </w:tabs>
-        <w:rPr>
-          <w:rFonts w:asciiTheme="minorHAnsi" w:hAnsiTheme="minorHAnsi"/>
-          <w:noProof/>
-          <w:kern w:val="2"/>
-          <w:sz w:val="24"/>
-          <w:szCs w:val="24"/>
-          <w:lang w:val="vi-VN" w:eastAsia="vi-VN"/>
-          <w14:ligatures w14:val="standardContextual"/>
-        </w:rPr>
-      </w:pPr>
-      <w:hyperlink w:anchor="_Toc240204957" w:history="1">
-        <w:r>
-          <w:rPr>
-            <w:rStyle w:val="Hyperlink"/>
-            <w:rFonts w:cs="Times New Roman"/>
-            <w:noProof/>
-          </w:rPr>
-          <w:t>8 NỘI DUNG VÀ PHƯƠNG PHÁP THỰC HIỆN</w:t>
-        </w:r>
-        <w:r>
-          <w:rPr>
-            <w:noProof/>
-            <w:webHidden/>
-          </w:rPr>
-          <w:tab/>
-        </w:r>
-        <w:r>
-          <w:rPr>
-            <w:noProof/>
-            <w:webHidden/>
-          </w:rPr>
-          <w:fldChar w:fldCharType="begin"/>
-        </w:r>
-        <w:r>
-          <w:rPr>
-            <w:noProof/>
-            <w:webHidden/>
-          </w:rPr>
-          <w:instrText xml:space="preserve"> PAGEREF _Toc240204957 \h </w:instrText>
-        </w:r>
-        <w:r>
-          <w:rPr>
-            <w:noProof/>
-            <w:webHidden/>
-          </w:rPr>
-        </w:r>
-        <w:r>
-          <w:rPr>
-            <w:noProof/>
-            <w:webHidden/>
-          </w:rPr>
-          <w:fldChar w:fldCharType="separate"/>
-        </w:r>
-        <w:r>
-          <w:rPr>
-            <w:noProof/>
-            <w:webHidden/>
-          </w:rPr>
-          <w:t>13</w:t>
-        </w:r>
-        <w:r>
-          <w:rPr>
-            <w:noProof/>
-            <w:webHidden/>
-          </w:rPr>
-          <w:fldChar w:fldCharType="end"/>
-        </w:r>
-      </w:hyperlink>
-    </w:p>
-    <w:p>
-      <w:pPr>
-        <w:pStyle w:val="TOC2"/>
-        <w:tabs>
-          <w:tab w:val="right" w:leader="dot" w:pos="9232"/>
-        </w:tabs>
-        <w:rPr>
-          <w:rFonts w:asciiTheme="minorHAnsi" w:hAnsiTheme="minorHAnsi"/>
-          <w:noProof/>
-          <w:kern w:val="2"/>
-          <w:sz w:val="24"/>
-          <w:szCs w:val="24"/>
-          <w:lang w:val="vi-VN" w:eastAsia="vi-VN"/>
-          <w14:ligatures w14:val="standardContextual"/>
-        </w:rPr>
-      </w:pPr>
-      <w:hyperlink w:anchor="_Toc240204958" w:history="1">
-        <w:r>
-          <w:rPr>
-            <w:rStyle w:val="Hyperlink"/>
-            <w:rFonts w:cs="Times New Roman"/>
-            <w:noProof/>
-          </w:rPr>
-          <w:t>8.1 Khảo sát và xác định yêu cầu</w:t>
-        </w:r>
-        <w:r>
-          <w:rPr>
-            <w:noProof/>
-            <w:webHidden/>
-          </w:rPr>
-          <w:tab/>
-        </w:r>
-        <w:r>
-          <w:rPr>
-            <w:noProof/>
-            <w:webHidden/>
-          </w:rPr>
-          <w:fldChar w:fldCharType="begin"/>
-        </w:r>
-        <w:r>
-          <w:rPr>
-            <w:noProof/>
-            <w:webHidden/>
-          </w:rPr>
-          <w:instrText xml:space="preserve"> PAGEREF _Toc240204958 \h </w:instrText>
-        </w:r>
-        <w:r>
-          <w:rPr>
-            <w:noProof/>
-            <w:webHidden/>
-          </w:rPr>
-        </w:r>
-        <w:r>
-          <w:rPr>
-            <w:noProof/>
-            <w:webHidden/>
-          </w:rPr>
-          <w:fldChar w:fldCharType="separate"/>
-        </w:r>
-        <w:r>
-          <w:rPr>
-            <w:noProof/>
-            <w:webHidden/>
-          </w:rPr>
-          <w:t>13</w:t>
-        </w:r>
-        <w:r>
-          <w:rPr>
-            <w:noProof/>
-            <w:webHidden/>
-          </w:rPr>
-          <w:fldChar w:fldCharType="end"/>
-        </w:r>
-      </w:hyperlink>
-    </w:p>
-    <w:p>
-      <w:pPr>
-        <w:pStyle w:val="TOC2"/>
-        <w:tabs>
-          <w:tab w:val="right" w:leader="dot" w:pos="9232"/>
-        </w:tabs>
-        <w:rPr>
-          <w:rFonts w:asciiTheme="minorHAnsi" w:hAnsiTheme="minorHAnsi"/>
-          <w:noProof/>
-          <w:kern w:val="2"/>
-          <w:sz w:val="24"/>
-          <w:szCs w:val="24"/>
-          <w:lang w:val="vi-VN" w:eastAsia="vi-VN"/>
-          <w14:ligatures w14:val="standardContextual"/>
-        </w:rPr>
-      </w:pPr>
-      <w:hyperlink w:anchor="_Toc240204959" w:history="1">
-        <w:r>
-          <w:rPr>
-            <w:rStyle w:val="Hyperlink"/>
-            <w:rFonts w:cs="Times New Roman"/>
-            <w:noProof/>
-          </w:rPr>
-          <w:t>8.2 Phân tích và thiết kế</w:t>
-        </w:r>
-        <w:r>
-          <w:rPr>
-            <w:noProof/>
-            <w:webHidden/>
-          </w:rPr>
-          <w:tab/>
-        </w:r>
-        <w:r>
-          <w:rPr>
-            <w:noProof/>
-            <w:webHidden/>
-          </w:rPr>
-          <w:fldChar w:fldCharType="begin"/>
-        </w:r>
-        <w:r>
-          <w:rPr>
-            <w:noProof/>
-            <w:webHidden/>
-          </w:rPr>
-          <w:instrText xml:space="preserve"> PAGEREF _Toc240204959 \h </w:instrText>
-        </w:r>
-        <w:r>
-          <w:rPr>
-            <w:noProof/>
-            <w:webHidden/>
-          </w:rPr>
-        </w:r>
-        <w:r>
-          <w:rPr>
-            <w:noProof/>
-            <w:webHidden/>
-          </w:rPr>
-          <w:fldChar w:fldCharType="separate"/>
-        </w:r>
-        <w:r>
-          <w:rPr>
-            <w:noProof/>
-            <w:webHidden/>
-          </w:rPr>
-          <w:t>13</w:t>
-        </w:r>
-        <w:r>
-          <w:rPr>
-            <w:noProof/>
-            <w:webHidden/>
-          </w:rPr>
-          <w:fldChar w:fldCharType="end"/>
-        </w:r>
-      </w:hyperlink>
-    </w:p>
-    <w:p>
-      <w:pPr>
-        <w:pStyle w:val="TOC2"/>
-        <w:tabs>
-          <w:tab w:val="right" w:leader="dot" w:pos="9232"/>
-        </w:tabs>
-        <w:rPr>
-          <w:rFonts w:asciiTheme="minorHAnsi" w:hAnsiTheme="minorHAnsi"/>
-          <w:noProof/>
-          <w:kern w:val="2"/>
-          <w:sz w:val="24"/>
-          <w:szCs w:val="24"/>
-          <w:lang w:val="vi-VN" w:eastAsia="vi-VN"/>
-          <w14:ligatures w14:val="standardContextual"/>
-        </w:rPr>
-      </w:pPr>
-      <w:hyperlink w:anchor="_Toc240204960" w:history="1">
-        <w:r>
-          <w:rPr>
-            <w:rStyle w:val="Hyperlink"/>
-            <w:rFonts w:cs="Times New Roman"/>
-            <w:noProof/>
-          </w:rPr>
-          <w:t>8.3 Xây dựng hệ thống</w:t>
-        </w:r>
-        <w:r>
-          <w:rPr>
-            <w:noProof/>
-            <w:webHidden/>
-          </w:rPr>
-          <w:tab/>
-        </w:r>
-        <w:r>
-          <w:rPr>
-            <w:noProof/>
-            <w:webHidden/>
-          </w:rPr>
-          <w:fldChar w:fldCharType="begin"/>
-        </w:r>
-        <w:r>
-          <w:rPr>
-            <w:noProof/>
-            <w:webHidden/>
-          </w:rPr>
-          <w:instrText xml:space="preserve"> PAGEREF _Toc240204960 \h </w:instrText>
-        </w:r>
-        <w:r>
-          <w:rPr>
-            <w:noProof/>
-            <w:webHidden/>
-          </w:rPr>
-        </w:r>
-        <w:r>
-          <w:rPr>
-            <w:noProof/>
-            <w:webHidden/>
-          </w:rPr>
-          <w:fldChar w:fldCharType="separate"/>
-        </w:r>
-        <w:r>
-          <w:rPr>
-            <w:noProof/>
-            <w:webHidden/>
-          </w:rPr>
-          <w:t>13</w:t>
-        </w:r>
-        <w:r>
-          <w:rPr>
-            <w:noProof/>
-            <w:webHidden/>
-          </w:rPr>
-          <w:fldChar w:fldCharType="end"/>
-        </w:r>
-      </w:hyperlink>
-    </w:p>
-    <w:p>
-      <w:pPr>
-        <w:pStyle w:val="TOC2"/>
-        <w:tabs>
-          <w:tab w:val="right" w:leader="dot" w:pos="9232"/>
-        </w:tabs>
-        <w:rPr>
-          <w:rFonts w:asciiTheme="minorHAnsi" w:hAnsiTheme="minorHAnsi"/>
-          <w:noProof/>
-          <w:kern w:val="2"/>
-          <w:sz w:val="24"/>
-          <w:szCs w:val="24"/>
-          <w:lang w:val="vi-VN" w:eastAsia="vi-VN"/>
-          <w14:ligatures w14:val="standardContextual"/>
-        </w:rPr>
-      </w:pPr>
-      <w:hyperlink w:anchor="_Toc240204961" w:history="1">
-        <w:r>
-          <w:rPr>
-            <w:rStyle w:val="Hyperlink"/>
-            <w:rFonts w:cs="Times New Roman"/>
-            <w:noProof/>
-          </w:rPr>
-          <w:t>8.4 Kiểm thử và hoàn thiện</w:t>
-        </w:r>
-        <w:r>
-          <w:rPr>
-            <w:noProof/>
-            <w:webHidden/>
-          </w:rPr>
-          <w:tab/>
-        </w:r>
-        <w:r>
-          <w:rPr>
-            <w:noProof/>
-            <w:webHidden/>
-          </w:rPr>
-          <w:fldChar w:fldCharType="begin"/>
-        </w:r>
-        <w:r>
-          <w:rPr>
-            <w:noProof/>
-            <w:webHidden/>
-          </w:rPr>
-          <w:instrText xml:space="preserve"> PAGEREF _Toc240204961 \h </w:instrText>
-        </w:r>
-        <w:r>
-          <w:rPr>
-            <w:noProof/>
-            <w:webHidden/>
-          </w:rPr>
-        </w:r>
-        <w:r>
-          <w:rPr>
-            <w:noProof/>
-            <w:webHidden/>
-          </w:rPr>
-          <w:fldChar w:fldCharType="separate"/>
-        </w:r>
-        <w:r>
-          <w:rPr>
-            <w:noProof/>
-            <w:webHidden/>
-          </w:rPr>
-          <w:t>13</w:t>
-        </w:r>
-        <w:r>
-          <w:rPr>
-            <w:noProof/>
-            <w:webHidden/>
-          </w:rPr>
-          <w:fldChar w:fldCharType="end"/>
-        </w:r>
-      </w:hyperlink>
-    </w:p>
-    <w:p>
-      <w:pPr>
-        <w:pStyle w:val="TOC1"/>
-        <w:tabs>
-          <w:tab w:val="right" w:leader="dot" w:pos="9232"/>
-        </w:tabs>
-        <w:rPr>
-          <w:rFonts w:asciiTheme="minorHAnsi" w:hAnsiTheme="minorHAnsi"/>
-          <w:noProof/>
-          <w:kern w:val="2"/>
-          <w:sz w:val="24"/>
-          <w:szCs w:val="24"/>
-          <w:lang w:val="vi-VN" w:eastAsia="vi-VN"/>
-          <w14:ligatures w14:val="standardContextual"/>
-        </w:rPr>
-      </w:pPr>
-      <w:hyperlink w:anchor="_Toc240204962" w:history="1">
-        <w:r>
-          <w:rPr>
-            <w:rStyle w:val="Hyperlink"/>
-            <w:rFonts w:cs="Times New Roman"/>
-            <w:noProof/>
-          </w:rPr>
-          <w:t>9 KẾ HOẠCH THỰC HIỆN</w:t>
-        </w:r>
-        <w:r>
-          <w:rPr>
-            <w:noProof/>
-            <w:webHidden/>
-          </w:rPr>
-          <w:tab/>
-        </w:r>
-        <w:r>
-          <w:rPr>
-            <w:noProof/>
-            <w:webHidden/>
-          </w:rPr>
-          <w:fldChar w:fldCharType="begin"/>
-        </w:r>
-        <w:r>
-          <w:rPr>
-            <w:noProof/>
-            <w:webHidden/>
-          </w:rPr>
-          <w:instrText xml:space="preserve"> PAGEREF _Toc240204962 \h </w:instrText>
-        </w:r>
-        <w:r>
-          <w:rPr>
-            <w:noProof/>
-            <w:webHidden/>
-          </w:rPr>
-        </w:r>
-        <w:r>
-          <w:rPr>
-            <w:noProof/>
-            <w:webHidden/>
-          </w:rPr>
-          <w:fldChar w:fldCharType="separate"/>
-        </w:r>
-        <w:r>
-          <w:rPr>
-            <w:noProof/>
-            <w:webHidden/>
-          </w:rPr>
-          <w:t>14</w:t>
-        </w:r>
-        <w:r>
-          <w:rPr>
-            <w:noProof/>
-            <w:webHidden/>
-          </w:rPr>
-          <w:fldChar w:fldCharType="end"/>
-        </w:r>
-      </w:hyperlink>
-    </w:p>
-    <w:p>
-      <w:pPr>
-        <w:pStyle w:val="TOC1"/>
-        <w:tabs>
-          <w:tab w:val="right" w:leader="dot" w:pos="9232"/>
-        </w:tabs>
-        <w:rPr>
-          <w:rFonts w:asciiTheme="minorHAnsi" w:hAnsiTheme="minorHAnsi"/>
-          <w:noProof/>
-          <w:kern w:val="2"/>
-          <w:sz w:val="24"/>
-          <w:szCs w:val="24"/>
-          <w:lang w:val="vi-VN" w:eastAsia="vi-VN"/>
-          <w14:ligatures w14:val="standardContextual"/>
-        </w:rPr>
-      </w:pPr>
-      <w:hyperlink w:anchor="_Toc240204963" w:history="1">
-        <w:r>
-          <w:rPr>
-            <w:rStyle w:val="Hyperlink"/>
-            <w:rFonts w:cs="Times New Roman"/>
-            <w:noProof/>
-          </w:rPr>
-          <w:t>10 SẢN PHẨM PHẢI HOÀN THÀNH</w:t>
-        </w:r>
-        <w:r>
-          <w:rPr>
-            <w:noProof/>
-            <w:webHidden/>
-          </w:rPr>
-          <w:tab/>
-        </w:r>
-        <w:r>
-          <w:rPr>
-            <w:noProof/>
-            <w:webHidden/>
-          </w:rPr>
-          <w:fldChar w:fldCharType="begin"/>
-        </w:r>
-        <w:r>
-          <w:rPr>
-            <w:noProof/>
-            <w:webHidden/>
-          </w:rPr>
-          <w:instrText xml:space="preserve"> PAGEREF _Toc240204963 \h </w:instrText>
-        </w:r>
-        <w:r>
-          <w:rPr>
-            <w:noProof/>
-            <w:webHidden/>
-          </w:rPr>
-        </w:r>
-        <w:r>
-          <w:rPr>
-            <w:noProof/>
-            <w:webHidden/>
-          </w:rPr>
-          <w:fldChar w:fldCharType="separate"/>
-        </w:r>
-        <w:r>
-          <w:rPr>
-            <w:noProof/>
-            <w:webHidden/>
-          </w:rPr>
-          <w:t>16</w:t>
-        </w:r>
-        <w:r>
-          <w:rPr>
-            <w:noProof/>
-            <w:webHidden/>
-          </w:rPr>
-          <w:fldChar w:fldCharType="end"/>
-        </w:r>
-      </w:hyperlink>
-    </w:p>
-    <w:p>
-      <w:pPr>
-        <w:pStyle w:val="TOC1"/>
-        <w:tabs>
-          <w:tab w:val="right" w:leader="dot" w:pos="9232"/>
-        </w:tabs>
-        <w:rPr>
-          <w:rFonts w:asciiTheme="minorHAnsi" w:hAnsiTheme="minorHAnsi"/>
-          <w:noProof/>
-          <w:kern w:val="2"/>
-          <w:sz w:val="24"/>
-          <w:szCs w:val="24"/>
-          <w:lang w:val="vi-VN" w:eastAsia="vi-VN"/>
-          <w14:ligatures w14:val="standardContextual"/>
-        </w:rPr>
-      </w:pPr>
-      <w:hyperlink w:anchor="_Toc240204964" w:history="1">
-        <w:r>
-          <w:rPr>
-            <w:rStyle w:val="Hyperlink"/>
-            <w:rFonts w:cs="Times New Roman"/>
-            <w:noProof/>
-          </w:rPr>
-          <w:t>11 CẤU TRÚC BÁO CÁO</w:t>
-        </w:r>
-        <w:r>
-          <w:rPr>
-            <w:noProof/>
-            <w:webHidden/>
-          </w:rPr>
-          <w:tab/>
-        </w:r>
-        <w:r>
-          <w:rPr>
-            <w:noProof/>
-            <w:webHidden/>
-          </w:rPr>
-          <w:fldChar w:fldCharType="begin"/>
-        </w:r>
-        <w:r>
-          <w:rPr>
-            <w:noProof/>
-            <w:webHidden/>
-          </w:rPr>
-          <w:instrText xml:space="preserve"> PAGEREF _Toc240204964 \h </w:instrText>
-        </w:r>
-        <w:r>
-          <w:rPr>
-            <w:noProof/>
-            <w:webHidden/>
-          </w:rPr>
-        </w:r>
-        <w:r>
-          <w:rPr>
-            <w:noProof/>
-            <w:webHidden/>
-          </w:rPr>
-          <w:fldChar w:fldCharType="separate"/>
-        </w:r>
-        <w:r>
-          <w:rPr>
-            <w:noProof/>
-            <w:webHidden/>
-          </w:rPr>
-          <w:t>16</w:t>
-        </w:r>
-        <w:r>
-          <w:rPr>
-            <w:noProof/>
-            <w:webHidden/>
-          </w:rPr>
-          <w:fldChar w:fldCharType="end"/>
-        </w:r>
-      </w:hyperlink>
-    </w:p>
-    <w:p>
-      <w:pPr>
-        <w:pStyle w:val="TOC1"/>
-        <w:tabs>
-          <w:tab w:val="right" w:leader="dot" w:pos="9232"/>
-        </w:tabs>
-        <w:rPr>
-          <w:rFonts w:asciiTheme="minorHAnsi" w:hAnsiTheme="minorHAnsi"/>
-          <w:noProof/>
-          <w:kern w:val="2"/>
-          <w:sz w:val="24"/>
-          <w:szCs w:val="24"/>
-          <w:lang w:val="vi-VN" w:eastAsia="vi-VN"/>
-          <w14:ligatures w14:val="standardContextual"/>
-        </w:rPr>
-      </w:pPr>
-      <w:hyperlink w:anchor="_Toc240204965" w:history="1">
-        <w:r>
-          <w:rPr>
-            <w:rStyle w:val="Hyperlink"/>
-            <w:rFonts w:cs="Times New Roman"/>
-            <w:noProof/>
-          </w:rPr>
-          <w:t>12 YÊU CẦU ĐỐI VỚI CHỨC NĂNG AI</w:t>
-        </w:r>
-        <w:r>
-          <w:rPr>
-            <w:noProof/>
-            <w:webHidden/>
-          </w:rPr>
-          <w:tab/>
-        </w:r>
-        <w:r>
-          <w:rPr>
-            <w:noProof/>
-            <w:webHidden/>
-          </w:rPr>
-          <w:fldChar w:fldCharType="begin"/>
-        </w:r>
-        <w:r>
-          <w:rPr>
-            <w:noProof/>
-            <w:webHidden/>
-          </w:rPr>
-          <w:instrText xml:space="preserve"> PAGEREF _Toc240204965 \h </w:instrText>
-        </w:r>
-        <w:r>
-          <w:rPr>
-            <w:noProof/>
-            <w:webHidden/>
-          </w:rPr>
-        </w:r>
-        <w:r>
-          <w:rPr>
-            <w:noProof/>
-            <w:webHidden/>
-          </w:rPr>
-          <w:fldChar w:fldCharType="separate"/>
-        </w:r>
-        <w:r>
-          <w:rPr>
-            <w:noProof/>
-            <w:webHidden/>
-          </w:rPr>
-          <w:t>17</w:t>
-        </w:r>
-        <w:r>
-          <w:rPr>
-            <w:noProof/>
-            <w:webHidden/>
-          </w:rPr>
-          <w:fldChar w:fldCharType="end"/>
-        </w:r>
-      </w:hyperlink>
-    </w:p>
-    <w:p>
-      <w:pPr>
-        <w:pStyle w:val="TOC1"/>
-        <w:tabs>
-          <w:tab w:val="right" w:leader="dot" w:pos="9232"/>
-        </w:tabs>
-        <w:rPr>
-          <w:rFonts w:asciiTheme="minorHAnsi" w:hAnsiTheme="minorHAnsi"/>
-          <w:noProof/>
-          <w:kern w:val="2"/>
-          <w:sz w:val="24"/>
-          <w:szCs w:val="24"/>
-          <w:lang w:val="vi-VN" w:eastAsia="vi-VN"/>
-          <w14:ligatures w14:val="standardContextual"/>
-        </w:rPr>
-      </w:pPr>
-      <w:hyperlink w:anchor="_Toc240204966" w:history="1">
-        <w:r>
-          <w:rPr>
-            <w:rStyle w:val="Hyperlink"/>
-            <w:rFonts w:cs="Times New Roman"/>
-            <w:noProof/>
-          </w:rPr>
-          <w:t>13 TIÊU CHÍ ĐÁNH GIÁ ĐỀ XUẤT</w:t>
-        </w:r>
-        <w:r>
-          <w:rPr>
-            <w:noProof/>
-            <w:webHidden/>
-          </w:rPr>
-          <w:tab/>
-        </w:r>
-        <w:r>
-          <w:rPr>
-            <w:noProof/>
-            <w:webHidden/>
-          </w:rPr>
-          <w:fldChar w:fldCharType="begin"/>
-        </w:r>
-        <w:r>
-          <w:rPr>
-            <w:noProof/>
-            <w:webHidden/>
-          </w:rPr>
-          <w:instrText xml:space="preserve"> PAGEREF _Toc240204966 \h </w:instrText>
-        </w:r>
-        <w:r>
-          <w:rPr>
-            <w:noProof/>
-            <w:webHidden/>
-          </w:rPr>
-        </w:r>
-        <w:r>
-          <w:rPr>
-            <w:noProof/>
-            <w:webHidden/>
-          </w:rPr>
-          <w:fldChar w:fldCharType="separate"/>
-        </w:r>
-        <w:r>
-          <w:rPr>
-            <w:noProof/>
-            <w:webHidden/>
-          </w:rPr>
-          <w:t>18</w:t>
-        </w:r>
-        <w:r>
-          <w:rPr>
-            <w:noProof/>
-            <w:webHidden/>
-          </w:rPr>
-          <w:fldChar w:fldCharType="end"/>
-        </w:r>
-      </w:hyperlink>
-    </w:p>
-    <w:p>
-      <w:pPr>
-        <w:pStyle w:val="TOC1"/>
-        <w:tabs>
-          <w:tab w:val="right" w:leader="dot" w:pos="9232"/>
-        </w:tabs>
-        <w:rPr>
-          <w:rFonts w:asciiTheme="minorHAnsi" w:hAnsiTheme="minorHAnsi"/>
-          <w:noProof/>
-          <w:kern w:val="2"/>
-          <w:sz w:val="24"/>
-          <w:szCs w:val="24"/>
-          <w:lang w:val="vi-VN" w:eastAsia="vi-VN"/>
-          <w14:ligatures w14:val="standardContextual"/>
-        </w:rPr>
-      </w:pPr>
-      <w:hyperlink w:anchor="_Toc240204967" w:history="1">
-        <w:r>
-          <w:rPr>
-            <w:rStyle w:val="Hyperlink"/>
-            <w:rFonts w:cs="Times New Roman"/>
-            <w:noProof/>
-          </w:rPr>
-          <w:t>14 YÊU CẦU HỌC THUẬT VÀ KỸ THUẬT</w:t>
-        </w:r>
-        <w:r>
-          <w:rPr>
-            <w:noProof/>
-            <w:webHidden/>
-          </w:rPr>
-          <w:tab/>
-        </w:r>
-        <w:r>
-          <w:rPr>
-            <w:noProof/>
-            <w:webHidden/>
-          </w:rPr>
-          <w:fldChar w:fldCharType="begin"/>
-        </w:r>
-        <w:r>
-          <w:rPr>
-            <w:noProof/>
-            <w:webHidden/>
-          </w:rPr>
-          <w:instrText xml:space="preserve"> PAGEREF _Toc240204967 \h </w:instrText>
-        </w:r>
-        <w:r>
-          <w:rPr>
-            <w:noProof/>
-            <w:webHidden/>
-          </w:rPr>
-        </w:r>
-        <w:r>
-          <w:rPr>
-            <w:noProof/>
-            <w:webHidden/>
-          </w:rPr>
-          <w:fldChar w:fldCharType="separate"/>
-        </w:r>
-        <w:r>
-          <w:rPr>
-            <w:noProof/>
-            <w:webHidden/>
-          </w:rPr>
-          <w:t>18</w:t>
-        </w:r>
-        <w:r>
-          <w:rPr>
-            <w:noProof/>
-            <w:webHidden/>
-          </w:rPr>
-          <w:fldChar w:fldCharType="end"/>
-        </w:r>
-      </w:hyperlink>
-    </w:p>
-    <w:p>
-      <w:pPr>
-        <w:pStyle w:val="TOC1"/>
-        <w:tabs>
-          <w:tab w:val="right" w:leader="dot" w:pos="9232"/>
-        </w:tabs>
-        <w:rPr>
-          <w:rFonts w:asciiTheme="minorHAnsi" w:hAnsiTheme="minorHAnsi"/>
-          <w:noProof/>
-          <w:kern w:val="2"/>
-          <w:sz w:val="24"/>
-          <w:szCs w:val="24"/>
-          <w:lang w:val="vi-VN" w:eastAsia="vi-VN"/>
-          <w14:ligatures w14:val="standardContextual"/>
-        </w:rPr>
-      </w:pPr>
-      <w:hyperlink w:anchor="_Toc240204968" w:history="1">
-        <w:r>
-          <w:rPr>
-            <w:rStyle w:val="Hyperlink"/>
-            <w:rFonts w:cs="Times New Roman"/>
-            <w:noProof/>
-          </w:rPr>
-          <w:t>15 XÁC NHẬN ĐỀ CƯƠNG</w:t>
-        </w:r>
-        <w:r>
-          <w:rPr>
-            <w:noProof/>
-            <w:webHidden/>
-          </w:rPr>
-          <w:tab/>
-        </w:r>
-        <w:r>
-          <w:rPr>
-            <w:noProof/>
-            <w:webHidden/>
-          </w:rPr>
-          <w:fldChar w:fldCharType="begin"/>
-        </w:r>
-        <w:r>
-          <w:rPr>
-            <w:noProof/>
-            <w:webHidden/>
-          </w:rPr>
-          <w:instrText xml:space="preserve"> PAGEREF _Toc240204968 \h </w:instrText>
-        </w:r>
-        <w:r>
-          <w:rPr>
-            <w:noProof/>
-            <w:webHidden/>
-          </w:rPr>
-        </w:r>
-        <w:r>
-          <w:rPr>
-            <w:noProof/>
-            <w:webHidden/>
-          </w:rPr>
-          <w:fldChar w:fldCharType="separate"/>
-        </w:r>
-        <w:r>
-          <w:rPr>
-            <w:noProof/>
-            <w:webHidden/>
-          </w:rPr>
-          <w:t>19</w:t>
-        </w:r>
-        <w:r>
-          <w:rPr>
-            <w:noProof/>
-            <w:webHidden/>
-          </w:rPr>
-          <w:fldChar w:fldCharType="end"/>
-        </w:r>
-      </w:hyperlink>
-    </w:p>
-    <w:p>
+      <w:r>
+        <w:t xml:space="preserve">Bấm chuột phải vào đây rồi chọn "Update Field" để hiện mục lục.</w:t>
+      </w:r>
       <w:r>
         <w:fldChar w:fldCharType="end"/>
       </w:r>
@@ -2957,7 +676,6 @@
           <w:szCs w:val="26"/>
         </w:rPr>
       </w:pPr>
-      <w:bookmarkStart w:id="1" w:name="_Toc240204941"/>
       <w:r>
         <w:rPr>
           <w:rFonts w:ascii="Times New Roman" w:hAnsi="Times New Roman" w:cs="Times New Roman"/>
@@ -2966,7 +684,6 @@
         </w:rPr>
         <w:t>1 THÔNG TIN CHUNG</w:t>
       </w:r>
-      <w:bookmarkEnd w:id="1"/>
     </w:p>
     <w:p>
       <w:pPr>
@@ -2983,7 +700,7 @@
           <w:color w:val="000000"/>
           <w:szCs w:val="26"/>
         </w:rPr>
-        <w:t>Tên đề tài: Learning Portal – Cổng học trực tuyến</w:t>
+        <w:t xml:space="preserve">Tên đề tài: Learning Portal – Cổng học trực tuyến</w:t>
       </w:r>
     </w:p>
     <w:p>
@@ -3055,7 +772,7 @@
           <w:color w:val="000000"/>
           <w:szCs w:val="26"/>
         </w:rPr>
-        <w:t>Sinh viên hoặc nhóm sinh viên: Nhóm 1 – Nguyễn Thế Sang (N23DVCN050), Nguyễn Thanh Sang (N23DVCN051), Thái Thanh Vũ (N23DVCN064).</w:t>
+        <w:t xml:space="preserve">Sinh viên hoặc nhóm sinh viên: Nhóm 1 – Nguyễn Thế Sang, Nguyễn Thanh Sang, Thái Thanh Vũ.</w:t>
       </w:r>
     </w:p>
     <w:p>
@@ -3107,7 +824,7 @@
           <w:color w:val="000000"/>
           <w:szCs w:val="26"/>
         </w:rPr>
-        <w:t>11 tuần, từ ngày 15/08/2026 đến ngày 24/10/2026.</w:t>
+        <w:t xml:space="preserve">11 tuần, từ ngày 15/08/2026 đến ngày 24/10/2026.</w:t>
       </w:r>
     </w:p>
     <w:p>
@@ -3403,7 +1120,7 @@
               <w:rPr>
                 <w:sz w:val="24"/>
               </w:rPr>
-              <w:t>Nhóm trưởng, Fullstack. Phân tích – thiết kế hệ thống và phân chia công việc. Backend: xác thực, phân quyền ba vai trò, cổng kiểm tra quyền xem nội dung, ghi danh, thanh toán và cấp chứng nhận, trợ lý AI. Kiểm thử tự động, quy trình CI và triển khai.</w:t>
+              <w:t xml:space="preserve">Nhóm trưởng, Fullstack. Phân tích – thiết kế hệ thống và phân chia công việc. Backend: xác thực, phân quyền ba vai trò, cổng kiểm tra quyền xem nội dung, ghi danh, thanh toán và cấp chứng nhận, trợ lý AI. Kiểm thử tự động, quy trình CI và triển khai.</w:t>
             </w:r>
           </w:p>
         </w:tc>
@@ -3546,7 +1263,7 @@
               <w:rPr>
                 <w:sz w:val="24"/>
               </w:rPr>
-              <w:t>Fullstack. Backend: khóa học, bài học, danh mục, đơn vị đào tạo, bài kiểm tra trắc nghiệm chấm tự động, ví coin và đơn hàng, các API khu quản trị. Frontend khu quản trị và khu giảng viên. Tài liệu API (OpenAPI).</w:t>
+              <w:t xml:space="preserve">Fullstack. Backend: khóa học, bài học, danh mục, đơn vị đào tạo, bài kiểm tra trắc nghiệm chấm tự động, ví coin và đơn hàng, các API khu quản trị. Frontend khu quản trị và khu giảng viên. Tài liệu API (OpenAPI).</w:t>
             </w:r>
           </w:p>
         </w:tc>
@@ -3689,7 +1406,7 @@
               <w:rPr>
                 <w:sz w:val="24"/>
               </w:rPr>
-              <w:t>Frontend. Giao diện khu học viên: trang chủ, danh sách và chi tiết khóa học, trang học bài, trang làm bài kiểm tra, tra cứu chứng nhận, hồ sơ cá nhân. Giao diện đáp ứng trên điện thoại; kiểm thử giao diện.</w:t>
+              <w:t xml:space="preserve">Frontend. Giao diện khu học viên: trang chủ, danh sách và chi tiết khóa học, trang học bài, trang làm bài kiểm tra, tra cứu chứng nhận, hồ sơ cá nhân. Giao diện đáp ứng trên điện thoại; kiểm thử giao diện.</w:t>
             </w:r>
           </w:p>
         </w:tc>
@@ -3750,7 +1467,6 @@
           <w:szCs w:val="26"/>
         </w:rPr>
       </w:pPr>
-      <w:bookmarkStart w:id="2" w:name="_Toc240204942"/>
       <w:r>
         <w:rPr>
           <w:rFonts w:ascii="Times New Roman" w:hAnsi="Times New Roman" w:cs="Times New Roman"/>
@@ -3758,41 +1474,8 @@
           <w:szCs w:val="26"/>
         </w:rPr>
         <w:lastRenderedPageBreak/>
-        <w:t>2 LÝ DO CH</w:t>
+        <w:t>2 LÝ DO CHỌN ĐỀ TÀI</w:t>
       </w:r>
-      <w:r>
-        <w:rPr>
-          <w:rFonts w:ascii="Times New Roman" w:hAnsi="Times New Roman" w:cs="Times New Roman"/>
-          <w:sz w:val="26"/>
-          <w:szCs w:val="26"/>
-        </w:rPr>
-        <w:t>Ọ</w:t>
-      </w:r>
-      <w:r>
-        <w:rPr>
-          <w:rFonts w:ascii="Times New Roman" w:hAnsi="Times New Roman" w:cs="Times New Roman"/>
-          <w:sz w:val="26"/>
-          <w:szCs w:val="26"/>
-        </w:rPr>
-        <w:t>N Đ</w:t>
-      </w:r>
-      <w:r>
-        <w:rPr>
-          <w:rFonts w:ascii="Times New Roman" w:hAnsi="Times New Roman" w:cs="Times New Roman"/>
-          <w:sz w:val="26"/>
-          <w:szCs w:val="26"/>
-        </w:rPr>
-        <w:t>Ề</w:t>
-      </w:r>
-      <w:r>
-        <w:rPr>
-          <w:rFonts w:ascii="Times New Roman" w:hAnsi="Times New Roman" w:cs="Times New Roman"/>
-          <w:sz w:val="26"/>
-          <w:szCs w:val="26"/>
-        </w:rPr>
-        <w:t xml:space="preserve"> TÀI</w:t>
-      </w:r>
-      <w:bookmarkEnd w:id="2"/>
     </w:p>
     <w:p>
       <w:pPr>
@@ -3844,15 +1527,7 @@
           <w:color w:val="000000"/>
           <w:szCs w:val="26"/>
         </w:rPr>
-        <w:t>Cách làm này bộc lộ ba hạn chế. Thứ nhất là không kiểm soát được quyền xem: một liên kết video bị chia sẻ ra ngoài thì bất kỳ ai cũng mở được, kể cả người chưa ghi danh hay chưa đóng học phí. Thứ hai là dữ liệu phân mảnh: tiến độ học, điểm kiểm tra và tình trạng thanh toán nằm ở ba nơi khác nhau nên không tổng hợp được thành báo cáo, người quản lý phải đối chiếu bằng tay. Thứ ba là chứng nhận không xác minh được: người học chỉ nhận một tệp ảnh, còn nhà tuyển dụng cầm tờ giấy in ra thì không có cách nào kiểm</w:t>
-      </w:r>
-      <w:r>
-        <w:rPr>
-          <w:rFonts w:eastAsia="Times New Roman" w:cs="Times New Roman"/>
-          <w:color w:val="000000"/>
-          <w:szCs w:val="26"/>
-        </w:rPr>
-        <w:t xml:space="preserve"> chứng.</w:t>
+        <w:t>Cách làm này bộc lộ ba hạn chế. Thứ nhất là không kiểm soát được quyền xem: một liên kết video bị chia sẻ ra ngoài thì bất kỳ ai cũng mở được, kể cả người chưa ghi danh hay chưa đóng học phí. Thứ hai là dữ liệu phân mảnh: tiến độ học, điểm kiểm tra và tình trạng thanh toán nằm ở ba nơi khác nhau nên không tổng hợp được thành báo cáo, người quản lý phải đối chiếu bằng tay. Thứ ba là chứng nhận không xác minh được: người học chỉ nhận một tệp ảnh, còn nhà tuyển dụng cầm tờ giấy in ra thì không có cách nào kiểm chứng.</w:t>
       </w:r>
     </w:p>
     <w:p>
@@ -3918,7 +1593,6 @@
           <w:szCs w:val="26"/>
         </w:rPr>
       </w:pPr>
-      <w:bookmarkStart w:id="3" w:name="_Toc240204943"/>
       <w:r>
         <w:rPr>
           <w:rFonts w:ascii="Times New Roman" w:hAnsi="Times New Roman" w:cs="Times New Roman"/>
@@ -3926,57 +1600,8 @@
           <w:szCs w:val="26"/>
         </w:rPr>
         <w:lastRenderedPageBreak/>
-        <w:t>3 M</w:t>
+        <w:t>3 MỤC TIÊU CỦA ĐỀ TÀI</w:t>
       </w:r>
-      <w:r>
-        <w:rPr>
-          <w:rFonts w:ascii="Times New Roman" w:hAnsi="Times New Roman" w:cs="Times New Roman"/>
-          <w:sz w:val="26"/>
-          <w:szCs w:val="26"/>
-        </w:rPr>
-        <w:t>Ụ</w:t>
-      </w:r>
-      <w:r>
-        <w:rPr>
-          <w:rFonts w:ascii="Times New Roman" w:hAnsi="Times New Roman" w:cs="Times New Roman"/>
-          <w:sz w:val="26"/>
-          <w:szCs w:val="26"/>
-        </w:rPr>
-        <w:t>C TIÊU C</w:t>
-      </w:r>
-      <w:r>
-        <w:rPr>
-          <w:rFonts w:ascii="Times New Roman" w:hAnsi="Times New Roman" w:cs="Times New Roman"/>
-          <w:sz w:val="26"/>
-          <w:szCs w:val="26"/>
-        </w:rPr>
-        <w:t>Ủ</w:t>
-      </w:r>
-      <w:r>
-        <w:rPr>
-          <w:rFonts w:ascii="Times New Roman" w:hAnsi="Times New Roman" w:cs="Times New Roman"/>
-          <w:sz w:val="26"/>
-          <w:szCs w:val="26"/>
-        </w:rPr>
-        <w:t>A Đ</w:t>
-      </w:r>
-      <w:r>
-        <w:rPr>
-          <w:rFonts w:ascii="Times New Roman" w:hAnsi="Times New Roman" w:cs="Times New Roman"/>
-          <w:sz w:val="26"/>
-          <w:szCs w:val="26"/>
-        </w:rPr>
-        <w:t>Ề</w:t>
-      </w:r>
-      <w:r>
-        <w:rPr>
-          <w:rFonts w:ascii="Times New Roman" w:hAnsi="Times New Roman" w:cs="Times New Roman"/>
-          <w:sz w:val="26"/>
-          <w:szCs w:val="26"/>
-        </w:rPr>
-        <w:t xml:space="preserve"> TÀI</w:t>
-      </w:r>
-      <w:bookmarkEnd w:id="3"/>
     </w:p>
     <w:p>
       <w:pPr>
@@ -3986,38 +1611,12 @@
           <w:rFonts w:ascii="Times New Roman" w:hAnsi="Times New Roman" w:cs="Times New Roman"/>
         </w:rPr>
       </w:pPr>
-      <w:bookmarkStart w:id="4" w:name="_Toc240204944"/>
       <w:r>
         <w:rPr>
           <w:rFonts w:ascii="Times New Roman" w:hAnsi="Times New Roman" w:cs="Times New Roman"/>
         </w:rPr>
-        <w:t>3.1 M</w:t>
+        <w:t>3.1 Mục tiêu tổng quát</w:t>
       </w:r>
-      <w:r>
-        <w:rPr>
-          <w:rFonts w:ascii="Times New Roman" w:hAnsi="Times New Roman" w:cs="Times New Roman"/>
-        </w:rPr>
-        <w:t>ụ</w:t>
-      </w:r>
-      <w:r>
-        <w:rPr>
-          <w:rFonts w:ascii="Times New Roman" w:hAnsi="Times New Roman" w:cs="Times New Roman"/>
-        </w:rPr>
-        <w:t>c tiêu t</w:t>
-      </w:r>
-      <w:r>
-        <w:rPr>
-          <w:rFonts w:ascii="Times New Roman" w:hAnsi="Times New Roman" w:cs="Times New Roman"/>
-        </w:rPr>
-        <w:t>ổ</w:t>
-      </w:r>
-      <w:r>
-        <w:rPr>
-          <w:rFonts w:ascii="Times New Roman" w:hAnsi="Times New Roman" w:cs="Times New Roman"/>
-        </w:rPr>
-        <w:t>ng quát</w:t>
-      </w:r>
-      <w:bookmarkEnd w:id="4"/>
     </w:p>
     <w:p>
       <w:pPr>
@@ -4079,44 +1678,12 @@
           <w:rFonts w:ascii="Times New Roman" w:hAnsi="Times New Roman" w:cs="Times New Roman"/>
         </w:rPr>
       </w:pPr>
-      <w:bookmarkStart w:id="5" w:name="_Toc240204945"/>
       <w:r>
         <w:rPr>
           <w:rFonts w:ascii="Times New Roman" w:hAnsi="Times New Roman" w:cs="Times New Roman"/>
         </w:rPr>
-        <w:t>3.2 M</w:t>
+        <w:t>3.2 Mục tiêu cụ thể</w:t>
       </w:r>
-      <w:r>
-        <w:rPr>
-          <w:rFonts w:ascii="Times New Roman" w:hAnsi="Times New Roman" w:cs="Times New Roman"/>
-        </w:rPr>
-        <w:t>ụ</w:t>
-      </w:r>
-      <w:r>
-        <w:rPr>
-          <w:rFonts w:ascii="Times New Roman" w:hAnsi="Times New Roman" w:cs="Times New Roman"/>
-        </w:rPr>
-        <w:t>c tiêu c</w:t>
-      </w:r>
-      <w:r>
-        <w:rPr>
-          <w:rFonts w:ascii="Times New Roman" w:hAnsi="Times New Roman" w:cs="Times New Roman"/>
-        </w:rPr>
-        <w:t>ụ</w:t>
-      </w:r>
-      <w:r>
-        <w:rPr>
-          <w:rFonts w:ascii="Times New Roman" w:hAnsi="Times New Roman" w:cs="Times New Roman"/>
-        </w:rPr>
-        <w:t xml:space="preserve"> th</w:t>
-      </w:r>
-      <w:r>
-        <w:rPr>
-          <w:rFonts w:ascii="Times New Roman" w:hAnsi="Times New Roman" w:cs="Times New Roman"/>
-        </w:rPr>
-        <w:t>ể</w:t>
-      </w:r>
-      <w:bookmarkEnd w:id="5"/>
     </w:p>
     <w:p>
       <w:pPr>
@@ -4291,7 +1858,6 @@
           <w:szCs w:val="26"/>
         </w:rPr>
       </w:pPr>
-      <w:bookmarkStart w:id="6" w:name="_Toc240204946"/>
       <w:r>
         <w:rPr>
           <w:rFonts w:ascii="Times New Roman" w:hAnsi="Times New Roman" w:cs="Times New Roman"/>
@@ -4299,89 +1865,8 @@
           <w:szCs w:val="26"/>
         </w:rPr>
         <w:lastRenderedPageBreak/>
-        <w:t>4 Đ</w:t>
+        <w:t>4 ĐỐI TƯỢNG VÀ PHẠM VI THỰC HIỆN</w:t>
       </w:r>
-      <w:r>
-        <w:rPr>
-          <w:rFonts w:ascii="Times New Roman" w:hAnsi="Times New Roman" w:cs="Times New Roman"/>
-          <w:sz w:val="26"/>
-          <w:szCs w:val="26"/>
-        </w:rPr>
-        <w:t>Ố</w:t>
-      </w:r>
-      <w:r>
-        <w:rPr>
-          <w:rFonts w:ascii="Times New Roman" w:hAnsi="Times New Roman" w:cs="Times New Roman"/>
-          <w:sz w:val="26"/>
-          <w:szCs w:val="26"/>
-        </w:rPr>
-        <w:t>I TƯ</w:t>
-      </w:r>
-      <w:r>
-        <w:rPr>
-          <w:rFonts w:ascii="Times New Roman" w:hAnsi="Times New Roman" w:cs="Times New Roman"/>
-          <w:sz w:val="26"/>
-          <w:szCs w:val="26"/>
-        </w:rPr>
-        <w:t>Ợ</w:t>
-      </w:r>
-      <w:r>
-        <w:rPr>
-          <w:rFonts w:ascii="Times New Roman" w:hAnsi="Times New Roman" w:cs="Times New Roman"/>
-          <w:sz w:val="26"/>
-          <w:szCs w:val="26"/>
-        </w:rPr>
-        <w:t>NG VÀ PH</w:t>
-      </w:r>
-      <w:r>
-        <w:rPr>
-          <w:rFonts w:ascii="Times New Roman" w:hAnsi="Times New Roman" w:cs="Times New Roman"/>
-          <w:sz w:val="26"/>
-          <w:szCs w:val="26"/>
-        </w:rPr>
-        <w:t>Ạ</w:t>
-      </w:r>
-      <w:r>
-        <w:rPr>
-          <w:rFonts w:ascii="Times New Roman" w:hAnsi="Times New Roman" w:cs="Times New Roman"/>
-          <w:sz w:val="26"/>
-          <w:szCs w:val="26"/>
-        </w:rPr>
-        <w:t>M VI TH</w:t>
-      </w:r>
-      <w:r>
-        <w:rPr>
-          <w:rFonts w:ascii="Times New Roman" w:hAnsi="Times New Roman" w:cs="Times New Roman"/>
-          <w:sz w:val="26"/>
-          <w:szCs w:val="26"/>
-        </w:rPr>
-        <w:t>Ự</w:t>
-      </w:r>
-      <w:r>
-        <w:rPr>
-          <w:rFonts w:ascii="Times New Roman" w:hAnsi="Times New Roman" w:cs="Times New Roman"/>
-          <w:sz w:val="26"/>
-          <w:szCs w:val="26"/>
-        </w:rPr>
-        <w:t>C HI</w:t>
-      </w:r>
-      <w:r>
-        <w:rPr>
-          <w:rFonts w:ascii="Times New Roman" w:hAnsi="Times New Roman" w:cs="Times New Roman"/>
-          <w:sz w:val="26"/>
-          <w:szCs w:val="26"/>
-        </w:rPr>
-        <w:t>Ệ</w:t>
-      </w:r>
-      <w:r>
-        <w:rPr>
-          <w:rFonts w:ascii="Times New Roman" w:hAnsi="Times New Roman" w:cs="Times New Roman"/>
-          <w:sz w:val="26"/>
-          <w:szCs w:val="26"/>
-        </w:rPr>
-        <w:t>N</w:t>
-      </w:r>
-      <w:bookmarkEnd w:id="6"/>
     </w:p>
     <w:p>
       <w:pPr>
@@ -4391,50 +1876,12 @@
           <w:rFonts w:ascii="Times New Roman" w:hAnsi="Times New Roman" w:cs="Times New Roman"/>
         </w:rPr>
       </w:pPr>
-      <w:bookmarkStart w:id="7" w:name="_Toc240204947"/>
       <w:r>
         <w:rPr>
           <w:rFonts w:ascii="Times New Roman" w:hAnsi="Times New Roman" w:cs="Times New Roman"/>
         </w:rPr>
-        <w:t>4.1 Đ</w:t>
+        <w:t>4.1 Đối tượng nghiên cứu</w:t>
       </w:r>
-      <w:r>
-        <w:rPr>
-          <w:rFonts w:ascii="Times New Roman" w:hAnsi="Times New Roman" w:cs="Times New Roman"/>
-        </w:rPr>
-        <w:t>ố</w:t>
-      </w:r>
-      <w:r>
-        <w:rPr>
-          <w:rFonts w:ascii="Times New Roman" w:hAnsi="Times New Roman" w:cs="Times New Roman"/>
-        </w:rPr>
-        <w:t>i tư</w:t>
-      </w:r>
-      <w:r>
-        <w:rPr>
-          <w:rFonts w:ascii="Times New Roman" w:hAnsi="Times New Roman" w:cs="Times New Roman"/>
-        </w:rPr>
-        <w:t>ợ</w:t>
-      </w:r>
-      <w:r>
-        <w:rPr>
-          <w:rFonts w:ascii="Times New Roman" w:hAnsi="Times New Roman" w:cs="Times New Roman"/>
-        </w:rPr>
-        <w:t>ng nghiên c</w:t>
-      </w:r>
-      <w:r>
-        <w:rPr>
-          <w:rFonts w:ascii="Times New Roman" w:hAnsi="Times New Roman" w:cs="Times New Roman"/>
-        </w:rPr>
-        <w:t>ứ</w:t>
-      </w:r>
-      <w:r>
-        <w:rPr>
-          <w:rFonts w:ascii="Times New Roman" w:hAnsi="Times New Roman" w:cs="Times New Roman"/>
-        </w:rPr>
-        <w:t>u</w:t>
-      </w:r>
-      <w:bookmarkEnd w:id="7"/>
     </w:p>
     <w:p>
       <w:pPr>
@@ -4520,38 +1967,12 @@
           <w:rFonts w:ascii="Times New Roman" w:hAnsi="Times New Roman" w:cs="Times New Roman"/>
         </w:rPr>
       </w:pPr>
-      <w:bookmarkStart w:id="8" w:name="_Toc240204948"/>
       <w:r>
         <w:rPr>
           <w:rFonts w:ascii="Times New Roman" w:hAnsi="Times New Roman" w:cs="Times New Roman"/>
         </w:rPr>
-        <w:t>4.2 Ph</w:t>
+        <w:t>4.2 Phạm vi chức năng</w:t>
       </w:r>
-      <w:r>
-        <w:rPr>
-          <w:rFonts w:ascii="Times New Roman" w:hAnsi="Times New Roman" w:cs="Times New Roman"/>
-        </w:rPr>
-        <w:t>ạ</w:t>
-      </w:r>
-      <w:r>
-        <w:rPr>
-          <w:rFonts w:ascii="Times New Roman" w:hAnsi="Times New Roman" w:cs="Times New Roman"/>
-        </w:rPr>
-        <w:t>m vi ch</w:t>
-      </w:r>
-      <w:r>
-        <w:rPr>
-          <w:rFonts w:ascii="Times New Roman" w:hAnsi="Times New Roman" w:cs="Times New Roman"/>
-        </w:rPr>
-        <w:t>ứ</w:t>
-      </w:r>
-      <w:r>
-        <w:rPr>
-          <w:rFonts w:ascii="Times New Roman" w:hAnsi="Times New Roman" w:cs="Times New Roman"/>
-        </w:rPr>
-        <w:t>c năng</w:t>
-      </w:r>
-      <w:bookmarkEnd w:id="8"/>
     </w:p>
     <w:tbl>
       <w:tblPr>
@@ -5288,7 +2709,7 @@
                 <w:rFonts w:eastAsia="Times New Roman" w:cs="Times New Roman"/>
                 <w:szCs w:val="26"/>
               </w:rPr>
-              <w:t>Bảng điều khiển quản trị hiển thị bốn số liệu tổng quan: số tài khoản, số khóa học, số lượt ghi danh và số chứng nhận đã cấp. Biểu đồ doanh thu và phổ điểm là phần mở rộng dự kiến.</w:t>
+              <w:t xml:space="preserve">Bảng điều khiển quản trị hiển thị bốn số liệu tổng quan: số tài khoản, số khóa học, số lượt ghi danh và số chứng nhận đã cấp. Biểu đồ doanh thu và phổ điểm là phần mở rộng dự kiến.</w:t>
             </w:r>
           </w:p>
         </w:tc>
@@ -5467,50 +2888,12 @@
           <w:rFonts w:ascii="Times New Roman" w:hAnsi="Times New Roman" w:cs="Times New Roman"/>
         </w:rPr>
       </w:pPr>
-      <w:bookmarkStart w:id="9" w:name="_Toc240204949"/>
       <w:r>
         <w:rPr>
           <w:rFonts w:ascii="Times New Roman" w:hAnsi="Times New Roman" w:cs="Times New Roman"/>
         </w:rPr>
-        <w:t>4.3 Gi</w:t>
+        <w:t>4.3 Giới hạn đề tài</w:t>
       </w:r>
-      <w:r>
-        <w:rPr>
-          <w:rFonts w:ascii="Times New Roman" w:hAnsi="Times New Roman" w:cs="Times New Roman"/>
-        </w:rPr>
-        <w:t>ớ</w:t>
-      </w:r>
-      <w:r>
-        <w:rPr>
-          <w:rFonts w:ascii="Times New Roman" w:hAnsi="Times New Roman" w:cs="Times New Roman"/>
-        </w:rPr>
-        <w:t>i h</w:t>
-      </w:r>
-      <w:r>
-        <w:rPr>
-          <w:rFonts w:ascii="Times New Roman" w:hAnsi="Times New Roman" w:cs="Times New Roman"/>
-        </w:rPr>
-        <w:t>ạ</w:t>
-      </w:r>
-      <w:r>
-        <w:rPr>
-          <w:rFonts w:ascii="Times New Roman" w:hAnsi="Times New Roman" w:cs="Times New Roman"/>
-        </w:rPr>
-        <w:t>n đ</w:t>
-      </w:r>
-      <w:r>
-        <w:rPr>
-          <w:rFonts w:ascii="Times New Roman" w:hAnsi="Times New Roman" w:cs="Times New Roman"/>
-        </w:rPr>
-        <w:t>ề</w:t>
-      </w:r>
-      <w:r>
-        <w:rPr>
-          <w:rFonts w:ascii="Times New Roman" w:hAnsi="Times New Roman" w:cs="Times New Roman"/>
-        </w:rPr>
-        <w:t xml:space="preserve"> tài</w:t>
-      </w:r>
-      <w:bookmarkEnd w:id="9"/>
     </w:p>
     <w:p>
       <w:pPr>
@@ -5591,7 +2974,6 @@
           <w:szCs w:val="26"/>
         </w:rPr>
       </w:pPr>
-      <w:bookmarkStart w:id="10" w:name="_Toc240204950"/>
       <w:r>
         <w:rPr>
           <w:rFonts w:ascii="Times New Roman" w:hAnsi="Times New Roman" w:cs="Times New Roman"/>
@@ -5599,41 +2981,8 @@
           <w:szCs w:val="26"/>
         </w:rPr>
         <w:lastRenderedPageBreak/>
-        <w:t>5 KH</w:t>
+        <w:t>5 KHẢO SÁT VÀ PHÂN TÍCH YÊU CẦU</w:t>
       </w:r>
-      <w:r>
-        <w:rPr>
-          <w:rFonts w:ascii="Times New Roman" w:hAnsi="Times New Roman" w:cs="Times New Roman"/>
-          <w:sz w:val="26"/>
-          <w:szCs w:val="26"/>
-        </w:rPr>
-        <w:t>Ả</w:t>
-      </w:r>
-      <w:r>
-        <w:rPr>
-          <w:rFonts w:ascii="Times New Roman" w:hAnsi="Times New Roman" w:cs="Times New Roman"/>
-          <w:sz w:val="26"/>
-          <w:szCs w:val="26"/>
-        </w:rPr>
-        <w:t>O SÁT VÀ PHÂN TÍCH YÊU C</w:t>
-      </w:r>
-      <w:r>
-        <w:rPr>
-          <w:rFonts w:ascii="Times New Roman" w:hAnsi="Times New Roman" w:cs="Times New Roman"/>
-          <w:sz w:val="26"/>
-          <w:szCs w:val="26"/>
-        </w:rPr>
-        <w:t>Ầ</w:t>
-      </w:r>
-      <w:r>
-        <w:rPr>
-          <w:rFonts w:ascii="Times New Roman" w:hAnsi="Times New Roman" w:cs="Times New Roman"/>
-          <w:sz w:val="26"/>
-          <w:szCs w:val="26"/>
-        </w:rPr>
-        <w:t>U</w:t>
-      </w:r>
-      <w:bookmarkEnd w:id="10"/>
     </w:p>
     <w:p>
       <w:pPr>
@@ -5643,50 +2992,12 @@
           <w:rFonts w:ascii="Times New Roman" w:hAnsi="Times New Roman" w:cs="Times New Roman"/>
         </w:rPr>
       </w:pPr>
-      <w:bookmarkStart w:id="11" w:name="_Toc240204951"/>
       <w:r>
         <w:rPr>
           <w:rFonts w:ascii="Times New Roman" w:hAnsi="Times New Roman" w:cs="Times New Roman"/>
         </w:rPr>
-        <w:t>5.1 Kh</w:t>
+        <w:t>5.1 Khảo sát hiện trạng</w:t>
       </w:r>
-      <w:r>
-        <w:rPr>
-          <w:rFonts w:ascii="Times New Roman" w:hAnsi="Times New Roman" w:cs="Times New Roman"/>
-        </w:rPr>
-        <w:t>ả</w:t>
-      </w:r>
-      <w:r>
-        <w:rPr>
-          <w:rFonts w:ascii="Times New Roman" w:hAnsi="Times New Roman" w:cs="Times New Roman"/>
-        </w:rPr>
-        <w:t>o sát hi</w:t>
-      </w:r>
-      <w:r>
-        <w:rPr>
-          <w:rFonts w:ascii="Times New Roman" w:hAnsi="Times New Roman" w:cs="Times New Roman"/>
-        </w:rPr>
-        <w:t>ệ</w:t>
-      </w:r>
-      <w:r>
-        <w:rPr>
-          <w:rFonts w:ascii="Times New Roman" w:hAnsi="Times New Roman" w:cs="Times New Roman"/>
-        </w:rPr>
-        <w:t>n tr</w:t>
-      </w:r>
-      <w:r>
-        <w:rPr>
-          <w:rFonts w:ascii="Times New Roman" w:hAnsi="Times New Roman" w:cs="Times New Roman"/>
-        </w:rPr>
-        <w:t>ạ</w:t>
-      </w:r>
-      <w:r>
-        <w:rPr>
-          <w:rFonts w:ascii="Times New Roman" w:hAnsi="Times New Roman" w:cs="Times New Roman"/>
-        </w:rPr>
-        <w:t>ng</w:t>
-      </w:r>
-      <w:bookmarkEnd w:id="11"/>
     </w:p>
     <w:p>
       <w:pPr>
@@ -5765,50 +3076,12 @@
           <w:rFonts w:ascii="Times New Roman" w:hAnsi="Times New Roman" w:cs="Times New Roman"/>
         </w:rPr>
       </w:pPr>
-      <w:bookmarkStart w:id="12" w:name="_Toc240204952"/>
       <w:r>
         <w:rPr>
           <w:rFonts w:ascii="Times New Roman" w:hAnsi="Times New Roman" w:cs="Times New Roman"/>
         </w:rPr>
-        <w:t>5.2 Tác nhân c</w:t>
+        <w:t>5.2 Tác nhân của hệ thống</w:t>
       </w:r>
-      <w:r>
-        <w:rPr>
-          <w:rFonts w:ascii="Times New Roman" w:hAnsi="Times New Roman" w:cs="Times New Roman"/>
-        </w:rPr>
-        <w:t>ủ</w:t>
-      </w:r>
-      <w:r>
-        <w:rPr>
-          <w:rFonts w:ascii="Times New Roman" w:hAnsi="Times New Roman" w:cs="Times New Roman"/>
-        </w:rPr>
-        <w:t>a h</w:t>
-      </w:r>
-      <w:r>
-        <w:rPr>
-          <w:rFonts w:ascii="Times New Roman" w:hAnsi="Times New Roman" w:cs="Times New Roman"/>
-        </w:rPr>
-        <w:t>ệ</w:t>
-      </w:r>
-      <w:r>
-        <w:rPr>
-          <w:rFonts w:ascii="Times New Roman" w:hAnsi="Times New Roman" w:cs="Times New Roman"/>
-        </w:rPr>
-        <w:t xml:space="preserve"> th</w:t>
-      </w:r>
-      <w:r>
-        <w:rPr>
-          <w:rFonts w:ascii="Times New Roman" w:hAnsi="Times New Roman" w:cs="Times New Roman"/>
-        </w:rPr>
-        <w:t>ố</w:t>
-      </w:r>
-      <w:r>
-        <w:rPr>
-          <w:rFonts w:ascii="Times New Roman" w:hAnsi="Times New Roman" w:cs="Times New Roman"/>
-        </w:rPr>
-        <w:t>ng</w:t>
-      </w:r>
-      <w:bookmarkEnd w:id="12"/>
     </w:p>
     <w:tbl>
       <w:tblPr>
@@ -6473,39 +3746,13 @@
           <w:rFonts w:ascii="Times New Roman" w:hAnsi="Times New Roman" w:cs="Times New Roman"/>
         </w:rPr>
       </w:pPr>
-      <w:bookmarkStart w:id="13" w:name="_Toc240204953"/>
       <w:r>
         <w:rPr>
           <w:rFonts w:ascii="Times New Roman" w:hAnsi="Times New Roman" w:cs="Times New Roman"/>
         </w:rPr>
         <w:lastRenderedPageBreak/>
-        <w:t>5.3 Yêu c</w:t>
+        <w:t>5.3 Yêu cầu chức năng</w:t>
       </w:r>
-      <w:r>
-        <w:rPr>
-          <w:rFonts w:ascii="Times New Roman" w:hAnsi="Times New Roman" w:cs="Times New Roman"/>
-        </w:rPr>
-        <w:t>ầ</w:t>
-      </w:r>
-      <w:r>
-        <w:rPr>
-          <w:rFonts w:ascii="Times New Roman" w:hAnsi="Times New Roman" w:cs="Times New Roman"/>
-        </w:rPr>
-        <w:t>u ch</w:t>
-      </w:r>
-      <w:r>
-        <w:rPr>
-          <w:rFonts w:ascii="Times New Roman" w:hAnsi="Times New Roman" w:cs="Times New Roman"/>
-        </w:rPr>
-        <w:t>ứ</w:t>
-      </w:r>
-      <w:r>
-        <w:rPr>
-          <w:rFonts w:ascii="Times New Roman" w:hAnsi="Times New Roman" w:cs="Times New Roman"/>
-        </w:rPr>
-        <w:t>c năng</w:t>
-      </w:r>
-      <w:bookmarkEnd w:id="13"/>
     </w:p>
     <w:tbl>
       <w:tblPr>
@@ -7424,12 +4671,6 @@
                 <w:szCs w:val="26"/>
               </w:rPr>
               <w:t xml:space="preserve">Khi học viên hoàn thành khóa học và đạt bài kiểm tra, hệ thống sinh chứng nhận kèm mã tra cứu duy nhất. Khách nhập mã này </w:t>
-            </w:r>
-            <w:r>
-              <w:rPr>
-                <w:rFonts w:eastAsia="Times New Roman" w:cs="Times New Roman"/>
-                <w:szCs w:val="26"/>
-              </w:rPr>
               <w:lastRenderedPageBreak/>
               <w:t>vào trang tra cứu công khai.</w:t>
             </w:r>
@@ -7463,12 +4704,6 @@
               </w:rPr>
               <w:lastRenderedPageBreak/>
               <w:t xml:space="preserve">Trả về chứng nhận gồm tên học viên, tên khóa học và ngày cấp; nếu mã không tồn tại </w:t>
-            </w:r>
-            <w:r>
-              <w:rPr>
-                <w:rFonts w:eastAsia="Times New Roman" w:cs="Times New Roman"/>
-                <w:szCs w:val="26"/>
-              </w:rPr>
               <w:lastRenderedPageBreak/>
               <w:t>thì báo rõ là không tìm thấy.</w:t>
             </w:r>
@@ -7494,38 +4729,12 @@
           <w:rFonts w:ascii="Times New Roman" w:hAnsi="Times New Roman" w:cs="Times New Roman"/>
         </w:rPr>
       </w:pPr>
-      <w:bookmarkStart w:id="14" w:name="_Toc240204954"/>
       <w:r>
         <w:rPr>
           <w:rFonts w:ascii="Times New Roman" w:hAnsi="Times New Roman" w:cs="Times New Roman"/>
         </w:rPr>
-        <w:t>5.4 Yêu c</w:t>
+        <w:t>5.4 Yêu cầu phi chức năng</w:t>
       </w:r>
-      <w:r>
-        <w:rPr>
-          <w:rFonts w:ascii="Times New Roman" w:hAnsi="Times New Roman" w:cs="Times New Roman"/>
-        </w:rPr>
-        <w:t>ầ</w:t>
-      </w:r>
-      <w:r>
-        <w:rPr>
-          <w:rFonts w:ascii="Times New Roman" w:hAnsi="Times New Roman" w:cs="Times New Roman"/>
-        </w:rPr>
-        <w:t>u phi ch</w:t>
-      </w:r>
-      <w:r>
-        <w:rPr>
-          <w:rFonts w:ascii="Times New Roman" w:hAnsi="Times New Roman" w:cs="Times New Roman"/>
-        </w:rPr>
-        <w:t>ứ</w:t>
-      </w:r>
-      <w:r>
-        <w:rPr>
-          <w:rFonts w:ascii="Times New Roman" w:hAnsi="Times New Roman" w:cs="Times New Roman"/>
-        </w:rPr>
-        <w:t>c năng</w:t>
-      </w:r>
-      <w:bookmarkEnd w:id="14"/>
     </w:p>
     <w:p>
       <w:pPr>
@@ -7649,7 +4858,6 @@
           <w:szCs w:val="26"/>
         </w:rPr>
       </w:pPr>
-      <w:bookmarkStart w:id="15" w:name="_Toc240204955"/>
       <w:r>
         <w:rPr>
           <w:rFonts w:ascii="Times New Roman" w:hAnsi="Times New Roman" w:cs="Times New Roman"/>
@@ -7657,73 +4865,8 @@
           <w:szCs w:val="26"/>
         </w:rPr>
         <w:lastRenderedPageBreak/>
-        <w:t>6 PHÂN TÍCH VÀ THI</w:t>
+        <w:t>6 PHÂN TÍCH VÀ THIẾT KẾ HỆ THỐNG</w:t>
       </w:r>
-      <w:r>
-        <w:rPr>
-          <w:rFonts w:ascii="Times New Roman" w:hAnsi="Times New Roman" w:cs="Times New Roman"/>
-          <w:sz w:val="26"/>
-          <w:szCs w:val="26"/>
-        </w:rPr>
-        <w:t>Ế</w:t>
-      </w:r>
-      <w:r>
-        <w:rPr>
-          <w:rFonts w:ascii="Times New Roman" w:hAnsi="Times New Roman" w:cs="Times New Roman"/>
-          <w:sz w:val="26"/>
-          <w:szCs w:val="26"/>
-        </w:rPr>
-        <w:t>T K</w:t>
-      </w:r>
-      <w:r>
-        <w:rPr>
-          <w:rFonts w:ascii="Times New Roman" w:hAnsi="Times New Roman" w:cs="Times New Roman"/>
-          <w:sz w:val="26"/>
-          <w:szCs w:val="26"/>
-        </w:rPr>
-        <w:t>Ế</w:t>
-      </w:r>
-      <w:r>
-        <w:rPr>
-          <w:rFonts w:ascii="Times New Roman" w:hAnsi="Times New Roman" w:cs="Times New Roman"/>
-          <w:sz w:val="26"/>
-          <w:szCs w:val="26"/>
-        </w:rPr>
-        <w:t xml:space="preserve"> H</w:t>
-      </w:r>
-      <w:r>
-        <w:rPr>
-          <w:rFonts w:ascii="Times New Roman" w:hAnsi="Times New Roman" w:cs="Times New Roman"/>
-          <w:sz w:val="26"/>
-          <w:szCs w:val="26"/>
-        </w:rPr>
-        <w:t>Ệ</w:t>
-      </w:r>
-      <w:r>
-        <w:rPr>
-          <w:rFonts w:ascii="Times New Roman" w:hAnsi="Times New Roman" w:cs="Times New Roman"/>
-          <w:sz w:val="26"/>
-          <w:szCs w:val="26"/>
-        </w:rPr>
-        <w:t xml:space="preserve"> TH</w:t>
-      </w:r>
-      <w:r>
-        <w:rPr>
-          <w:rFonts w:ascii="Times New Roman" w:hAnsi="Times New Roman" w:cs="Times New Roman"/>
-          <w:sz w:val="26"/>
-          <w:szCs w:val="26"/>
-        </w:rPr>
-        <w:t>Ố</w:t>
-      </w:r>
-      <w:r>
-        <w:rPr>
-          <w:rFonts w:ascii="Times New Roman" w:hAnsi="Times New Roman" w:cs="Times New Roman"/>
-          <w:sz w:val="26"/>
-          <w:szCs w:val="26"/>
-        </w:rPr>
-        <w:t>NG</w:t>
-      </w:r>
-      <w:bookmarkEnd w:id="15"/>
     </w:p>
     <w:p>
       <w:pPr>
@@ -8897,7 +6040,6 @@
           <w:szCs w:val="26"/>
         </w:rPr>
       </w:pPr>
-      <w:bookmarkStart w:id="16" w:name="_Toc240204956"/>
       <w:r>
         <w:rPr>
           <w:rFonts w:ascii="Times New Roman" w:hAnsi="Times New Roman" w:cs="Times New Roman"/>
@@ -8905,89 +6047,8 @@
           <w:szCs w:val="26"/>
         </w:rPr>
         <w:lastRenderedPageBreak/>
-        <w:t>7 CÔNG NGH</w:t>
+        <w:t>7 CÔNG NGHỆ DỰ KIẾN SỬ DỤNG</w:t>
       </w:r>
-      <w:r>
-        <w:rPr>
-          <w:rFonts w:ascii="Times New Roman" w:hAnsi="Times New Roman" w:cs="Times New Roman"/>
-          <w:sz w:val="26"/>
-          <w:szCs w:val="26"/>
-        </w:rPr>
-        <w:t>Ệ</w:t>
-      </w:r>
-      <w:r>
-        <w:rPr>
-          <w:rFonts w:ascii="Times New Roman" w:hAnsi="Times New Roman" w:cs="Times New Roman"/>
-          <w:sz w:val="26"/>
-          <w:szCs w:val="26"/>
-        </w:rPr>
-        <w:t xml:space="preserve"> D</w:t>
-      </w:r>
-      <w:r>
-        <w:rPr>
-          <w:rFonts w:ascii="Times New Roman" w:hAnsi="Times New Roman" w:cs="Times New Roman"/>
-          <w:sz w:val="26"/>
-          <w:szCs w:val="26"/>
-        </w:rPr>
-        <w:t>Ự</w:t>
-      </w:r>
-      <w:r>
-        <w:rPr>
-          <w:rFonts w:ascii="Times New Roman" w:hAnsi="Times New Roman" w:cs="Times New Roman"/>
-          <w:sz w:val="26"/>
-          <w:szCs w:val="26"/>
-        </w:rPr>
-        <w:t xml:space="preserve"> KI</w:t>
-      </w:r>
-      <w:r>
-        <w:rPr>
-          <w:rFonts w:ascii="Times New Roman" w:hAnsi="Times New Roman" w:cs="Times New Roman"/>
-          <w:sz w:val="26"/>
-          <w:szCs w:val="26"/>
-        </w:rPr>
-        <w:t>Ế</w:t>
-      </w:r>
-      <w:r>
-        <w:rPr>
-          <w:rFonts w:ascii="Times New Roman" w:hAnsi="Times New Roman" w:cs="Times New Roman"/>
-          <w:sz w:val="26"/>
-          <w:szCs w:val="26"/>
-        </w:rPr>
-        <w:t>N S</w:t>
-      </w:r>
-      <w:r>
-        <w:rPr>
-          <w:rFonts w:ascii="Times New Roman" w:hAnsi="Times New Roman" w:cs="Times New Roman"/>
-          <w:sz w:val="26"/>
-          <w:szCs w:val="26"/>
-        </w:rPr>
-        <w:t>Ử</w:t>
-      </w:r>
-      <w:r>
-        <w:rPr>
-          <w:rFonts w:ascii="Times New Roman" w:hAnsi="Times New Roman" w:cs="Times New Roman"/>
-          <w:sz w:val="26"/>
-          <w:szCs w:val="26"/>
-        </w:rPr>
-        <w:t xml:space="preserve"> D</w:t>
-      </w:r>
-      <w:r>
-        <w:rPr>
-          <w:rFonts w:ascii="Times New Roman" w:hAnsi="Times New Roman" w:cs="Times New Roman"/>
-          <w:sz w:val="26"/>
-          <w:szCs w:val="26"/>
-        </w:rPr>
-        <w:t>Ụ</w:t>
-      </w:r>
-      <w:r>
-        <w:rPr>
-          <w:rFonts w:ascii="Times New Roman" w:hAnsi="Times New Roman" w:cs="Times New Roman"/>
-          <w:sz w:val="26"/>
-          <w:szCs w:val="26"/>
-        </w:rPr>
-        <w:t>NG</w:t>
-      </w:r>
-      <w:bookmarkEnd w:id="16"/>
     </w:p>
     <w:tbl>
       <w:tblPr>
@@ -9541,7 +6602,7 @@
                 <w:rFonts w:eastAsia="Times New Roman" w:cs="Times New Roman"/>
                 <w:szCs w:val="26"/>
               </w:rPr>
-              <w:t>Mô hình ngôn ngữ lớn gọi qua REST. Đang dùng Google Gemini (gói miễn phí); đổi sang Groq, OpenAI hoặc Claude chỉ bằng biến môi trường, không sửa mã nguồn.</w:t>
+              <w:t xml:space="preserve">Mô hình ngôn ngữ lớn gọi qua REST. Đang dùng Google Gemini (gói miễn phí); đổi sang Groq, OpenAI hoặc Claude chỉ bằng biến môi trường, không sửa mã nguồn.</w:t>
             </w:r>
           </w:p>
         </w:tc>
@@ -9571,7 +6632,7 @@
                 <w:rFonts w:eastAsia="Times New Roman" w:cs="Times New Roman"/>
                 <w:szCs w:val="26"/>
               </w:rPr>
-              <w:t>Trợ lý AI hai chế độ: hộp chat hỏi đáp nổi ở mọi trang và trợ giảng đọc được nội dung bài trong trang học. Chi tiết ở mục 12.</w:t>
+              <w:t xml:space="preserve">Trợ lý AI hai chế độ: hộp chat hỏi đáp nổi ở mọi trang và trợ giảng đọc được nội dung bài trong trang học. Chi tiết ở mục 12.</w:t>
             </w:r>
           </w:p>
         </w:tc>
@@ -9636,7 +6697,7 @@
                 <w:rFonts w:eastAsia="Times New Roman" w:cs="Times New Roman"/>
                 <w:szCs w:val="26"/>
               </w:rPr>
-              <w:t>Recharts (thư viện biểu đồ cho React)</w:t>
+              <w:t xml:space="preserve">Recharts (thư viện biểu đồ cho React)</w:t>
             </w:r>
           </w:p>
         </w:tc>
@@ -9666,7 +6727,7 @@
                 <w:rFonts w:eastAsia="Times New Roman" w:cs="Times New Roman"/>
                 <w:szCs w:val="26"/>
               </w:rPr>
-              <w:t>Vẽ biểu đồ kết quả trong bộ công cụ tính điểm GPA. Biểu đồ thống kê cho trang quản trị là phần mở rộng dự kiến.</w:t>
+              <w:t xml:space="preserve">Vẽ biểu đồ kết quả trong bộ công cụ tính điểm GPA. Biểu đồ thống kê cho trang quản trị là phần mở rộng dự kiến.</w:t>
             </w:r>
           </w:p>
         </w:tc>
@@ -9804,7 +6865,6 @@
           <w:szCs w:val="26"/>
         </w:rPr>
       </w:pPr>
-      <w:bookmarkStart w:id="17" w:name="_Toc240204957"/>
       <w:r>
         <w:rPr>
           <w:rFonts w:ascii="Times New Roman" w:hAnsi="Times New Roman" w:cs="Times New Roman"/>
@@ -9812,57 +6872,8 @@
           <w:szCs w:val="26"/>
         </w:rPr>
         <w:lastRenderedPageBreak/>
-        <w:t>8 N</w:t>
+        <w:t>8 NỘI DUNG VÀ PHƯƠNG PHÁP THỰC HIỆN</w:t>
       </w:r>
-      <w:r>
-        <w:rPr>
-          <w:rFonts w:ascii="Times New Roman" w:hAnsi="Times New Roman" w:cs="Times New Roman"/>
-          <w:sz w:val="26"/>
-          <w:szCs w:val="26"/>
-        </w:rPr>
-        <w:t>Ộ</w:t>
-      </w:r>
-      <w:r>
-        <w:rPr>
-          <w:rFonts w:ascii="Times New Roman" w:hAnsi="Times New Roman" w:cs="Times New Roman"/>
-          <w:sz w:val="26"/>
-          <w:szCs w:val="26"/>
-        </w:rPr>
-        <w:t>I DUNG VÀ PHƯƠNG PHÁP TH</w:t>
-      </w:r>
-      <w:r>
-        <w:rPr>
-          <w:rFonts w:ascii="Times New Roman" w:hAnsi="Times New Roman" w:cs="Times New Roman"/>
-          <w:sz w:val="26"/>
-          <w:szCs w:val="26"/>
-        </w:rPr>
-        <w:t>Ự</w:t>
-      </w:r>
-      <w:r>
-        <w:rPr>
-          <w:rFonts w:ascii="Times New Roman" w:hAnsi="Times New Roman" w:cs="Times New Roman"/>
-          <w:sz w:val="26"/>
-          <w:szCs w:val="26"/>
-        </w:rPr>
-        <w:t>C HI</w:t>
-      </w:r>
-      <w:r>
-        <w:rPr>
-          <w:rFonts w:ascii="Times New Roman" w:hAnsi="Times New Roman" w:cs="Times New Roman"/>
-          <w:sz w:val="26"/>
-          <w:szCs w:val="26"/>
-        </w:rPr>
-        <w:t>Ệ</w:t>
-      </w:r>
-      <w:r>
-        <w:rPr>
-          <w:rFonts w:ascii="Times New Roman" w:hAnsi="Times New Roman" w:cs="Times New Roman"/>
-          <w:sz w:val="26"/>
-          <w:szCs w:val="26"/>
-        </w:rPr>
-        <w:t>N</w:t>
-      </w:r>
-      <w:bookmarkEnd w:id="17"/>
     </w:p>
     <w:p>
       <w:pPr>
@@ -9872,50 +6883,12 @@
           <w:rFonts w:ascii="Times New Roman" w:hAnsi="Times New Roman" w:cs="Times New Roman"/>
         </w:rPr>
       </w:pPr>
-      <w:bookmarkStart w:id="18" w:name="_Toc240204958"/>
       <w:r>
         <w:rPr>
           <w:rFonts w:ascii="Times New Roman" w:hAnsi="Times New Roman" w:cs="Times New Roman"/>
         </w:rPr>
-        <w:t>8.1 Kh</w:t>
+        <w:t>8.1 Khảo sát và xác định yêu cầu</w:t>
       </w:r>
-      <w:r>
-        <w:rPr>
-          <w:rFonts w:ascii="Times New Roman" w:hAnsi="Times New Roman" w:cs="Times New Roman"/>
-        </w:rPr>
-        <w:t>ả</w:t>
-      </w:r>
-      <w:r>
-        <w:rPr>
-          <w:rFonts w:ascii="Times New Roman" w:hAnsi="Times New Roman" w:cs="Times New Roman"/>
-        </w:rPr>
-        <w:t>o sát và xác đ</w:t>
-      </w:r>
-      <w:r>
-        <w:rPr>
-          <w:rFonts w:ascii="Times New Roman" w:hAnsi="Times New Roman" w:cs="Times New Roman"/>
-        </w:rPr>
-        <w:t>ị</w:t>
-      </w:r>
-      <w:r>
-        <w:rPr>
-          <w:rFonts w:ascii="Times New Roman" w:hAnsi="Times New Roman" w:cs="Times New Roman"/>
-        </w:rPr>
-        <w:t>nh yêu c</w:t>
-      </w:r>
-      <w:r>
-        <w:rPr>
-          <w:rFonts w:ascii="Times New Roman" w:hAnsi="Times New Roman" w:cs="Times New Roman"/>
-        </w:rPr>
-        <w:t>ầ</w:t>
-      </w:r>
-      <w:r>
-        <w:rPr>
-          <w:rFonts w:ascii="Times New Roman" w:hAnsi="Times New Roman" w:cs="Times New Roman"/>
-        </w:rPr>
-        <w:t>u</w:t>
-      </w:r>
-      <w:bookmarkEnd w:id="18"/>
     </w:p>
     <w:p>
       <w:pPr>
@@ -9963,32 +6936,12 @@
           <w:rFonts w:ascii="Times New Roman" w:hAnsi="Times New Roman" w:cs="Times New Roman"/>
         </w:rPr>
       </w:pPr>
-      <w:bookmarkStart w:id="19" w:name="_Toc240204959"/>
       <w:r>
         <w:rPr>
           <w:rFonts w:ascii="Times New Roman" w:hAnsi="Times New Roman" w:cs="Times New Roman"/>
         </w:rPr>
-        <w:t>8.2 Phân tích và thi</w:t>
+        <w:t>8.2 Phân tích và thiết kế</w:t>
       </w:r>
-      <w:r>
-        <w:rPr>
-          <w:rFonts w:ascii="Times New Roman" w:hAnsi="Times New Roman" w:cs="Times New Roman"/>
-        </w:rPr>
-        <w:t>ế</w:t>
-      </w:r>
-      <w:r>
-        <w:rPr>
-          <w:rFonts w:ascii="Times New Roman" w:hAnsi="Times New Roman" w:cs="Times New Roman"/>
-        </w:rPr>
-        <w:t>t k</w:t>
-      </w:r>
-      <w:r>
-        <w:rPr>
-          <w:rFonts w:ascii="Times New Roman" w:hAnsi="Times New Roman" w:cs="Times New Roman"/>
-        </w:rPr>
-        <w:t>ế</w:t>
-      </w:r>
-      <w:bookmarkEnd w:id="19"/>
     </w:p>
     <w:p>
       <w:pPr>
@@ -10036,50 +6989,12 @@
           <w:rFonts w:ascii="Times New Roman" w:hAnsi="Times New Roman" w:cs="Times New Roman"/>
         </w:rPr>
       </w:pPr>
-      <w:bookmarkStart w:id="20" w:name="_Toc240204960"/>
       <w:r>
         <w:rPr>
           <w:rFonts w:ascii="Times New Roman" w:hAnsi="Times New Roman" w:cs="Times New Roman"/>
         </w:rPr>
-        <w:t>8.3 Xây d</w:t>
+        <w:t>8.3 Xây dựng hệ thống</w:t>
       </w:r>
-      <w:r>
-        <w:rPr>
-          <w:rFonts w:ascii="Times New Roman" w:hAnsi="Times New Roman" w:cs="Times New Roman"/>
-        </w:rPr>
-        <w:t>ự</w:t>
-      </w:r>
-      <w:r>
-        <w:rPr>
-          <w:rFonts w:ascii="Times New Roman" w:hAnsi="Times New Roman" w:cs="Times New Roman"/>
-        </w:rPr>
-        <w:t>ng h</w:t>
-      </w:r>
-      <w:r>
-        <w:rPr>
-          <w:rFonts w:ascii="Times New Roman" w:hAnsi="Times New Roman" w:cs="Times New Roman"/>
-        </w:rPr>
-        <w:t>ệ</w:t>
-      </w:r>
-      <w:r>
-        <w:rPr>
-          <w:rFonts w:ascii="Times New Roman" w:hAnsi="Times New Roman" w:cs="Times New Roman"/>
-        </w:rPr>
-        <w:t xml:space="preserve"> th</w:t>
-      </w:r>
-      <w:r>
-        <w:rPr>
-          <w:rFonts w:ascii="Times New Roman" w:hAnsi="Times New Roman" w:cs="Times New Roman"/>
-        </w:rPr>
-        <w:t>ố</w:t>
-      </w:r>
-      <w:r>
-        <w:rPr>
-          <w:rFonts w:ascii="Times New Roman" w:hAnsi="Times New Roman" w:cs="Times New Roman"/>
-        </w:rPr>
-        <w:t>ng</w:t>
-      </w:r>
-      <w:bookmarkEnd w:id="20"/>
     </w:p>
     <w:p>
       <w:pPr>
@@ -10127,50 +7042,12 @@
           <w:rFonts w:ascii="Times New Roman" w:hAnsi="Times New Roman" w:cs="Times New Roman"/>
         </w:rPr>
       </w:pPr>
-      <w:bookmarkStart w:id="21" w:name="_Toc240204961"/>
       <w:r>
         <w:rPr>
           <w:rFonts w:ascii="Times New Roman" w:hAnsi="Times New Roman" w:cs="Times New Roman"/>
         </w:rPr>
-        <w:t>8.4 Ki</w:t>
+        <w:t>8.4 Kiểm thử và hoàn thiện</w:t>
       </w:r>
-      <w:r>
-        <w:rPr>
-          <w:rFonts w:ascii="Times New Roman" w:hAnsi="Times New Roman" w:cs="Times New Roman"/>
-        </w:rPr>
-        <w:t>ể</w:t>
-      </w:r>
-      <w:r>
-        <w:rPr>
-          <w:rFonts w:ascii="Times New Roman" w:hAnsi="Times New Roman" w:cs="Times New Roman"/>
-        </w:rPr>
-        <w:t>m th</w:t>
-      </w:r>
-      <w:r>
-        <w:rPr>
-          <w:rFonts w:ascii="Times New Roman" w:hAnsi="Times New Roman" w:cs="Times New Roman"/>
-        </w:rPr>
-        <w:t>ử</w:t>
-      </w:r>
-      <w:r>
-        <w:rPr>
-          <w:rFonts w:ascii="Times New Roman" w:hAnsi="Times New Roman" w:cs="Times New Roman"/>
-        </w:rPr>
-        <w:t xml:space="preserve"> và hoàn thi</w:t>
-      </w:r>
-      <w:r>
-        <w:rPr>
-          <w:rFonts w:ascii="Times New Roman" w:hAnsi="Times New Roman" w:cs="Times New Roman"/>
-        </w:rPr>
-        <w:t>ệ</w:t>
-      </w:r>
-      <w:r>
-        <w:rPr>
-          <w:rFonts w:ascii="Times New Roman" w:hAnsi="Times New Roman" w:cs="Times New Roman"/>
-        </w:rPr>
-        <w:t>n</w:t>
-      </w:r>
-      <w:bookmarkEnd w:id="21"/>
     </w:p>
     <w:p>
       <w:pPr>
@@ -10237,7 +7114,6 @@
           <w:szCs w:val="26"/>
         </w:rPr>
       </w:pPr>
-      <w:bookmarkStart w:id="22" w:name="_Toc240204962"/>
       <w:r>
         <w:rPr>
           <w:rFonts w:ascii="Times New Roman" w:hAnsi="Times New Roman" w:cs="Times New Roman"/>
@@ -10245,73 +7121,8 @@
           <w:szCs w:val="26"/>
         </w:rPr>
         <w:lastRenderedPageBreak/>
-        <w:t>9 K</w:t>
+        <w:t>9 KẾ HOẠCH THỰC HIỆN</w:t>
       </w:r>
-      <w:r>
-        <w:rPr>
-          <w:rFonts w:ascii="Times New Roman" w:hAnsi="Times New Roman" w:cs="Times New Roman"/>
-          <w:sz w:val="26"/>
-          <w:szCs w:val="26"/>
-        </w:rPr>
-        <w:t>Ế</w:t>
-      </w:r>
-      <w:r>
-        <w:rPr>
-          <w:rFonts w:ascii="Times New Roman" w:hAnsi="Times New Roman" w:cs="Times New Roman"/>
-          <w:sz w:val="26"/>
-          <w:szCs w:val="26"/>
-        </w:rPr>
-        <w:t xml:space="preserve"> HO</w:t>
-      </w:r>
-      <w:r>
-        <w:rPr>
-          <w:rFonts w:ascii="Times New Roman" w:hAnsi="Times New Roman" w:cs="Times New Roman"/>
-          <w:sz w:val="26"/>
-          <w:szCs w:val="26"/>
-        </w:rPr>
-        <w:t>Ạ</w:t>
-      </w:r>
-      <w:r>
-        <w:rPr>
-          <w:rFonts w:ascii="Times New Roman" w:hAnsi="Times New Roman" w:cs="Times New Roman"/>
-          <w:sz w:val="26"/>
-          <w:szCs w:val="26"/>
-        </w:rPr>
-        <w:t>CH TH</w:t>
-      </w:r>
-      <w:r>
-        <w:rPr>
-          <w:rFonts w:ascii="Times New Roman" w:hAnsi="Times New Roman" w:cs="Times New Roman"/>
-          <w:sz w:val="26"/>
-          <w:szCs w:val="26"/>
-        </w:rPr>
-        <w:t>Ự</w:t>
-      </w:r>
-      <w:r>
-        <w:rPr>
-          <w:rFonts w:ascii="Times New Roman" w:hAnsi="Times New Roman" w:cs="Times New Roman"/>
-          <w:sz w:val="26"/>
-          <w:szCs w:val="26"/>
-        </w:rPr>
-        <w:t>C HI</w:t>
-      </w:r>
-      <w:r>
-        <w:rPr>
-          <w:rFonts w:ascii="Times New Roman" w:hAnsi="Times New Roman" w:cs="Times New Roman"/>
-          <w:sz w:val="26"/>
-          <w:szCs w:val="26"/>
-        </w:rPr>
-        <w:t>Ệ</w:t>
-      </w:r>
-      <w:r>
-        <w:rPr>
-          <w:rFonts w:ascii="Times New Roman" w:hAnsi="Times New Roman" w:cs="Times New Roman"/>
-          <w:sz w:val="26"/>
-          <w:szCs w:val="26"/>
-        </w:rPr>
-        <w:t>N</w:t>
-      </w:r>
-      <w:bookmarkEnd w:id="22"/>
     </w:p>
     <w:tbl>
       <w:tblPr>
@@ -10322,10 +7133,10 @@
         <w:tblLook w:val="04A0" w:firstRow="1" w:lastRow="0" w:firstColumn="1" w:lastColumn="0" w:noHBand="0" w:noVBand="1"/>
       </w:tblPr>
       <w:tblGrid>
-        <w:gridCol w:w="833"/>
-        <w:gridCol w:w="2994"/>
-        <w:gridCol w:w="2963"/>
-        <w:gridCol w:w="2442"/>
+        <w:gridCol w:w="834"/>
+        <w:gridCol w:w="2965"/>
+        <w:gridCol w:w="2990"/>
+        <w:gridCol w:w="2443"/>
       </w:tblGrid>
       <w:tr>
         <w:trPr>
@@ -10487,7 +7298,7 @@
                 <w:rFonts w:eastAsia="Times New Roman" w:cs="Times New Roman"/>
                 <w:szCs w:val="26"/>
               </w:rPr>
-              <w:t>1</w:t>
+              <w:t xml:space="preserve">1</w:t>
             </w:r>
           </w:p>
         </w:tc>
@@ -10517,7 +7328,7 @@
                 <w:rFonts w:eastAsia="Times New Roman" w:cs="Times New Roman"/>
                 <w:szCs w:val="26"/>
               </w:rPr>
-              <w:t>Khảo sát bài toán; chốt phạm vi và danh sách chức năng. Phân công: Cả nhóm khảo sát; Thế Sang tổng hợp đề cương; Thanh Sang liệt kê chức năng; Thanh Vũ khảo sát giao diện các nền tảng tương tự.</w:t>
+              <w:t xml:space="preserve">Khảo sát bài toán; chốt phạm vi và danh sách chức năng. Phân công: Cả nhóm khảo sát; Thế Sang tổng hợp đề cương; Thanh Sang liệt kê chức năng; Thanh Vũ khảo sát giao diện các nền tảng tương tự.</w:t>
             </w:r>
           </w:p>
         </w:tc>
@@ -10547,7 +7358,7 @@
                 <w:rFonts w:eastAsia="Times New Roman" w:cs="Times New Roman"/>
                 <w:szCs w:val="26"/>
               </w:rPr>
-              <w:t>Đề cương; danh sách nhóm chức năng.</w:t>
+              <w:t xml:space="preserve">Đề cương; danh sách nhóm chức năng.</w:t>
             </w:r>
           </w:p>
         </w:tc>
@@ -10572,6 +7383,13 @@
                 <w:szCs w:val="26"/>
               </w:rPr>
             </w:pPr>
+            <w:r>
+              <w:rPr>
+                <w:rFonts w:eastAsia="Times New Roman" w:cs="Times New Roman"/>
+                <w:szCs w:val="26"/>
+              </w:rPr>
+              <w:t xml:space="preserve"/>
+            </w:r>
           </w:p>
         </w:tc>
       </w:tr>
@@ -10605,7 +7423,7 @@
                 <w:rFonts w:eastAsia="Times New Roman" w:cs="Times New Roman"/>
                 <w:szCs w:val="26"/>
               </w:rPr>
-              <w:t>2</w:t>
+              <w:t xml:space="preserve">2</w:t>
             </w:r>
           </w:p>
         </w:tc>
@@ -10635,7 +7453,7 @@
                 <w:rFonts w:eastAsia="Times New Roman" w:cs="Times New Roman"/>
                 <w:szCs w:val="26"/>
               </w:rPr>
-              <w:t>Phân tích yêu cầu; xác định tác nhân và đặc tả các chức năng F01 – F05. Phân công: Thế Sang viết đặc tả chức năng; Thanh Sang xác định tác nhân và phân quyền; Thanh Vũ mô tả luồng thao tác của học viên.</w:t>
+              <w:t xml:space="preserve">Phân tích yêu cầu; xác định tác nhân và đặc tả các chức năng F01 – F05. Phân công: Thế Sang viết đặc tả chức năng; Thanh Sang xác định tác nhân và phân quyền; Thanh Vũ mô tả luồng thao tác của học viên.</w:t>
             </w:r>
           </w:p>
         </w:tc>
@@ -10665,7 +7483,7 @@
                 <w:rFonts w:eastAsia="Times New Roman" w:cs="Times New Roman"/>
                 <w:szCs w:val="26"/>
               </w:rPr>
-              <w:t>Bảng tác nhân; bảng yêu cầu chức năng.</w:t>
+              <w:t xml:space="preserve">Bảng tác nhân; bảng yêu cầu chức năng.</w:t>
             </w:r>
           </w:p>
         </w:tc>
@@ -10690,6 +7508,13 @@
                 <w:szCs w:val="26"/>
               </w:rPr>
             </w:pPr>
+            <w:r>
+              <w:rPr>
+                <w:rFonts w:eastAsia="Times New Roman" w:cs="Times New Roman"/>
+                <w:szCs w:val="26"/>
+              </w:rPr>
+              <w:t xml:space="preserve"/>
+            </w:r>
           </w:p>
         </w:tc>
       </w:tr>
@@ -10723,7 +7548,7 @@
                 <w:rFonts w:eastAsia="Times New Roman" w:cs="Times New Roman"/>
                 <w:szCs w:val="26"/>
               </w:rPr>
-              <w:t>3</w:t>
+              <w:t xml:space="preserve">3</w:t>
             </w:r>
           </w:p>
         </w:tc>
@@ -10753,7 +7578,7 @@
                 <w:rFonts w:eastAsia="Times New Roman" w:cs="Times New Roman"/>
                 <w:szCs w:val="26"/>
               </w:rPr>
-              <w:t>Thiết kế cơ sở dữ liệu và kiến trúc hệ thống. Phân công: Thanh Sang thiết kế ERD và lược đồ CSDL; Thế Sang vẽ sơ đồ kiến trúc; Thanh Vũ chuẩn bị dữ liệu mẫu.</w:t>
+              <w:t xml:space="preserve">Thiết kế cơ sở dữ liệu và kiến trúc hệ thống. Phân công: Thanh Sang thiết kế ERD và lược đồ CSDL; Thế Sang vẽ sơ đồ kiến trúc; Thanh Vũ chuẩn bị dữ liệu mẫu.</w:t>
             </w:r>
           </w:p>
         </w:tc>
@@ -10783,7 +7608,7 @@
                 <w:rFonts w:eastAsia="Times New Roman" w:cs="Times New Roman"/>
                 <w:szCs w:val="26"/>
               </w:rPr>
-              <w:t>Sơ đồ ERD; sơ đồ kiến trúc; tệp khởi tạo cơ sở dữ liệu.</w:t>
+              <w:t xml:space="preserve">Sơ đồ ERD; sơ đồ kiến trúc; tệp khởi tạo cơ sở dữ liệu.</w:t>
             </w:r>
           </w:p>
         </w:tc>
@@ -10808,6 +7633,13 @@
                 <w:szCs w:val="26"/>
               </w:rPr>
             </w:pPr>
+            <w:r>
+              <w:rPr>
+                <w:rFonts w:eastAsia="Times New Roman" w:cs="Times New Roman"/>
+                <w:szCs w:val="26"/>
+              </w:rPr>
+              <w:t xml:space="preserve"/>
+            </w:r>
           </w:p>
         </w:tc>
       </w:tr>
@@ -10841,7 +7673,7 @@
                 <w:rFonts w:eastAsia="Times New Roman" w:cs="Times New Roman"/>
                 <w:szCs w:val="26"/>
               </w:rPr>
-              <w:t>4</w:t>
+              <w:t xml:space="preserve">4</w:t>
             </w:r>
           </w:p>
         </w:tc>
@@ -10871,7 +7703,7 @@
                 <w:rFonts w:eastAsia="Times New Roman" w:cs="Times New Roman"/>
                 <w:szCs w:val="26"/>
               </w:rPr>
-              <w:t>Thiết kế Use Case, sơ đồ hoạt động, sơ đồ tuần tự và giao diện. Phân công: Thế Sang vẽ Use Case và sơ đồ tuần tự; Thanh Sang vẽ sơ đồ hoạt động; Thanh Vũ thiết kế giao diện mẫu.</w:t>
+              <w:t xml:space="preserve">Thiết kế Use Case, sơ đồ hoạt động, sơ đồ tuần tự và giao diện. Phân công: Thế Sang vẽ Use Case và sơ đồ tuần tự; Thanh Sang vẽ sơ đồ hoạt động; Thanh Vũ thiết kế giao diện mẫu.</w:t>
             </w:r>
           </w:p>
         </w:tc>
@@ -10901,7 +7733,7 @@
                 <w:rFonts w:eastAsia="Times New Roman" w:cs="Times New Roman"/>
                 <w:szCs w:val="26"/>
               </w:rPr>
-              <w:t>Bộ sơ đồ UML; bản thiết kế các giao diện chính.</w:t>
+              <w:t xml:space="preserve">Bộ sơ đồ UML; bản thiết kế các giao diện chính.</w:t>
             </w:r>
           </w:p>
         </w:tc>
@@ -10926,6 +7758,13 @@
                 <w:szCs w:val="26"/>
               </w:rPr>
             </w:pPr>
+            <w:r>
+              <w:rPr>
+                <w:rFonts w:eastAsia="Times New Roman" w:cs="Times New Roman"/>
+                <w:szCs w:val="26"/>
+              </w:rPr>
+              <w:t xml:space="preserve"/>
+            </w:r>
           </w:p>
         </w:tc>
       </w:tr>
@@ -10959,7 +7798,7 @@
                 <w:rFonts w:eastAsia="Times New Roman" w:cs="Times New Roman"/>
                 <w:szCs w:val="26"/>
               </w:rPr>
-              <w:t>5</w:t>
+              <w:t xml:space="preserve">5</w:t>
             </w:r>
           </w:p>
         </w:tc>
@@ -10989,15 +7828,7 @@
                 <w:rFonts w:eastAsia="Times New Roman" w:cs="Times New Roman"/>
                 <w:szCs w:val="26"/>
               </w:rPr>
-              <w:t xml:space="preserve">Dựng khung dự án; tài khoản, xác minh email, đăng nhập Google, phân quyền ba vai trò. Phân công: Thế Sang làm xác thực và phân quyền; Thanh Sang dựng khung backend và CSDL; Thanh </w:t>
-            </w:r>
-            <w:r>
-              <w:rPr>
-                <w:rFonts w:eastAsia="Times New Roman" w:cs="Times New Roman"/>
-                <w:szCs w:val="26"/>
-              </w:rPr>
-              <w:lastRenderedPageBreak/>
-              <w:t>Vũ dựng khung giao diện và trang đăng nhập.</w:t>
+              <w:t xml:space="preserve">Dựng khung dự án; tài khoản, xác minh email, đăng nhập Google, phân quyền ba vai trò. Phân công: Thế Sang làm xác thực và phân quyền; Thanh Sang dựng khung backend và CSDL; Thanh Vũ dựng khung giao diện và trang đăng nhập.</w:t>
             </w:r>
           </w:p>
         </w:tc>
@@ -11027,8 +7858,7 @@
                 <w:rFonts w:eastAsia="Times New Roman" w:cs="Times New Roman"/>
                 <w:szCs w:val="26"/>
               </w:rPr>
-              <w:lastRenderedPageBreak/>
-              <w:t>Luồng đăng ký – đăng nhập chạy được.</w:t>
+              <w:t xml:space="preserve">Luồng đăng ký – đăng nhập chạy được.</w:t>
             </w:r>
           </w:p>
         </w:tc>
@@ -11053,6 +7883,13 @@
                 <w:szCs w:val="26"/>
               </w:rPr>
             </w:pPr>
+            <w:r>
+              <w:rPr>
+                <w:rFonts w:eastAsia="Times New Roman" w:cs="Times New Roman"/>
+                <w:szCs w:val="26"/>
+              </w:rPr>
+              <w:t xml:space="preserve"/>
+            </w:r>
           </w:p>
         </w:tc>
       </w:tr>
@@ -11086,7 +7923,7 @@
                 <w:rFonts w:eastAsia="Times New Roman" w:cs="Times New Roman"/>
                 <w:szCs w:val="26"/>
               </w:rPr>
-              <w:t>6</w:t>
+              <w:t xml:space="preserve">6</w:t>
             </w:r>
           </w:p>
         </w:tc>
@@ -11116,7 +7953,7 @@
                 <w:rFonts w:eastAsia="Times New Roman" w:cs="Times New Roman"/>
                 <w:szCs w:val="26"/>
               </w:rPr>
-              <w:t>Quản lý khóa học, bài học, danh mục, đơn vị đào tạo; tải tệp lên dịch vụ đám mây. Phân công: Thanh Sang làm API khóa học và bài học; Thế Sang làm tải tệp và kiểm tra dữ liệu đầu vào; Thanh Vũ làm trang danh sách và chi tiết khóa học.</w:t>
+              <w:t xml:space="preserve">Quản lý khóa học, bài học, danh mục, đơn vị đào tạo; tải tệp lên dịch vụ đám mây. Phân công: Thanh Sang làm API khóa học và bài học; Thế Sang làm tải tệp và kiểm tra dữ liệu đầu vào; Thanh Vũ làm trang danh sách và chi tiết khóa học.</w:t>
             </w:r>
           </w:p>
         </w:tc>
@@ -11146,7 +7983,7 @@
                 <w:rFonts w:eastAsia="Times New Roman" w:cs="Times New Roman"/>
                 <w:szCs w:val="26"/>
               </w:rPr>
-              <w:t>Khu quản trị nội dung dùng được.</w:t>
+              <w:t xml:space="preserve">Khu quản trị nội dung dùng được.</w:t>
             </w:r>
           </w:p>
         </w:tc>
@@ -11171,6 +8008,13 @@
                 <w:szCs w:val="26"/>
               </w:rPr>
             </w:pPr>
+            <w:r>
+              <w:rPr>
+                <w:rFonts w:eastAsia="Times New Roman" w:cs="Times New Roman"/>
+                <w:szCs w:val="26"/>
+              </w:rPr>
+              <w:t xml:space="preserve"/>
+            </w:r>
           </w:p>
         </w:tc>
       </w:tr>
@@ -11204,7 +8048,7 @@
                 <w:rFonts w:eastAsia="Times New Roman" w:cs="Times New Roman"/>
                 <w:szCs w:val="26"/>
               </w:rPr>
-              <w:t>7</w:t>
+              <w:t xml:space="preserve">7</w:t>
             </w:r>
           </w:p>
         </w:tc>
@@ -11234,7 +8078,7 @@
                 <w:rFonts w:eastAsia="Times New Roman" w:cs="Times New Roman"/>
                 <w:szCs w:val="26"/>
               </w:rPr>
-              <w:t>Ghi danh, cổng kiểm tra quyền xem nội dung, theo dõi tiến độ học. Phân công: Thế Sang làm cổng kiểm tra quyền xem nội dung; Thanh Sang làm ghi danh và tiến độ; Thanh Vũ làm trang học bài.</w:t>
+              <w:t xml:space="preserve">Ghi danh, cổng kiểm tra quyền xem nội dung, theo dõi tiến độ học. Phân công: Thế Sang làm cổng kiểm tra quyền xem nội dung; Thanh Sang làm ghi danh và tiến độ; Thanh Vũ làm trang học bài.</w:t>
             </w:r>
           </w:p>
         </w:tc>
@@ -11264,7 +8108,7 @@
                 <w:rFonts w:eastAsia="Times New Roman" w:cs="Times New Roman"/>
                 <w:szCs w:val="26"/>
               </w:rPr>
-              <w:t>Luồng học bài hoàn chỉnh.</w:t>
+              <w:t xml:space="preserve">Luồng học bài hoàn chỉnh.</w:t>
             </w:r>
           </w:p>
         </w:tc>
@@ -11289,6 +8133,13 @@
                 <w:szCs w:val="26"/>
               </w:rPr>
             </w:pPr>
+            <w:r>
+              <w:rPr>
+                <w:rFonts w:eastAsia="Times New Roman" w:cs="Times New Roman"/>
+                <w:szCs w:val="26"/>
+              </w:rPr>
+              <w:t xml:space="preserve"/>
+            </w:r>
           </w:p>
         </w:tc>
       </w:tr>
@@ -11322,7 +8173,7 @@
                 <w:rFonts w:eastAsia="Times New Roman" w:cs="Times New Roman"/>
                 <w:szCs w:val="26"/>
               </w:rPr>
-              <w:t>8</w:t>
+              <w:t xml:space="preserve">8</w:t>
             </w:r>
           </w:p>
         </w:tc>
@@ -11352,7 +8203,7 @@
                 <w:rFonts w:eastAsia="Times New Roman" w:cs="Times New Roman"/>
                 <w:szCs w:val="26"/>
               </w:rPr>
-              <w:t>Bài kiểm tra trắc nghiệm chấm tự động; cấp và tra cứu chứng nhận. Phân công: Thanh Sang làm ngân hàng câu hỏi và chấm điểm; Thế Sang làm sinh và tra cứu chứng nhận; Thanh Vũ làm giao diện làm bài và trang tra cứu.</w:t>
+              <w:t xml:space="preserve">Bài kiểm tra trắc nghiệm chấm tự động; cấp và tra cứu chứng nhận. Phân công: Thanh Sang làm ngân hàng câu hỏi và chấm điểm; Thế Sang làm sinh và tra cứu chứng nhận; Thanh Vũ làm giao diện làm bài và trang tra cứu.</w:t>
             </w:r>
           </w:p>
         </w:tc>
@@ -11382,7 +8233,7 @@
                 <w:rFonts w:eastAsia="Times New Roman" w:cs="Times New Roman"/>
                 <w:szCs w:val="26"/>
               </w:rPr>
-              <w:t>Chức năng kiểm tra và chứng nhận có mã tra cứu.</w:t>
+              <w:t xml:space="preserve">Chức năng kiểm tra và chứng nhận có mã tra cứu.</w:t>
             </w:r>
           </w:p>
         </w:tc>
@@ -11407,6 +8258,13 @@
                 <w:szCs w:val="26"/>
               </w:rPr>
             </w:pPr>
+            <w:r>
+              <w:rPr>
+                <w:rFonts w:eastAsia="Times New Roman" w:cs="Times New Roman"/>
+                <w:szCs w:val="26"/>
+              </w:rPr>
+              <w:t xml:space="preserve"/>
+            </w:r>
           </w:p>
         </w:tc>
       </w:tr>
@@ -11440,7 +8298,7 @@
                 <w:rFonts w:eastAsia="Times New Roman" w:cs="Times New Roman"/>
                 <w:szCs w:val="26"/>
               </w:rPr>
-              <w:t>9</w:t>
+              <w:t xml:space="preserve">9</w:t>
             </w:r>
           </w:p>
         </w:tc>
@@ -11470,7 +8328,7 @@
                 <w:rFonts w:eastAsia="Times New Roman" w:cs="Times New Roman"/>
                 <w:szCs w:val="26"/>
               </w:rPr>
-              <w:t>Thanh toán chuyển khoản kèm mã VietQR, ví coin, đơn hàng; thống kê quản trị. Phân công: Thế Sang làm đơn hàng và duyệt thanh toán; Thanh Sang làm ví coin và sổ cái; Thanh Vũ làm giao diện thanh toán và bảng điều khiển.</w:t>
+              <w:t xml:space="preserve">Thanh toán chuyển khoản kèm mã VietQR, ví coin, đơn hàng; thống kê quản trị. Phân công: Thế Sang làm đơn hàng và duyệt thanh toán; Thanh Sang làm ví coin và sổ cái; Thanh Vũ làm giao diện thanh toán và bảng điều khiển.</w:t>
             </w:r>
           </w:p>
         </w:tc>
@@ -11500,7 +8358,7 @@
                 <w:rFonts w:eastAsia="Times New Roman" w:cs="Times New Roman"/>
                 <w:szCs w:val="26"/>
               </w:rPr>
-              <w:t>Luồng thanh toán và bảng điều khiển quản trị.</w:t>
+              <w:t xml:space="preserve">Luồng thanh toán và bảng điều khiển quản trị.</w:t>
             </w:r>
           </w:p>
         </w:tc>
@@ -11525,6 +8383,13 @@
                 <w:szCs w:val="26"/>
               </w:rPr>
             </w:pPr>
+            <w:r>
+              <w:rPr>
+                <w:rFonts w:eastAsia="Times New Roman" w:cs="Times New Roman"/>
+                <w:szCs w:val="26"/>
+              </w:rPr>
+              <w:t xml:space="preserve"/>
+            </w:r>
           </w:p>
         </w:tc>
       </w:tr>
@@ -11558,8 +8423,7 @@
                 <w:rFonts w:eastAsia="Times New Roman" w:cs="Times New Roman"/>
                 <w:szCs w:val="26"/>
               </w:rPr>
-              <w:lastRenderedPageBreak/>
-              <w:t>10</w:t>
+              <w:t xml:space="preserve">10</w:t>
             </w:r>
           </w:p>
         </w:tc>
@@ -11589,7 +8453,7 @@
                 <w:rFonts w:eastAsia="Times New Roman" w:cs="Times New Roman"/>
                 <w:szCs w:val="26"/>
               </w:rPr>
-              <w:t>Trợ lý AI hai chế độ; kiểm thử tự động và tích hợp liên tục; sửa lỗi. Phân công: Thế Sang tích hợp trợ lý AI và dựng CI; Thanh Sang viết kiểm thử cho tầng nghiệp vụ; Thanh Vũ kiểm thử giao diện và sửa lỗi hiển thị.</w:t>
+              <w:t xml:space="preserve">Trợ lý AI hai chế độ; kiểm thử tự động và tích hợp liên tục; sửa lỗi. Phân công: Thế Sang tích hợp trợ lý AI và dựng CI; Thanh Sang viết kiểm thử cho tầng nghiệp vụ; Thanh Vũ kiểm thử giao diện và sửa lỗi hiển thị.</w:t>
             </w:r>
           </w:p>
         </w:tc>
@@ -11619,7 +8483,7 @@
                 <w:rFonts w:eastAsia="Times New Roman" w:cs="Times New Roman"/>
                 <w:szCs w:val="26"/>
               </w:rPr>
-              <w:t>Trợ lý AI; bộ kiểm thử chạy xanh trên CI; bảng kiểm thử chức năng.</w:t>
+              <w:t xml:space="preserve">Trợ lý AI; bộ kiểm thử chạy xanh trên CI; bảng kiểm thử chức năng.</w:t>
             </w:r>
           </w:p>
         </w:tc>
@@ -11644,6 +8508,13 @@
                 <w:szCs w:val="26"/>
               </w:rPr>
             </w:pPr>
+            <w:r>
+              <w:rPr>
+                <w:rFonts w:eastAsia="Times New Roman" w:cs="Times New Roman"/>
+                <w:szCs w:val="26"/>
+              </w:rPr>
+              <w:t xml:space="preserve"/>
+            </w:r>
           </w:p>
         </w:tc>
       </w:tr>
@@ -11677,7 +8548,7 @@
                 <w:rFonts w:eastAsia="Times New Roman" w:cs="Times New Roman"/>
                 <w:szCs w:val="26"/>
               </w:rPr>
-              <w:t>11</w:t>
+              <w:t xml:space="preserve">11</w:t>
             </w:r>
           </w:p>
         </w:tc>
@@ -11707,7 +8578,7 @@
                 <w:rFonts w:eastAsia="Times New Roman" w:cs="Times New Roman"/>
                 <w:szCs w:val="26"/>
               </w:rPr>
-              <w:t>Triển khai lên môi trường thật; hoàn thiện báo cáo, slide và video demo. Phân công: Thế Sang triển khai và tổng hợp báo cáo; Thanh Sang viết tài liệu API và hướng dẫn cài đặt; Thanh Vũ làm slide và quay video demo.</w:t>
+              <w:t xml:space="preserve">Triển khai lên môi trường thật; hoàn thiện báo cáo, slide và video demo. Phân công: Thế Sang triển khai và tổng hợp báo cáo; Thanh Sang viết tài liệu API và hướng dẫn cài đặt; Thanh Vũ làm slide và quay video demo.</w:t>
             </w:r>
           </w:p>
         </w:tc>
@@ -11737,7 +8608,7 @@
                 <w:rFonts w:eastAsia="Times New Roman" w:cs="Times New Roman"/>
                 <w:szCs w:val="26"/>
               </w:rPr>
-              <w:t>Bản triển khai công khai; mã nguồn; báo cáo; slide; video demo.</w:t>
+              <w:t xml:space="preserve">Bản triển khai công khai; mã nguồn; báo cáo; slide; video demo.</w:t>
             </w:r>
           </w:p>
         </w:tc>
@@ -11762,6 +8633,13 @@
                 <w:szCs w:val="26"/>
               </w:rPr>
             </w:pPr>
+            <w:r>
+              <w:rPr>
+                <w:rFonts w:eastAsia="Times New Roman" w:cs="Times New Roman"/>
+                <w:szCs w:val="26"/>
+              </w:rPr>
+              <w:t xml:space="preserve"/>
+            </w:r>
           </w:p>
         </w:tc>
       </w:tr>
@@ -11786,64 +8664,14 @@
           <w:szCs w:val="26"/>
         </w:rPr>
       </w:pPr>
-      <w:bookmarkStart w:id="23" w:name="_Toc240204963"/>
       <w:r>
         <w:rPr>
           <w:rFonts w:ascii="Times New Roman" w:hAnsi="Times New Roman" w:cs="Times New Roman"/>
           <w:sz w:val="26"/>
           <w:szCs w:val="26"/>
         </w:rPr>
-        <w:t>10 S</w:t>
+        <w:t>10 SẢN PHẨM PHẢI HOÀN THÀNH</w:t>
       </w:r>
-      <w:r>
-        <w:rPr>
-          <w:rFonts w:ascii="Times New Roman" w:hAnsi="Times New Roman" w:cs="Times New Roman"/>
-          <w:sz w:val="26"/>
-          <w:szCs w:val="26"/>
-        </w:rPr>
-        <w:t>Ả</w:t>
-      </w:r>
-      <w:r>
-        <w:rPr>
-          <w:rFonts w:ascii="Times New Roman" w:hAnsi="Times New Roman" w:cs="Times New Roman"/>
-          <w:sz w:val="26"/>
-          <w:szCs w:val="26"/>
-        </w:rPr>
-        <w:t>N PH</w:t>
-      </w:r>
-      <w:r>
-        <w:rPr>
-          <w:rFonts w:ascii="Times New Roman" w:hAnsi="Times New Roman" w:cs="Times New Roman"/>
-          <w:sz w:val="26"/>
-          <w:szCs w:val="26"/>
-        </w:rPr>
-        <w:t>Ẩ</w:t>
-      </w:r>
-      <w:r>
-        <w:rPr>
-          <w:rFonts w:ascii="Times New Roman" w:hAnsi="Times New Roman" w:cs="Times New Roman"/>
-          <w:sz w:val="26"/>
-          <w:szCs w:val="26"/>
-        </w:rPr>
-        <w:t>M PH</w:t>
-      </w:r>
-      <w:r>
-        <w:rPr>
-          <w:rFonts w:ascii="Times New Roman" w:hAnsi="Times New Roman" w:cs="Times New Roman"/>
-          <w:sz w:val="26"/>
-          <w:szCs w:val="26"/>
-        </w:rPr>
-        <w:t>Ả</w:t>
-      </w:r>
-      <w:r>
-        <w:rPr>
-          <w:rFonts w:ascii="Times New Roman" w:hAnsi="Times New Roman" w:cs="Times New Roman"/>
-          <w:sz w:val="26"/>
-          <w:szCs w:val="26"/>
-        </w:rPr>
-        <w:t>I HOÀN THÀNH</w:t>
-      </w:r>
-      <w:bookmarkEnd w:id="23"/>
     </w:p>
     <w:p>
       <w:pPr>
@@ -12025,32 +8853,14 @@
           <w:szCs w:val="26"/>
         </w:rPr>
       </w:pPr>
-      <w:bookmarkStart w:id="24" w:name="_Toc240204964"/>
       <w:r>
         <w:rPr>
           <w:rFonts w:ascii="Times New Roman" w:hAnsi="Times New Roman" w:cs="Times New Roman"/>
           <w:sz w:val="26"/>
           <w:szCs w:val="26"/>
         </w:rPr>
-        <w:t>11 C</w:t>
+        <w:t>11 CẤU TRÚC BÁO CÁO</w:t>
       </w:r>
-      <w:r>
-        <w:rPr>
-          <w:rFonts w:ascii="Times New Roman" w:hAnsi="Times New Roman" w:cs="Times New Roman"/>
-          <w:sz w:val="26"/>
-          <w:szCs w:val="26"/>
-        </w:rPr>
-        <w:t>Ấ</w:t>
-      </w:r>
-      <w:r>
-        <w:rPr>
-          <w:rFonts w:ascii="Times New Roman" w:hAnsi="Times New Roman" w:cs="Times New Roman"/>
-          <w:sz w:val="26"/>
-          <w:szCs w:val="26"/>
-        </w:rPr>
-        <w:t>U TRÚC BÁO CÁO</w:t>
-      </w:r>
-      <w:bookmarkEnd w:id="24"/>
     </w:p>
     <w:tbl>
       <w:tblPr>
@@ -12227,7 +9037,6 @@
                 <w:rFonts w:eastAsia="Times New Roman" w:cs="Times New Roman"/>
                 <w:szCs w:val="26"/>
               </w:rPr>
-              <w:lastRenderedPageBreak/>
               <w:t>Chương 1 Tổng quan đề tài</w:t>
             </w:r>
           </w:p>
@@ -12618,6 +9427,7 @@
                 <w:rFonts w:eastAsia="Times New Roman" w:cs="Times New Roman"/>
                 <w:szCs w:val="26"/>
               </w:rPr>
+              <w:lastRenderedPageBreak/>
               <w:t>Phần cuối</w:t>
             </w:r>
           </w:p>
@@ -12674,80 +9484,14 @@
           <w:szCs w:val="26"/>
         </w:rPr>
       </w:pPr>
-      <w:bookmarkStart w:id="25" w:name="_Toc240204965"/>
       <w:r>
         <w:rPr>
           <w:rFonts w:ascii="Times New Roman" w:hAnsi="Times New Roman" w:cs="Times New Roman"/>
           <w:sz w:val="26"/>
           <w:szCs w:val="26"/>
         </w:rPr>
-        <w:t>12 YÊU C</w:t>
+        <w:t>12 YÊU CẦU ĐỐI VỚI CHỨC NĂNG AI</w:t>
       </w:r>
-      <w:r>
-        <w:rPr>
-          <w:rFonts w:ascii="Times New Roman" w:hAnsi="Times New Roman" w:cs="Times New Roman"/>
-          <w:sz w:val="26"/>
-          <w:szCs w:val="26"/>
-        </w:rPr>
-        <w:t>Ầ</w:t>
-      </w:r>
-      <w:r>
-        <w:rPr>
-          <w:rFonts w:ascii="Times New Roman" w:hAnsi="Times New Roman" w:cs="Times New Roman"/>
-          <w:sz w:val="26"/>
-          <w:szCs w:val="26"/>
-        </w:rPr>
-        <w:t>U Đ</w:t>
-      </w:r>
-      <w:r>
-        <w:rPr>
-          <w:rFonts w:ascii="Times New Roman" w:hAnsi="Times New Roman" w:cs="Times New Roman"/>
-          <w:sz w:val="26"/>
-          <w:szCs w:val="26"/>
-        </w:rPr>
-        <w:t>Ố</w:t>
-      </w:r>
-      <w:r>
-        <w:rPr>
-          <w:rFonts w:ascii="Times New Roman" w:hAnsi="Times New Roman" w:cs="Times New Roman"/>
-          <w:sz w:val="26"/>
-          <w:szCs w:val="26"/>
-        </w:rPr>
-        <w:t>I V</w:t>
-      </w:r>
-      <w:r>
-        <w:rPr>
-          <w:rFonts w:ascii="Times New Roman" w:hAnsi="Times New Roman" w:cs="Times New Roman"/>
-          <w:sz w:val="26"/>
-          <w:szCs w:val="26"/>
-        </w:rPr>
-        <w:t>Ớ</w:t>
-      </w:r>
-      <w:r>
-        <w:rPr>
-          <w:rFonts w:ascii="Times New Roman" w:hAnsi="Times New Roman" w:cs="Times New Roman"/>
-          <w:sz w:val="26"/>
-          <w:szCs w:val="26"/>
-        </w:rPr>
-        <w:t>I CH</w:t>
-      </w:r>
-      <w:r>
-        <w:rPr>
-          <w:rFonts w:ascii="Times New Roman" w:hAnsi="Times New Roman" w:cs="Times New Roman"/>
-          <w:sz w:val="26"/>
-          <w:szCs w:val="26"/>
-        </w:rPr>
-        <w:t>Ứ</w:t>
-      </w:r>
-      <w:r>
-        <w:rPr>
-          <w:rFonts w:ascii="Times New Roman" w:hAnsi="Times New Roman" w:cs="Times New Roman"/>
-          <w:sz w:val="26"/>
-          <w:szCs w:val="26"/>
-        </w:rPr>
-        <w:t>C NĂNG AI</w:t>
-      </w:r>
-      <w:bookmarkEnd w:id="25"/>
     </w:p>
     <w:p>
       <w:pPr>
@@ -12893,55 +9637,8 @@
           <w:color w:val="000000"/>
           <w:szCs w:val="26"/>
         </w:rPr>
-        <w:t>Mô tả ngắn: Vấn đề cần giải quyết – học viên tự học một mình, gặp chỗ không hiểu thì phải chờ giảng viên trả lời, thường mất vài giờ tới vài ngày và phần lớn bỏ luôn câu hỏi; còn khách mới vào trang thì không biết đăng ký, thanh toán hay lấy chứng nhận thế nào. Hệ thống giải quyết bằng một trợ lý có hai chế độ. Chế độ thứ nhất là hộp chat nổi ở góc phải mọi trang, trả lời về cách dùng nền tảng, khách chưa đăng nhập cũng hỏi được. Chế độ thứ hai nằm trong trang học bài, đọc được nội dung bài đang mở nên giải</w:t>
-      </w:r>
-      <w:r>
-        <w:rPr>
-          <w:rFonts w:eastAsia="Times New Roman" w:cs="Times New Roman"/>
-          <w:color w:val="000000"/>
-          <w:szCs w:val="26"/>
-        </w:rPr>
-        <w:t xml:space="preserve"> thích được đúng phần học viên đang vướng. Dữ liệu đầu vào: câu hỏi của học viên, tên khóa học, tên và nội dung bài đang mở, kèm ba cặp hỏi – đáp gần nhất để hiểu được câu hỏi nối tiếp; đầu ra: câu trả lời tiếng Việt hiển thị ngay trên trang. Mô hình sử dụng: mô hình ngôn ngữ lớn gọi qua REST. Hệ thống không gắn chết vào một nhà cung cấp – chọn bằng biến môi trường giữa Google Gemini (gói miễn phí), Groq (gói miễn phí), OpenAI và Claude; đổi nhà cung cấp chỉ sửa biến môi trường, không sửa mã nguồn. Cách tíc</w:t>
-      </w:r>
-      <w:r>
-        <w:rPr>
-          <w:rFonts w:eastAsia="Times New Roman" w:cs="Times New Roman"/>
-          <w:color w:val="000000"/>
-          <w:szCs w:val="26"/>
-        </w:rPr>
-        <w:t xml:space="preserve">h hợp: ba đường dẫn API riêng (hỏi, đọc lại đoạn trò chuyện, xóa đoạn trò chuyện); lịch sử của chế độ trong </w:t>
-      </w:r>
-      <w:r>
-        <w:rPr>
-          <w:rFonts w:eastAsia="Times New Roman" w:cs="Times New Roman"/>
-          <w:color w:val="000000"/>
-          <w:szCs w:val="26"/>
-        </w:rPr>
+        <w:t xml:space="preserve">Mô tả ngắn: Vấn đề cần giải quyết – học viên tự học một mình, gặp chỗ không hiểu thì phải chờ giảng viên trả lời, thường mất vài giờ tới vài ngày và phần lớn bỏ luôn câu hỏi; còn khách mới vào trang thì không biết đăng ký, thanh toán hay lấy chứng nhận thế nào. Hệ thống giải quyết bằng một trợ lý có hai chế độ. Chế độ thứ nhất là hộp chat nổi ở góc phải mọi trang, trả lời về cách dùng nền tảng, khách chưa đăng nhập cũng hỏi được. Chế độ thứ hai nằm trong trang học bài, đọc được nội dung bài đang mở nên giải thích được đúng phần học viên đang vướng. Dữ liệu đầu vào: câu hỏi của học viên, tên khóa học, tên và nội dung bài đang mở, kèm ba cặp hỏi – đáp gần nhất để hiểu được câu hỏi nối tiếp; đầu ra: câu trả lời tiếng Việt hiển thị ngay trên trang. Mô hình sử dụng: mô hình ngôn ngữ lớn gọi qua REST. Hệ thống không gắn chết vào một nhà cung cấp – chọn bằng biến môi trường giữa Google Gemini (gói miễn phí), Groq (gói miễn phí), OpenAI và Claude; đổi nhà cung cấp chỉ sửa biến môi trường, không sửa mã nguồn. Cách tích hợp: ba đường dẫn API riêng (hỏi, đọc lại đoạn trò chuyện, xóa đoạn trò chuyện); lịch sử của chế độ trong bài được lưu trong cơ sở dữ liệu theo từng học viên và từng bài học. Lời nhắc hệ thống được dựng ở một nơi duy nhất trong mã nguồn, ràng buộc trợ lý chỉ trả lời trong phạm vi cho phép, không đọc đáp án bài kiểm tra, không bịa tên khóa học hay học phí, và bỏ qua mọi yêu cầu đổi vai trò đến từ ô nhập của người dùng. Về an toàn: lời nhắc chỉ là hướng dẫn, không phải hàng rào; hàng rào thật là yêu cầu bắt buộc đi qua cổng kiểm tra quyền xem nội dung trước khi nội dung bài học được đưa vào lời nhắc, nên trợ lý không trở thành đường vòng để đọc khóa có phí. Kèm ba mức giới hạn tần suất: khách 12 câu mỗi giờ và 40 câu mỗi ngày tính theo địa chỉ IP, tài khoản đã đăng nhập 20 câu mỗi giờ và 100 câu mỗi ngày, cùng một trần 500 câu mỗi ngày cho toàn hệ thống để một đợt truy cập bất thường không đốt hết hạn mức của nhà cung cấp. Tiêu chí đánh giá: tỉ lệ câu hỏi được trả lời đúng trên một bộ 30 câu hỏi mẫu do nhóm tự chấm, thời gian phản hồi trung bình, và tỉ lệ chặn được ba nhóm câu hỏi xấu (hỏi lạc đề, yêu cầu đổi vai trò, dụ trợ lý bịa học phí). Trường hợp kết quả có thể không chính xác: bài học chưa có phần nội dung văn bản (chỉ có video) thì trợ lý không đọc được bài – khi đó nó được yêu cầu nói rõ là chưa đọc </w:t>
         <w:lastRenderedPageBreak/>
-        <w:t>bài được lưu trong cơ sở dữ liệu theo từng học viên và từng bài học. Lời nhắc hệ thống được dựng ở một nơi duy nhất trong mã nguồn, ràng buộc trợ lý chỉ trả lời trong phạm vi cho phép, không đọc đáp án bài kiểm tra, không bịa tên khóa học hay học phí, và bỏ qua mọi yêu cầu đổi vai trò đến từ ô nhập của người dùng. Về an toàn: lời nhắc chỉ là hướng dẫn, không phải hàng rào; hàng rào thật là yêu cầu bắt</w:t>
-      </w:r>
-      <w:r>
-        <w:rPr>
-          <w:rFonts w:eastAsia="Times New Roman" w:cs="Times New Roman"/>
-          <w:color w:val="000000"/>
-          <w:szCs w:val="26"/>
-        </w:rPr>
-        <w:t xml:space="preserve"> buộc đi qua cổng kiểm tra quyền xem nội dung trước khi nội dung bài học được đưa vào lời nhắc, nên trợ lý không trở thành đường vòng để đọc khóa có phí. Kèm ba mức giới hạn tần suất: khách 12 câu mỗi giờ và 40 câu mỗi ngày tính theo địa chỉ IP, tài khoản đã đăng nhập 20 câu mỗi giờ và 100 câu mỗi ngày, cùng một trần 500 câu mỗi ngày cho toàn hệ thống để một đợt truy cập bất thường không đốt hết hạn mức của nhà cung cấp. Tiêu chí đánh giá: tỉ lệ câu hỏi được trả lời đúng trên một bộ 30 câu hỏi mẫu do nhóm t</w:t>
-      </w:r>
-      <w:r>
-        <w:rPr>
-          <w:rFonts w:eastAsia="Times New Roman" w:cs="Times New Roman"/>
-          <w:color w:val="000000"/>
-          <w:szCs w:val="26"/>
-        </w:rPr>
-        <w:t xml:space="preserve">ự chấm, thời gian phản hồi trung bình, và tỉ lệ chặn được ba nhóm câu hỏi xấu (hỏi lạc đề, yêu cầu đổi vai trò, dụ trợ lý bịa học phí). Trường hợp kết quả có thể không chính xác: bài học chưa có phần nội dung văn bản (chỉ có video) thì trợ lý không đọc được bài – khi đó nó được yêu cầu nói rõ là chưa đọc </w:t>
-      </w:r>
-      <w:r>
-        <w:rPr>
-          <w:rFonts w:eastAsia="Times New Roman" w:cs="Times New Roman"/>
-          <w:color w:val="000000"/>
-          <w:szCs w:val="26"/>
-        </w:rPr>
         <w:t>được bài và chỉ trả lời ở mức khái niệm chung thay vì bịa nội dung. Rủi ro vận hành: tên mô hình của nhà cung cấp có thể bị ngừng hỗ trợ theo thời gian, nên hệ thống đặt tên mô hình trong biến môi trường và có cơ chế tự gọi lại một lần khi dịch vụ báo quá tải.</w:t>
       </w:r>
     </w:p>
@@ -12955,48 +9652,14 @@
           <w:szCs w:val="26"/>
         </w:rPr>
       </w:pPr>
-      <w:bookmarkStart w:id="26" w:name="_Toc240204966"/>
       <w:r>
         <w:rPr>
           <w:rFonts w:ascii="Times New Roman" w:hAnsi="Times New Roman" w:cs="Times New Roman"/>
           <w:sz w:val="26"/>
           <w:szCs w:val="26"/>
         </w:rPr>
-        <w:t>13 TIÊU CHÍ ĐÁNH GIÁ Đ</w:t>
+        <w:t>13 TIÊU CHÍ ĐÁNH GIÁ ĐỀ XUẤT</w:t>
       </w:r>
-      <w:r>
-        <w:rPr>
-          <w:rFonts w:ascii="Times New Roman" w:hAnsi="Times New Roman" w:cs="Times New Roman"/>
-          <w:sz w:val="26"/>
-          <w:szCs w:val="26"/>
-        </w:rPr>
-        <w:t>Ề</w:t>
-      </w:r>
-      <w:r>
-        <w:rPr>
-          <w:rFonts w:ascii="Times New Roman" w:hAnsi="Times New Roman" w:cs="Times New Roman"/>
-          <w:sz w:val="26"/>
-          <w:szCs w:val="26"/>
-        </w:rPr>
-        <w:t xml:space="preserve"> XU</w:t>
-      </w:r>
-      <w:r>
-        <w:rPr>
-          <w:rFonts w:ascii="Times New Roman" w:hAnsi="Times New Roman" w:cs="Times New Roman"/>
-          <w:sz w:val="26"/>
-          <w:szCs w:val="26"/>
-        </w:rPr>
-        <w:t>Ấ</w:t>
-      </w:r>
-      <w:r>
-        <w:rPr>
-          <w:rFonts w:ascii="Times New Roman" w:hAnsi="Times New Roman" w:cs="Times New Roman"/>
-          <w:sz w:val="26"/>
-          <w:szCs w:val="26"/>
-        </w:rPr>
-        <w:t>T</w:t>
-      </w:r>
-      <w:bookmarkEnd w:id="26"/>
     </w:p>
     <w:tbl>
       <w:tblPr>
@@ -13884,96 +10547,14 @@
           <w:szCs w:val="26"/>
         </w:rPr>
       </w:pPr>
-      <w:bookmarkStart w:id="27" w:name="_Toc240204967"/>
       <w:r>
         <w:rPr>
           <w:rFonts w:ascii="Times New Roman" w:hAnsi="Times New Roman" w:cs="Times New Roman"/>
           <w:sz w:val="26"/>
           <w:szCs w:val="26"/>
         </w:rPr>
-        <w:t>14 YÊU C</w:t>
+        <w:t>14 YÊU CẦU HỌC THUẬT VÀ KỸ THUẬT</w:t>
       </w:r>
-      <w:r>
-        <w:rPr>
-          <w:rFonts w:ascii="Times New Roman" w:hAnsi="Times New Roman" w:cs="Times New Roman"/>
-          <w:sz w:val="26"/>
-          <w:szCs w:val="26"/>
-        </w:rPr>
-        <w:t>Ầ</w:t>
-      </w:r>
-      <w:r>
-        <w:rPr>
-          <w:rFonts w:ascii="Times New Roman" w:hAnsi="Times New Roman" w:cs="Times New Roman"/>
-          <w:sz w:val="26"/>
-          <w:szCs w:val="26"/>
-        </w:rPr>
-        <w:t>U H</w:t>
-      </w:r>
-      <w:r>
-        <w:rPr>
-          <w:rFonts w:ascii="Times New Roman" w:hAnsi="Times New Roman" w:cs="Times New Roman"/>
-          <w:sz w:val="26"/>
-          <w:szCs w:val="26"/>
-        </w:rPr>
-        <w:t>Ọ</w:t>
-      </w:r>
-      <w:r>
-        <w:rPr>
-          <w:rFonts w:ascii="Times New Roman" w:hAnsi="Times New Roman" w:cs="Times New Roman"/>
-          <w:sz w:val="26"/>
-          <w:szCs w:val="26"/>
-        </w:rPr>
-        <w:t>C THU</w:t>
-      </w:r>
-      <w:r>
-        <w:rPr>
-          <w:rFonts w:ascii="Times New Roman" w:hAnsi="Times New Roman" w:cs="Times New Roman"/>
-          <w:sz w:val="26"/>
-          <w:szCs w:val="26"/>
-        </w:rPr>
-        <w:t>Ậ</w:t>
-      </w:r>
-      <w:r>
-        <w:rPr>
-          <w:rFonts w:ascii="Times New Roman" w:hAnsi="Times New Roman" w:cs="Times New Roman"/>
-          <w:sz w:val="26"/>
-          <w:szCs w:val="26"/>
-        </w:rPr>
-        <w:t>T VÀ K</w:t>
-      </w:r>
-      <w:r>
-        <w:rPr>
-          <w:rFonts w:ascii="Times New Roman" w:hAnsi="Times New Roman" w:cs="Times New Roman"/>
-          <w:sz w:val="26"/>
-          <w:szCs w:val="26"/>
-        </w:rPr>
-        <w:t>Ỹ</w:t>
-      </w:r>
-      <w:r>
-        <w:rPr>
-          <w:rFonts w:ascii="Times New Roman" w:hAnsi="Times New Roman" w:cs="Times New Roman"/>
-          <w:sz w:val="26"/>
-          <w:szCs w:val="26"/>
-        </w:rPr>
-        <w:t xml:space="preserve"> THU</w:t>
-      </w:r>
-      <w:r>
-        <w:rPr>
-          <w:rFonts w:ascii="Times New Roman" w:hAnsi="Times New Roman" w:cs="Times New Roman"/>
-          <w:sz w:val="26"/>
-          <w:szCs w:val="26"/>
-        </w:rPr>
-        <w:t>Ậ</w:t>
-      </w:r>
-      <w:r>
-        <w:rPr>
-          <w:rFonts w:ascii="Times New Roman" w:hAnsi="Times New Roman" w:cs="Times New Roman"/>
-          <w:sz w:val="26"/>
-          <w:szCs w:val="26"/>
-        </w:rPr>
-        <w:t>T</w:t>
-      </w:r>
-      <w:bookmarkEnd w:id="27"/>
     </w:p>
     <w:p>
       <w:pPr>
@@ -14118,49 +10699,14 @@
           <w:szCs w:val="26"/>
         </w:rPr>
       </w:pPr>
-      <w:bookmarkStart w:id="28" w:name="_Toc240204968"/>
       <w:r>
         <w:rPr>
           <w:rFonts w:ascii="Times New Roman" w:hAnsi="Times New Roman" w:cs="Times New Roman"/>
           <w:sz w:val="26"/>
           <w:szCs w:val="26"/>
         </w:rPr>
-        <w:lastRenderedPageBreak/>
-        <w:t>15 XÁC NH</w:t>
+        <w:t>15 XÁC NHẬN ĐỀ CƯƠNG</w:t>
       </w:r>
-      <w:r>
-        <w:rPr>
-          <w:rFonts w:ascii="Times New Roman" w:hAnsi="Times New Roman" w:cs="Times New Roman"/>
-          <w:sz w:val="26"/>
-          <w:szCs w:val="26"/>
-        </w:rPr>
-        <w:t>Ậ</w:t>
-      </w:r>
-      <w:r>
-        <w:rPr>
-          <w:rFonts w:ascii="Times New Roman" w:hAnsi="Times New Roman" w:cs="Times New Roman"/>
-          <w:sz w:val="26"/>
-          <w:szCs w:val="26"/>
-        </w:rPr>
-        <w:t>N Đ</w:t>
-      </w:r>
-      <w:r>
-        <w:rPr>
-          <w:rFonts w:ascii="Times New Roman" w:hAnsi="Times New Roman" w:cs="Times New Roman"/>
-          <w:sz w:val="26"/>
-          <w:szCs w:val="26"/>
-        </w:rPr>
-        <w:t>Ề</w:t>
-      </w:r>
-      <w:r>
-        <w:rPr>
-          <w:rFonts w:ascii="Times New Roman" w:hAnsi="Times New Roman" w:cs="Times New Roman"/>
-          <w:sz w:val="26"/>
-          <w:szCs w:val="26"/>
-        </w:rPr>
-        <w:t xml:space="preserve"> CƯƠNG</w:t>
-      </w:r>
-      <w:bookmarkEnd w:id="28"/>
     </w:p>
     <w:p>
       <w:pPr>
@@ -14271,14 +10817,6 @@
                 <w:szCs w:val="26"/>
               </w:rPr>
               <w:t>SINH VIÊN THỰC HIỆN</w:t>
-            </w:r>
-            <w:r>
-              <w:rPr>
-                <w:rFonts w:eastAsia="Times New Roman" w:cs="Times New Roman"/>
-                <w:b/>
-                <w:color w:val="000000"/>
-                <w:szCs w:val="26"/>
-              </w:rPr>
               <w:br/>
               <w:t>(Ký và ghi rõ họ tên)</w:t>
             </w:r>
@@ -14311,23 +10849,7 @@
                 <w:szCs w:val="26"/>
               </w:rPr>
               <w:t>GIẢNG VIÊN HƯỚNG DẪN</w:t>
-            </w:r>
-            <w:r>
-              <w:rPr>
-                <w:rFonts w:eastAsia="Times New Roman" w:cs="Times New Roman"/>
-                <w:b/>
-                <w:color w:val="000000"/>
-                <w:szCs w:val="26"/>
-              </w:rPr>
               <w:br/>
-            </w:r>
-            <w:r>
-              <w:rPr>
-                <w:rFonts w:eastAsia="Times New Roman" w:cs="Times New Roman"/>
-                <w:b/>
-                <w:color w:val="000000"/>
-                <w:szCs w:val="26"/>
-              </w:rPr>
               <w:t>(Ký và ghi rõ họ tên)</w:t>
             </w:r>
           </w:p>
@@ -14376,6 +10898,58 @@
     </w:p>
   </w:endnote>
 </w:endnotes>
+</file>
+
+<file path=word/footer1.xml><?xml version="1.0" encoding="utf-8"?>
+<w:ftr xmlns:wpc="http://schemas.microsoft.com/office/word/2010/wordprocessingCanvas" xmlns:cx="http://schemas.microsoft.com/office/drawing/2014/chartex" xmlns:cx1="http://schemas.microsoft.com/office/drawing/2015/9/8/chartex" xmlns:cx2="http://schemas.microsoft.com/office/drawing/2015/10/21/chartex" xmlns:cx3="http://schemas.microsoft.com/office/drawing/2016/5/9/chartex" xmlns:cx4="http://schemas.microsoft.com/office/drawing/2016/5/10/chartex" xmlns:cx5="http://schemas.microsoft.com/office/drawing/2016/5/11/chartex" xmlns:cx6="http://schemas.microsoft.com/office/drawing/2016/5/12/chartex" xmlns:cx7="http://schemas.microsoft.com/office/drawing/2016/5/13/chartex" xmlns:cx8="http://schemas.microsoft.com/office/drawing/2016/5/14/chartex" xmlns:mc="http://schemas.openxmlformats.org/markup-compatibility/2006" xmlns:aink="http://schemas.microsoft.com/office/drawing/2016/ink" xmlns:am3d="http://schemas.microsoft.com/office/drawing/2017/model3d" xmlns:o="urn:schemas-microsoft-com:office:office" xmlns:oel="http://schemas.microsoft.com/office/2019/extlst" xmlns:r="http://schemas.openxmlformats.org/officeDocument/2006/relationships" xmlns:m="http://schemas.openxmlformats.org/officeDocument/2006/math" xmlns:v="urn:schemas-microsoft-com:vml" xmlns:wp14="http://schemas.microsoft.com/office/word/2010/wordprocessingDrawing" xmlns:wp="http://schemas.openxmlformats.org/drawingml/2006/wordprocessingDrawing" xmlns:w10="urn:schemas-microsoft-com:office:word" xmlns:w="http://schemas.openxmlformats.org/wordprocessingml/2006/main" xmlns:w14="http://schemas.microsoft.com/office/word/2010/wordml" xmlns:w15="http://schemas.microsoft.com/office/word/2012/wordml" xmlns:w16cex="http://schemas.microsoft.com/office/word/2018/wordml/cex" xmlns:w16cid="http://schemas.microsoft.com/office/word/2016/wordml/cid" xmlns:w16="http://schemas.microsoft.com/office/word/2018/wordml" xmlns:w16du="http://schemas.microsoft.com/office/word/2023/wordml/word16du" xmlns:w16sdtdh="http://schemas.microsoft.com/office/word/2020/wordml/sdtdatahash" xmlns:w16sdtfl="http://schemas.microsoft.com/office/word/2024/wordml/sdtformatlock" xmlns:w16se="http://schemas.microsoft.com/office/word/2015/wordml/symex" xmlns:wpg="http://schemas.microsoft.com/office/word/2010/wordprocessingGroup" xmlns:wpi="http://schemas.microsoft.com/office/word/2010/wordprocessingInk" xmlns:wne="http://schemas.microsoft.com/office/word/2006/wordml" xmlns:wps="http://schemas.microsoft.com/office/word/2010/wordprocessingShape" mc:Ignorable="w14 w15 w16se w16cid w16 w16cex w16sdtdh w16sdtfl w16du wp14">
+  <w:p>
+    <w:pPr>
+      <w:pStyle w:val="Footer"/>
+      <w:jc w:val="center"/>
+    </w:pPr>
+    <w:r>
+      <w:rPr>
+        <w:rFonts w:eastAsia="Times New Roman" w:cs="Times New Roman"/>
+        <w:color w:val="000000"/>
+        <w:sz w:val="20"/>
+      </w:rPr>
+      <w:fldChar w:fldCharType="begin"/>
+    </w:r>
+    <w:r>
+      <w:rPr>
+        <w:rFonts w:eastAsia="Times New Roman" w:cs="Times New Roman"/>
+        <w:color w:val="000000"/>
+        <w:sz w:val="20"/>
+      </w:rPr>
+      <w:instrText xml:space="preserve"> PAGE </w:instrText>
+    </w:r>
+    <w:r>
+      <w:rPr>
+        <w:rFonts w:eastAsia="Times New Roman" w:cs="Times New Roman"/>
+        <w:color w:val="000000"/>
+        <w:sz w:val="20"/>
+      </w:rPr>
+      <w:fldChar w:fldCharType="separate"/>
+    </w:r>
+    <w:r>
+      <w:rPr>
+        <w:rFonts w:eastAsia="Times New Roman" w:cs="Times New Roman"/>
+        <w:noProof/>
+        <w:color w:val="000000"/>
+        <w:sz w:val="20"/>
+      </w:rPr>
+      <w:t>1</w:t>
+    </w:r>
+    <w:r>
+      <w:rPr>
+        <w:rFonts w:eastAsia="Times New Roman" w:cs="Times New Roman"/>
+        <w:color w:val="000000"/>
+        <w:sz w:val="20"/>
+      </w:rPr>
+      <w:fldChar w:fldCharType="end"/>
+    </w:r>
+  </w:p>
+</w:ftr>
 </file>
 
 <file path=word/footnotes.xml><?xml version="1.0" encoding="utf-8"?>
@@ -15215,7 +11789,6 @@
   <w:style w:type="character" w:default="1" w:styleId="DefaultParagraphFont">
     <w:name w:val="Default Paragraph Font"/>
     <w:uiPriority w:val="1"/>
-    <w:semiHidden/>
     <w:unhideWhenUsed/>
   </w:style>
   <w:style w:type="table" w:default="1" w:styleId="TableNormal">
@@ -26019,42 +22592,6 @@
       </w:tblCellMar>
     </w:tblPr>
   </w:style>
-  <w:style w:type="paragraph" w:styleId="TOC1">
-    <w:name w:val="toc 1"/>
-    <w:basedOn w:val="Normal"/>
-    <w:next w:val="Normal"/>
-    <w:autoRedefine/>
-    <w:uiPriority w:val="39"/>
-    <w:unhideWhenUsed/>
-    <w:rsid w:val="000F4ECE"/>
-    <w:pPr>
-      <w:spacing w:after="100"/>
-    </w:pPr>
-  </w:style>
-  <w:style w:type="paragraph" w:styleId="TOC2">
-    <w:name w:val="toc 2"/>
-    <w:basedOn w:val="Normal"/>
-    <w:next w:val="Normal"/>
-    <w:autoRedefine/>
-    <w:uiPriority w:val="39"/>
-    <w:unhideWhenUsed/>
-    <w:rsid w:val="000F4ECE"/>
-    <w:pPr>
-      <w:spacing w:after="100"/>
-      <w:ind w:left="260"/>
-    </w:pPr>
-  </w:style>
-  <w:style w:type="character" w:styleId="Hyperlink">
-    <w:name w:val="Hyperlink"/>
-    <w:basedOn w:val="DefaultParagraphFont"/>
-    <w:uiPriority w:val="99"/>
-    <w:unhideWhenUsed/>
-    <w:rsid w:val="000F4ECE"/>
-    <w:rPr>
-      <w:color w:val="0000FF" w:themeColor="hyperlink"/>
-      <w:u w:val="single"/>
-    </w:rPr>
-  </w:style>
 </w:styles>
 </file>
 

</xml_diff>